<commit_message>
Link-selection v2 (Phase 2): relevance-ranked matcher, pipeline link gate, full re-render
Matcher ranks by bm25 relevance behind a relevance gate, excludes answer/exam
material, verifies links against the ARES reference image, and returns null
(explicit 'no confident match' + search) instead of forcing weak matches.
scripts/check_resource_links.py gates every generate.js render.
All 85 sub-strands re-rendered (docx+JSON); lesson content unchanged.

Co-Authored-By: Claude Opus 5.5 (1M context) <noreply@anthropic.com>
</commit_message>
<xml_diff>
--- a/data/outputs/v2/Biology/SS1.2_Chemicals_of_Life/Biology_Chemicals_of_Life_CBE_LessonSequence.docx
+++ b/data/outputs/v2/Biology/SS1.2_Chemicals_of_Life/Biology_Chemicals_of_Life_CBE_LessonSequence.docx
@@ -3244,7 +3244,7 @@
             <w:pPr>
               <w:spacing w:after="20" w:before="0"/>
             </w:pPr>
-            <w:hyperlink w:history="1" r:id="rIdrp7thtmbhxv_iknfcv9sd">
+            <w:hyperlink w:history="1" r:id="rIdicerqq5gek7xdafvofpig">
               <w:r>
                 <w:rPr>
                   <w:rFonts w:ascii="Arial" w:cs="Arial" w:eastAsia="Arial" w:hAnsi="Arial"/>
@@ -3253,7 +3253,7 @@
                   <w:szCs w:val="16"/>
                   <w:u w:val="single" w:color="2E75B6"/>
                 </w:rPr>
-                <w:t xml:space="preserve">Dehydration synthesis or a condensation reaction</w:t>
+                <w:t xml:space="preserve">Scale of cells</w:t>
               </w:r>
             </w:hyperlink>
           </w:p>
@@ -3277,7 +3277,7 @@
               <w:spacing w:after="10" w:before="0"/>
               <w:ind w:left="120"/>
             </w:pPr>
-            <w:hyperlink w:history="1" r:id="rIdtbhaffdp0ozaup5qurwlk">
+            <w:hyperlink w:history="1" r:id="rIdkgw3srmasy___jbvtwuni">
               <w:r>
                 <w:rPr>
                   <w:rFonts w:ascii="Arial" w:cs="Arial" w:eastAsia="Arial" w:hAnsi="Arial"/>
@@ -3322,7 +3322,7 @@
             <w:pPr>
               <w:spacing w:after="20" w:before="0"/>
             </w:pPr>
-            <w:hyperlink w:history="1" r:id="rIdkbqckukcpshuwe-8uhh3c">
+            <w:hyperlink w:history="1" r:id="rIdaqhlmospyzcfw0aocmfwn">
               <w:r>
                 <w:rPr>
                   <w:rFonts w:ascii="Arial" w:cs="Arial" w:eastAsia="Arial" w:hAnsi="Arial"/>
@@ -3331,7 +3331,7 @@
                   <w:szCs w:val="16"/>
                   <w:u w:val="single" w:color="2E75B6"/>
                 </w:rPr>
-                <w:t xml:space="preserve">Evolution of Eukaryotes to Multicellular Life (Flexbook)</w:t>
+                <w:t xml:space="preserve">Carbohydrate Classification (Flexbook)</w:t>
               </w:r>
             </w:hyperlink>
           </w:p>
@@ -3355,7 +3355,7 @@
               <w:spacing w:after="10" w:before="0"/>
               <w:ind w:left="120"/>
             </w:pPr>
-            <w:hyperlink w:history="1" r:id="rId6rmzr6pvxsppko1a9q-d7">
+            <w:hyperlink w:history="1" r:id="rIdj28ky-osh8bzayovx1u7n">
               <w:r>
                 <w:rPr>
                   <w:rFonts w:ascii="Arial" w:cs="Arial" w:eastAsia="Arial" w:hAnsi="Arial"/>
@@ -3816,7 +3816,7 @@
             <w:pPr>
               <w:spacing w:after="20" w:before="0"/>
             </w:pPr>
-            <w:hyperlink w:history="1" r:id="rId0cn-n5opvg98hm4r7y8q1">
+            <w:hyperlink w:history="1" r:id="rId833f-orgqdszktnwnynlr">
               <w:r>
                 <w:rPr>
                   <w:rFonts w:ascii="Arial" w:cs="Arial" w:eastAsia="Arial" w:hAnsi="Arial"/>
@@ -3825,7 +3825,7 @@
                   <w:szCs w:val="16"/>
                   <w:u w:val="single" w:color="2E75B6"/>
                 </w:rPr>
-                <w:t xml:space="preserve">Dehydration synthesis or a condensation reaction</w:t>
+                <w:t xml:space="preserve">Photosynthesis</w:t>
               </w:r>
             </w:hyperlink>
           </w:p>
@@ -3849,7 +3849,7 @@
               <w:spacing w:after="10" w:before="0"/>
               <w:ind w:left="120"/>
             </w:pPr>
-            <w:hyperlink w:history="1" r:id="rIdlhurdq77qulih3cbevmca">
+            <w:hyperlink w:history="1" r:id="rId9xnio62hk1pmtcmkjzjgr">
               <w:r>
                 <w:rPr>
                   <w:rFonts w:ascii="Arial" w:cs="Arial" w:eastAsia="Arial" w:hAnsi="Arial"/>
@@ -3887,14 +3887,14 @@
                 <w:sz w:val="16"/>
                 <w:szCs w:val="16"/>
               </w:rPr>
-              <w:t xml:space="preserve">📖 HTML:</w:t>
+              <w:t xml:space="preserve">📖 EXERCISE:</w:t>
             </w:r>
           </w:p>
           <w:p>
             <w:pPr>
               <w:spacing w:after="20" w:before="0"/>
             </w:pPr>
-            <w:hyperlink w:history="1" r:id="rIdyfnewhshruqgm1pxjbkub">
+            <w:hyperlink w:history="1" r:id="rIdizrx8uuknhpgy1lsxc2id">
               <w:r>
                 <w:rPr>
                   <w:rFonts w:ascii="Arial" w:cs="Arial" w:eastAsia="Arial" w:hAnsi="Arial"/>
@@ -3903,7 +3903,7 @@
                   <w:szCs w:val="16"/>
                   <w:u w:val="single" w:color="2E75B6"/>
                 </w:rPr>
-                <w:t xml:space="preserve">Evolution of Eukaryotes to Multicellular Life (Flexbook)</w:t>
+                <w:t xml:space="preserve">Carbohydrate Classification Practice</w:t>
               </w:r>
             </w:hyperlink>
           </w:p>
@@ -3927,7 +3927,7 @@
               <w:spacing w:after="10" w:before="0"/>
               <w:ind w:left="120"/>
             </w:pPr>
-            <w:hyperlink w:history="1" r:id="rId8el6wr922qnphivdlg9ys">
+            <w:hyperlink w:history="1" r:id="rIdcmb442y955p7wid1nu-4v">
               <w:r>
                 <w:rPr>
                   <w:rFonts w:ascii="Arial" w:cs="Arial" w:eastAsia="Arial" w:hAnsi="Arial"/>
@@ -4274,7 +4274,7 @@
             <w:pPr>
               <w:spacing w:after="20" w:before="0"/>
             </w:pPr>
-            <w:hyperlink w:history="1" r:id="rIdfcob2mlwbkqc0eeefyewe">
+            <w:hyperlink w:history="1" r:id="rIdsl0scrgdl3fxvxjisj-kj">
               <w:r>
                 <w:rPr>
                   <w:rFonts w:ascii="Arial" w:cs="Arial" w:eastAsia="Arial" w:hAnsi="Arial"/>
@@ -4283,7 +4283,7 @@
                   <w:szCs w:val="16"/>
                   <w:u w:val="single" w:color="2E75B6"/>
                 </w:rPr>
-                <w:t xml:space="preserve">Dehydration synthesis or a condensation reaction</w:t>
+                <w:t xml:space="preserve">Organelles in eukaryotic cells</w:t>
               </w:r>
             </w:hyperlink>
           </w:p>
@@ -4307,7 +4307,7 @@
               <w:spacing w:after="10" w:before="0"/>
               <w:ind w:left="120"/>
             </w:pPr>
-            <w:hyperlink w:history="1" r:id="rId1ofdc5qvxmg6nxyzcyz9w">
+            <w:hyperlink w:history="1" r:id="rIdlrw_kc_7unvamd9kly_d1">
               <w:r>
                 <w:rPr>
                   <w:rFonts w:ascii="Arial" w:cs="Arial" w:eastAsia="Arial" w:hAnsi="Arial"/>
@@ -4352,7 +4352,7 @@
             <w:pPr>
               <w:spacing w:after="20" w:before="0"/>
             </w:pPr>
-            <w:hyperlink w:history="1" r:id="rIduthrrmnigmv5i7k2ue2yn">
+            <w:hyperlink w:history="1" r:id="rIdll-z99_9ai5iiy-5m8la5">
               <w:r>
                 <w:rPr>
                   <w:rFonts w:ascii="Arial" w:cs="Arial" w:eastAsia="Arial" w:hAnsi="Arial"/>
@@ -4361,7 +4361,7 @@
                   <w:szCs w:val="16"/>
                   <w:u w:val="single" w:color="2E75B6"/>
                 </w:rPr>
-                <w:t xml:space="preserve">Evolution of Eukaryotes to Multicellular Life (Flexbook)</w:t>
+                <w:t xml:space="preserve">Carbohydrates (Flexbook)</w:t>
               </w:r>
             </w:hyperlink>
           </w:p>
@@ -4385,7 +4385,7 @@
               <w:spacing w:after="10" w:before="0"/>
               <w:ind w:left="120"/>
             </w:pPr>
-            <w:hyperlink w:history="1" r:id="rIdmeybqwxl7mosjjokzulsy">
+            <w:hyperlink w:history="1" r:id="rIdlbijg7lxxxgtvgcppzhuy">
               <w:r>
                 <w:rPr>
                   <w:rFonts w:ascii="Arial" w:cs="Arial" w:eastAsia="Arial" w:hAnsi="Arial"/>
@@ -4770,7 +4770,7 @@
             <w:pPr>
               <w:spacing w:after="20" w:before="0"/>
             </w:pPr>
-            <w:hyperlink w:history="1" r:id="rIdysbblwol7g4nlxytdiujy">
+            <w:hyperlink w:history="1" r:id="rIddjm1wt72oqejvsmahm3tm">
               <w:r>
                 <w:rPr>
                   <w:rFonts w:ascii="Arial" w:cs="Arial" w:eastAsia="Arial" w:hAnsi="Arial"/>
@@ -4779,7 +4779,7 @@
                   <w:szCs w:val="16"/>
                   <w:u w:val="single" w:color="2E75B6"/>
                 </w:rPr>
-                <w:t xml:space="preserve">Dehydration synthesis or a condensation reaction</w:t>
+                <w:t xml:space="preserve">Introduction to carbohydrates</w:t>
               </w:r>
             </w:hyperlink>
           </w:p>
@@ -4803,7 +4803,7 @@
               <w:spacing w:after="10" w:before="0"/>
               <w:ind w:left="120"/>
             </w:pPr>
-            <w:hyperlink w:history="1" r:id="rId7bpsyug9hxbsc2l262egg">
+            <w:hyperlink w:history="1" r:id="rIdp89lg0et9pylsnzyc9jdc">
               <w:r>
                 <w:rPr>
                   <w:rFonts w:ascii="Arial" w:cs="Arial" w:eastAsia="Arial" w:hAnsi="Arial"/>
@@ -4841,14 +4841,14 @@
                 <w:sz w:val="16"/>
                 <w:szCs w:val="16"/>
               </w:rPr>
-              <w:t xml:space="preserve">📖 HTML:</w:t>
+              <w:t xml:space="preserve">📖 EXERCISE:</w:t>
             </w:r>
           </w:p>
           <w:p>
             <w:pPr>
               <w:spacing w:after="20" w:before="0"/>
             </w:pPr>
-            <w:hyperlink w:history="1" r:id="rIdyvvqy4dwehqz9swnlpivc">
+            <w:hyperlink w:history="1" r:id="rIdnm5yjizsdcgsxzlgrergr">
               <w:r>
                 <w:rPr>
                   <w:rFonts w:ascii="Arial" w:cs="Arial" w:eastAsia="Arial" w:hAnsi="Arial"/>
@@ -4857,7 +4857,7 @@
                   <w:szCs w:val="16"/>
                   <w:u w:val="single" w:color="2E75B6"/>
                 </w:rPr>
-                <w:t xml:space="preserve">Evolution of Eukaryotes to Multicellular Life (Flexbook)</w:t>
+                <w:t xml:space="preserve">Carbohydrates Practice</w:t>
               </w:r>
             </w:hyperlink>
           </w:p>
@@ -4881,7 +4881,7 @@
               <w:spacing w:after="10" w:before="0"/>
               <w:ind w:left="120"/>
             </w:pPr>
-            <w:hyperlink w:history="1" r:id="rIdxlgpedb-b4iwwko4nvrlt">
+            <w:hyperlink w:history="1" r:id="rIdviogfcssohqpzqmukjlka">
               <w:r>
                 <w:rPr>
                   <w:rFonts w:ascii="Arial" w:cs="Arial" w:eastAsia="Arial" w:hAnsi="Arial"/>
@@ -5228,7 +5228,7 @@
             <w:pPr>
               <w:spacing w:after="20" w:before="0"/>
             </w:pPr>
-            <w:hyperlink w:history="1" r:id="rIdhtwkzdbsavjfz7dc-xqvx">
+            <w:hyperlink w:history="1" r:id="rIddz0-kqzoxmbg2ztltyzth">
               <w:r>
                 <w:rPr>
                   <w:rFonts w:ascii="Arial" w:cs="Arial" w:eastAsia="Arial" w:hAnsi="Arial"/>
@@ -5237,7 +5237,7 @@
                   <w:szCs w:val="16"/>
                   <w:u w:val="single" w:color="2E75B6"/>
                 </w:rPr>
-                <w:t xml:space="preserve">Dehydration synthesis or a condensation reaction</w:t>
+                <w:t xml:space="preserve">Scale of cells</w:t>
               </w:r>
             </w:hyperlink>
           </w:p>
@@ -5261,7 +5261,7 @@
               <w:spacing w:after="10" w:before="0"/>
               <w:ind w:left="120"/>
             </w:pPr>
-            <w:hyperlink w:history="1" r:id="rIdqsljlcdld9kn5s3xjn5ib">
+            <w:hyperlink w:history="1" r:id="rIdls013rm9iiuic-km9yfdx">
               <w:r>
                 <w:rPr>
                   <w:rFonts w:ascii="Arial" w:cs="Arial" w:eastAsia="Arial" w:hAnsi="Arial"/>
@@ -5299,14 +5299,14 @@
                 <w:sz w:val="16"/>
                 <w:szCs w:val="16"/>
               </w:rPr>
-              <w:t xml:space="preserve">📖 HTML:</w:t>
+              <w:t xml:space="preserve">📖 EXERCISE:</w:t>
             </w:r>
           </w:p>
           <w:p>
             <w:pPr>
               <w:spacing w:after="20" w:before="0"/>
             </w:pPr>
-            <w:hyperlink w:history="1" r:id="rIdcc22_ejrx_qhvpid7ikrj">
+            <w:hyperlink w:history="1" r:id="rIdnsjpcu3_npzxtnqfhtfse">
               <w:r>
                 <w:rPr>
                   <w:rFonts w:ascii="Arial" w:cs="Arial" w:eastAsia="Arial" w:hAnsi="Arial"/>
@@ -5315,7 +5315,7 @@
                   <w:szCs w:val="16"/>
                   <w:u w:val="single" w:color="2E75B6"/>
                 </w:rPr>
-                <w:t xml:space="preserve">Evolution of Eukaryotes to Multicellular Life (Flexbook)</w:t>
+                <w:t xml:space="preserve">Carbohydrates</w:t>
               </w:r>
             </w:hyperlink>
           </w:p>
@@ -5331,7 +5331,7 @@
                 <w:sz w:val="14"/>
                 <w:szCs w:val="14"/>
               </w:rPr>
-              <w:t xml:space="preserve">Source: CK-12</w:t>
+              <w:t xml:space="preserve">Source: Khan Academy (English - US curriculum)</w:t>
             </w:r>
           </w:p>
           <w:p>
@@ -5339,7 +5339,7 @@
               <w:spacing w:after="10" w:before="0"/>
               <w:ind w:left="120"/>
             </w:pPr>
-            <w:hyperlink w:history="1" r:id="rIdsmh_3cmlrco97t463xslm">
+            <w:hyperlink w:history="1" r:id="rIdlnluofsnkavv71oxd-dbv">
               <w:r>
                 <w:rPr>
                   <w:rFonts w:ascii="Arial" w:cs="Arial" w:eastAsia="Arial" w:hAnsi="Arial"/>
@@ -7206,7 +7206,7 @@
             <w:pPr>
               <w:spacing w:after="20" w:before="0"/>
             </w:pPr>
-            <w:hyperlink w:history="1" r:id="rIdb7a33iw8y5n9qda2ttjn6">
+            <w:hyperlink w:history="1" r:id="rIdiorbrj5rrsau0vhrzcsw4">
               <w:r>
                 <w:rPr>
                   <w:rFonts w:ascii="Arial" w:cs="Arial" w:eastAsia="Arial" w:hAnsi="Arial"/>
@@ -7215,7 +7215,7 @@
                   <w:szCs w:val="16"/>
                   <w:u w:val="single" w:color="2E75B6"/>
                 </w:rPr>
-                <w:t xml:space="preserve">Dehydration synthesis or a condensation reaction</w:t>
+                <w:t xml:space="preserve">Introduction to vitamins and minerals</w:t>
               </w:r>
             </w:hyperlink>
           </w:p>
@@ -7239,7 +7239,7 @@
               <w:spacing w:after="10" w:before="0"/>
               <w:ind w:left="120"/>
             </w:pPr>
-            <w:hyperlink w:history="1" r:id="rIdsscyeu5nqf4cshj4r8v0u">
+            <w:hyperlink w:history="1" r:id="rIdt18vul_w6jfjthywu-qbu">
               <w:r>
                 <w:rPr>
                   <w:rFonts w:ascii="Arial" w:cs="Arial" w:eastAsia="Arial" w:hAnsi="Arial"/>
@@ -7284,7 +7284,7 @@
             <w:pPr>
               <w:spacing w:after="20" w:before="0"/>
             </w:pPr>
-            <w:hyperlink w:history="1" r:id="rIdqeaw3xvzsog20hajktcdh">
+            <w:hyperlink w:history="1" r:id="rId65tmpscymn124iymvum93">
               <w:r>
                 <w:rPr>
                   <w:rFonts w:ascii="Arial" w:cs="Arial" w:eastAsia="Arial" w:hAnsi="Arial"/>
@@ -7293,7 +7293,7 @@
                   <w:szCs w:val="16"/>
                   <w:u w:val="single" w:color="2E75B6"/>
                 </w:rPr>
-                <w:t xml:space="preserve">Evolution of Eukaryotes to Multicellular Life (Flexbook)</w:t>
+                <w:t xml:space="preserve">Vitamins and Minerals (Flexbook)</w:t>
               </w:r>
             </w:hyperlink>
           </w:p>
@@ -7317,7 +7317,7 @@
               <w:spacing w:after="10" w:before="0"/>
               <w:ind w:left="120"/>
             </w:pPr>
-            <w:hyperlink w:history="1" r:id="rIdfzj07yzmctmfr_0tra9uj">
+            <w:hyperlink w:history="1" r:id="rIdiessww2vufoicu_pmmixa">
               <w:r>
                 <w:rPr>
                   <w:rFonts w:ascii="Arial" w:cs="Arial" w:eastAsia="Arial" w:hAnsi="Arial"/>
@@ -7512,7 +7512,7 @@
             <w:pPr>
               <w:spacing w:after="20" w:before="0"/>
             </w:pPr>
-            <w:hyperlink w:history="1" r:id="rIdfsqhkf9c_jsvkh5qglxiq">
+            <w:hyperlink w:history="1" r:id="rIdrgrwdznongilbtmadqolx">
               <w:r>
                 <w:rPr>
                   <w:rFonts w:ascii="Arial" w:cs="Arial" w:eastAsia="Arial" w:hAnsi="Arial"/>
@@ -7521,7 +7521,7 @@
                   <w:szCs w:val="16"/>
                   <w:u w:val="single" w:color="2E75B6"/>
                 </w:rPr>
-                <w:t xml:space="preserve">Dehydration synthesis or a condensation reaction</w:t>
+                <w:t xml:space="preserve">Introduction to proteins and amino acids</w:t>
               </w:r>
             </w:hyperlink>
           </w:p>
@@ -7545,7 +7545,7 @@
               <w:spacing w:after="10" w:before="0"/>
               <w:ind w:left="120"/>
             </w:pPr>
-            <w:hyperlink w:history="1" r:id="rIdu5_schkp_pbvkvuhw_6ns">
+            <w:hyperlink w:history="1" r:id="rIdnpvukw25y8fanu1qa7jom">
               <w:r>
                 <w:rPr>
                   <w:rFonts w:ascii="Arial" w:cs="Arial" w:eastAsia="Arial" w:hAnsi="Arial"/>
@@ -7583,14 +7583,14 @@
                 <w:sz w:val="16"/>
                 <w:szCs w:val="16"/>
               </w:rPr>
-              <w:t xml:space="preserve">📖 HTML:</w:t>
+              <w:t xml:space="preserve">📖 EXERCISE:</w:t>
             </w:r>
           </w:p>
           <w:p>
             <w:pPr>
               <w:spacing w:after="20" w:before="0"/>
             </w:pPr>
-            <w:hyperlink w:history="1" r:id="rIds-6t5_yojq7t8mopyl0lp">
+            <w:hyperlink w:history="1" r:id="rIddac59tsjzjl6c8xes7tct">
               <w:r>
                 <w:rPr>
                   <w:rFonts w:ascii="Arial" w:cs="Arial" w:eastAsia="Arial" w:hAnsi="Arial"/>
@@ -7599,7 +7599,7 @@
                   <w:szCs w:val="16"/>
                   <w:u w:val="single" w:color="2E75B6"/>
                 </w:rPr>
-                <w:t xml:space="preserve">Evolution of Eukaryotes to Multicellular Life (Flexbook)</w:t>
+                <w:t xml:space="preserve">Vitamins and Minerals Practice</w:t>
               </w:r>
             </w:hyperlink>
           </w:p>
@@ -7623,7 +7623,7 @@
               <w:spacing w:after="10" w:before="0"/>
               <w:ind w:left="120"/>
             </w:pPr>
-            <w:hyperlink w:history="1" r:id="rId5fk_xtis09ltytgbrzoku">
+            <w:hyperlink w:history="1" r:id="rIdtbtdbq1_pjlqvvd40pfw1">
               <w:r>
                 <w:rPr>
                   <w:rFonts w:ascii="Arial" w:cs="Arial" w:eastAsia="Arial" w:hAnsi="Arial"/>
@@ -7818,7 +7818,7 @@
             <w:pPr>
               <w:spacing w:after="20" w:before="0"/>
             </w:pPr>
-            <w:hyperlink w:history="1" r:id="rIdbm9oa8kufiwdyboxyhuvp">
+            <w:hyperlink w:history="1" r:id="rIdteo8fp0vgotqts-pwfjg0">
               <w:r>
                 <w:rPr>
                   <w:rFonts w:ascii="Arial" w:cs="Arial" w:eastAsia="Arial" w:hAnsi="Arial"/>
@@ -7827,7 +7827,7 @@
                   <w:szCs w:val="16"/>
                   <w:u w:val="single" w:color="2E75B6"/>
                 </w:rPr>
-                <w:t xml:space="preserve">Dehydration synthesis or a condensation reaction</w:t>
+                <w:t xml:space="preserve">Scale of cells</w:t>
               </w:r>
             </w:hyperlink>
           </w:p>
@@ -7851,7 +7851,7 @@
               <w:spacing w:after="10" w:before="0"/>
               <w:ind w:left="120"/>
             </w:pPr>
-            <w:hyperlink w:history="1" r:id="rIdracs6l1bjq_dzybyx1usi">
+            <w:hyperlink w:history="1" r:id="rIdhwtcvqqr4gsevuwuelftl">
               <w:r>
                 <w:rPr>
                   <w:rFonts w:ascii="Arial" w:cs="Arial" w:eastAsia="Arial" w:hAnsi="Arial"/>
@@ -7896,7 +7896,7 @@
             <w:pPr>
               <w:spacing w:after="20" w:before="0"/>
             </w:pPr>
-            <w:hyperlink w:history="1" r:id="rIdejt5pfpqmm8d9dzza1c_u">
+            <w:hyperlink w:history="1" r:id="rIdq2y7n6ujkfenojbotzrte">
               <w:r>
                 <w:rPr>
                   <w:rFonts w:ascii="Arial" w:cs="Arial" w:eastAsia="Arial" w:hAnsi="Arial"/>
@@ -7905,7 +7905,7 @@
                   <w:szCs w:val="16"/>
                   <w:u w:val="single" w:color="2E75B6"/>
                 </w:rPr>
-                <w:t xml:space="preserve">Evolution of Eukaryotes to Multicellular Life (Flexbook)</w:t>
+                <w:t xml:space="preserve">Vitamins and Minerals - Advanced (Flexbook)</w:t>
               </w:r>
             </w:hyperlink>
           </w:p>
@@ -7929,7 +7929,7 @@
               <w:spacing w:after="10" w:before="0"/>
               <w:ind w:left="120"/>
             </w:pPr>
-            <w:hyperlink w:history="1" r:id="rIdniqrqvewwaukrn_wz6xpw">
+            <w:hyperlink w:history="1" r:id="rIduch_bbhpr8bcpl0g_51lw">
               <w:r>
                 <w:rPr>
                   <w:rFonts w:ascii="Arial" w:cs="Arial" w:eastAsia="Arial" w:hAnsi="Arial"/>
@@ -8124,7 +8124,7 @@
             <w:pPr>
               <w:spacing w:after="20" w:before="0"/>
             </w:pPr>
-            <w:hyperlink w:history="1" r:id="rIdl33bz4zcayw83hetqmrkf">
+            <w:hyperlink w:history="1" r:id="rIduwmeylupxhpf_ozhko3xm">
               <w:r>
                 <w:rPr>
                   <w:rFonts w:ascii="Arial" w:cs="Arial" w:eastAsia="Arial" w:hAnsi="Arial"/>
@@ -8133,7 +8133,7 @@
                   <w:szCs w:val="16"/>
                   <w:u w:val="single" w:color="2E75B6"/>
                 </w:rPr>
-                <w:t xml:space="preserve">Dehydration synthesis or a condensation reaction</w:t>
+                <w:t xml:space="preserve">Introduction to vitamins and minerals</w:t>
               </w:r>
             </w:hyperlink>
           </w:p>
@@ -8157,7 +8157,7 @@
               <w:spacing w:after="10" w:before="0"/>
               <w:ind w:left="120"/>
             </w:pPr>
-            <w:hyperlink w:history="1" r:id="rId91itysjktd3s41ifo0gef">
+            <w:hyperlink w:history="1" r:id="rIdbpjzvcueqeipzaazawb3d">
               <w:r>
                 <w:rPr>
                   <w:rFonts w:ascii="Arial" w:cs="Arial" w:eastAsia="Arial" w:hAnsi="Arial"/>
@@ -8202,7 +8202,7 @@
             <w:pPr>
               <w:spacing w:after="20" w:before="0"/>
             </w:pPr>
-            <w:hyperlink w:history="1" r:id="rIdxmc99rdtlo0lpnyd9psi5">
+            <w:hyperlink w:history="1" r:id="rIdo129zwtnwqa5_fsq9l73e">
               <w:r>
                 <w:rPr>
                   <w:rFonts w:ascii="Arial" w:cs="Arial" w:eastAsia="Arial" w:hAnsi="Arial"/>
@@ -8211,7 +8211,7 @@
                   <w:szCs w:val="16"/>
                   <w:u w:val="single" w:color="2E75B6"/>
                 </w:rPr>
-                <w:t xml:space="preserve">Evolution of Eukaryotes to Multicellular Life (Flexbook)</w:t>
+                <w:t xml:space="preserve">Vitamins and Minerals (Flexbook)</w:t>
               </w:r>
             </w:hyperlink>
           </w:p>
@@ -8235,7 +8235,7 @@
               <w:spacing w:after="10" w:before="0"/>
               <w:ind w:left="120"/>
             </w:pPr>
-            <w:hyperlink w:history="1" r:id="rIdsneqqjkmgdwq3lu0hzicc">
+            <w:hyperlink w:history="1" r:id="rIdw9zncssn8fakmdtd1fwqr">
               <w:r>
                 <w:rPr>
                   <w:rFonts w:ascii="Arial" w:cs="Arial" w:eastAsia="Arial" w:hAnsi="Arial"/>
@@ -8430,7 +8430,7 @@
             <w:pPr>
               <w:spacing w:after="20" w:before="0"/>
             </w:pPr>
-            <w:hyperlink w:history="1" r:id="rIdqudlz9_encnuaz7qamwks">
+            <w:hyperlink w:history="1" r:id="rIdds23pxmjg9ylnyigwovyn">
               <w:r>
                 <w:rPr>
                   <w:rFonts w:ascii="Arial" w:cs="Arial" w:eastAsia="Arial" w:hAnsi="Arial"/>
@@ -8439,7 +8439,7 @@
                   <w:szCs w:val="16"/>
                   <w:u w:val="single" w:color="2E75B6"/>
                 </w:rPr>
-                <w:t xml:space="preserve">Dehydration synthesis or a condensation reaction</w:t>
+                <w:t xml:space="preserve">Introduction to vitamins and minerals</w:t>
               </w:r>
             </w:hyperlink>
           </w:p>
@@ -8463,7 +8463,7 @@
               <w:spacing w:after="10" w:before="0"/>
               <w:ind w:left="120"/>
             </w:pPr>
-            <w:hyperlink w:history="1" r:id="rIdlsclcwqv3uki08ng1a4rm">
+            <w:hyperlink w:history="1" r:id="rIds-52yrp2x8w2q7qubenul">
               <w:r>
                 <w:rPr>
                   <w:rFonts w:ascii="Arial" w:cs="Arial" w:eastAsia="Arial" w:hAnsi="Arial"/>
@@ -8508,7 +8508,7 @@
             <w:pPr>
               <w:spacing w:after="20" w:before="0"/>
             </w:pPr>
-            <w:hyperlink w:history="1" r:id="rIdvgy5vqtkk0m3qts-jfkyk">
+            <w:hyperlink w:history="1" r:id="rIdqc7m3r37-vjndbcsmh12t">
               <w:r>
                 <w:rPr>
                   <w:rFonts w:ascii="Arial" w:cs="Arial" w:eastAsia="Arial" w:hAnsi="Arial"/>
@@ -8517,7 +8517,7 @@
                   <w:szCs w:val="16"/>
                   <w:u w:val="single" w:color="2E75B6"/>
                 </w:rPr>
-                <w:t xml:space="preserve">Evolution of Eukaryotes to Multicellular Life (Flexbook)</w:t>
+                <w:t xml:space="preserve">Vitamins and Minerals (Flexbook)</w:t>
               </w:r>
             </w:hyperlink>
           </w:p>
@@ -8541,7 +8541,7 @@
               <w:spacing w:after="10" w:before="0"/>
               <w:ind w:left="120"/>
             </w:pPr>
-            <w:hyperlink w:history="1" r:id="rIdjwgywgaigzhsww_c1july">
+            <w:hyperlink w:history="1" r:id="rIdxl3qfjezx4_ocrvoyvt79">
               <w:r>
                 <w:rPr>
                   <w:rFonts w:ascii="Arial" w:cs="Arial" w:eastAsia="Arial" w:hAnsi="Arial"/>
@@ -10142,7 +10142,7 @@
             <w:pPr>
               <w:spacing w:after="20" w:before="0"/>
             </w:pPr>
-            <w:hyperlink w:history="1" r:id="rIdwjh61htcd6nqg7jf_dzyf">
+            <w:hyperlink w:history="1" r:id="rIdairawwhjqr3rnbqpn5ra0">
               <w:r>
                 <w:rPr>
                   <w:rFonts w:ascii="Arial" w:cs="Arial" w:eastAsia="Arial" w:hAnsi="Arial"/>
@@ -10151,7 +10151,7 @@
                   <w:szCs w:val="16"/>
                   <w:u w:val="single" w:color="2E75B6"/>
                 </w:rPr>
-                <w:t xml:space="preserve">Endomembrane system</w:t>
+                <w:t xml:space="preserve">Lipid overview</w:t>
               </w:r>
             </w:hyperlink>
           </w:p>
@@ -10175,7 +10175,7 @@
               <w:spacing w:after="10" w:before="0"/>
               <w:ind w:left="120"/>
             </w:pPr>
-            <w:hyperlink w:history="1" r:id="rIdg4c-g9mplycdkzni0gms6">
+            <w:hyperlink w:history="1" r:id="rIdz5hha4lewzrcfohewn-v9">
               <w:r>
                 <w:rPr>
                   <w:rFonts w:ascii="Arial" w:cs="Arial" w:eastAsia="Arial" w:hAnsi="Arial"/>
@@ -10213,14 +10213,14 @@
                 <w:sz w:val="16"/>
                 <w:szCs w:val="16"/>
               </w:rPr>
-              <w:t xml:space="preserve">📖 PDF:</w:t>
+              <w:t xml:space="preserve">📖 EXERCISE:</w:t>
             </w:r>
           </w:p>
           <w:p>
             <w:pPr>
               <w:spacing w:after="20" w:before="0"/>
             </w:pPr>
-            <w:hyperlink w:history="1" r:id="rIdlosv5asytx8rxsap92e9e">
+            <w:hyperlink w:history="1" r:id="rIdukpryjli7pcxeydcvsh83">
               <w:r>
                 <w:rPr>
                   <w:rFonts w:ascii="Arial" w:cs="Arial" w:eastAsia="Arial" w:hAnsi="Arial"/>
@@ -10229,7 +10229,7 @@
                   <w:szCs w:val="16"/>
                   <w:u w:val="single" w:color="2E75B6"/>
                 </w:rPr>
-                <w:t xml:space="preserve">Meet the Family: Inv..:Segment 6 Single Letter Codes and DNA Codons for Amino Acids</w:t>
+                <w:t xml:space="preserve">Lipids</w:t>
               </w:r>
             </w:hyperlink>
           </w:p>
@@ -10245,7 +10245,7 @@
                 <w:sz w:val="14"/>
                 <w:szCs w:val="14"/>
               </w:rPr>
-              <w:t xml:space="preserve">Source: MIT Blossoms</w:t>
+              <w:t xml:space="preserve">Source: Khan Academy (English - US curriculum)</w:t>
             </w:r>
           </w:p>
           <w:p>
@@ -10253,7 +10253,7 @@
               <w:spacing w:after="10" w:before="0"/>
               <w:ind w:left="120"/>
             </w:pPr>
-            <w:hyperlink w:history="1" r:id="rIdehlfs-2xotud-s7ucdbad">
+            <w:hyperlink w:history="1" r:id="rId-kpgr7tub5ktd45vl5xaz">
               <w:r>
                 <w:rPr>
                   <w:rFonts w:ascii="Arial" w:cs="Arial" w:eastAsia="Arial" w:hAnsi="Arial"/>
@@ -10448,7 +10448,7 @@
             <w:pPr>
               <w:spacing w:after="20" w:before="0"/>
             </w:pPr>
-            <w:hyperlink w:history="1" r:id="rId1erxpzjkpmqfubgsz0fxb">
+            <w:hyperlink w:history="1" r:id="rIdmjcnlspndubqomr6ux-rk">
               <w:r>
                 <w:rPr>
                   <w:rFonts w:ascii="Arial" w:cs="Arial" w:eastAsia="Arial" w:hAnsi="Arial"/>
@@ -10457,7 +10457,7 @@
                   <w:szCs w:val="16"/>
                   <w:u w:val="single" w:color="2E75B6"/>
                 </w:rPr>
-                <w:t xml:space="preserve">Endomembrane system</w:t>
+                <w:t xml:space="preserve">Molecular structure of triglycerides (fats)</w:t>
               </w:r>
             </w:hyperlink>
           </w:p>
@@ -10481,7 +10481,7 @@
               <w:spacing w:after="10" w:before="0"/>
               <w:ind w:left="120"/>
             </w:pPr>
-            <w:hyperlink w:history="1" r:id="rIdvdxzsdhbos3lkgbindand">
+            <w:hyperlink w:history="1" r:id="rIdp2bscoupcsyrqplzhy0xf">
               <w:r>
                 <w:rPr>
                   <w:rFonts w:ascii="Arial" w:cs="Arial" w:eastAsia="Arial" w:hAnsi="Arial"/>
@@ -10519,14 +10519,14 @@
                 <w:sz w:val="16"/>
                 <w:szCs w:val="16"/>
               </w:rPr>
-              <w:t xml:space="preserve">📖 PDF:</w:t>
+              <w:t xml:space="preserve">📖 EXERCISE:</w:t>
             </w:r>
           </w:p>
           <w:p>
             <w:pPr>
               <w:spacing w:after="20" w:before="0"/>
             </w:pPr>
-            <w:hyperlink w:history="1" r:id="rIdlzpzyeabumufoosigptve">
+            <w:hyperlink w:history="1" r:id="rId-ruk3umwcqgkunmh0junr">
               <w:r>
                 <w:rPr>
                   <w:rFonts w:ascii="Arial" w:cs="Arial" w:eastAsia="Arial" w:hAnsi="Arial"/>
@@ -10535,7 +10535,7 @@
                   <w:szCs w:val="16"/>
                   <w:u w:val="single" w:color="2E75B6"/>
                 </w:rPr>
-                <w:t xml:space="preserve">Meet the Family: Inv..:Segment 6 Single Letter Codes and DNA Codons for Amino Acids</w:t>
+                <w:t xml:space="preserve">Lipids</w:t>
               </w:r>
             </w:hyperlink>
           </w:p>
@@ -10551,7 +10551,7 @@
                 <w:sz w:val="14"/>
                 <w:szCs w:val="14"/>
               </w:rPr>
-              <w:t xml:space="preserve">Source: MIT Blossoms</w:t>
+              <w:t xml:space="preserve">Source: Khan Academy (English - US curriculum)</w:t>
             </w:r>
           </w:p>
           <w:p>
@@ -10559,7 +10559,7 @@
               <w:spacing w:after="10" w:before="0"/>
               <w:ind w:left="120"/>
             </w:pPr>
-            <w:hyperlink w:history="1" r:id="rIdicy98lxppvrfm_wqpzca4">
+            <w:hyperlink w:history="1" r:id="rIdxzpkz9akbfc4ktbxkotmi">
               <w:r>
                 <w:rPr>
                   <w:rFonts w:ascii="Arial" w:cs="Arial" w:eastAsia="Arial" w:hAnsi="Arial"/>
@@ -10754,7 +10754,7 @@
             <w:pPr>
               <w:spacing w:after="20" w:before="0"/>
             </w:pPr>
-            <w:hyperlink w:history="1" r:id="rId4_pmvw4qdl9qdwhpv372u">
+            <w:hyperlink w:history="1" r:id="rIdzwf-li87o2b3y1enfwuwj">
               <w:r>
                 <w:rPr>
                   <w:rFonts w:ascii="Arial" w:cs="Arial" w:eastAsia="Arial" w:hAnsi="Arial"/>
@@ -10763,7 +10763,7 @@
                   <w:szCs w:val="16"/>
                   <w:u w:val="single" w:color="2E75B6"/>
                 </w:rPr>
-                <w:t xml:space="preserve">Endomembrane system</w:t>
+                <w:t xml:space="preserve">Introduction to lipids</w:t>
               </w:r>
             </w:hyperlink>
           </w:p>
@@ -10787,7 +10787,7 @@
               <w:spacing w:after="10" w:before="0"/>
               <w:ind w:left="120"/>
             </w:pPr>
-            <w:hyperlink w:history="1" r:id="rIdft06m8fz3lmayi6q54ux2">
+            <w:hyperlink w:history="1" r:id="rIdkhvjweqldkmyxtdhek5ja">
               <w:r>
                 <w:rPr>
                   <w:rFonts w:ascii="Arial" w:cs="Arial" w:eastAsia="Arial" w:hAnsi="Arial"/>
@@ -10825,14 +10825,14 @@
                 <w:sz w:val="16"/>
                 <w:szCs w:val="16"/>
               </w:rPr>
-              <w:t xml:space="preserve">📖 PDF:</w:t>
+              <w:t xml:space="preserve">📖 EXERCISE:</w:t>
             </w:r>
           </w:p>
           <w:p>
             <w:pPr>
               <w:spacing w:after="20" w:before="0"/>
             </w:pPr>
-            <w:hyperlink w:history="1" r:id="rIdzeqzqqkjhiifzw1_ltrpv">
+            <w:hyperlink w:history="1" r:id="rIda70lorsgigwuikeepj-gs">
               <w:r>
                 <w:rPr>
                   <w:rFonts w:ascii="Arial" w:cs="Arial" w:eastAsia="Arial" w:hAnsi="Arial"/>
@@ -10841,7 +10841,7 @@
                   <w:szCs w:val="16"/>
                   <w:u w:val="single" w:color="2E75B6"/>
                 </w:rPr>
-                <w:t xml:space="preserve">Meet the Family: Inv..:Segment 6 Single Letter Codes and DNA Codons for Amino Acids</w:t>
+                <w:t xml:space="preserve">Lipids</w:t>
               </w:r>
             </w:hyperlink>
           </w:p>
@@ -10857,7 +10857,7 @@
                 <w:sz w:val="14"/>
                 <w:szCs w:val="14"/>
               </w:rPr>
-              <w:t xml:space="preserve">Source: MIT Blossoms</w:t>
+              <w:t xml:space="preserve">Source: Khan Academy (English - US curriculum)</w:t>
             </w:r>
           </w:p>
           <w:p>
@@ -10865,7 +10865,7 @@
               <w:spacing w:after="10" w:before="0"/>
               <w:ind w:left="120"/>
             </w:pPr>
-            <w:hyperlink w:history="1" r:id="rIdc8uyowit1womorppclwgl">
+            <w:hyperlink w:history="1" r:id="rId_tvbvp3hyufrs91ipd6jf">
               <w:r>
                 <w:rPr>
                   <w:rFonts w:ascii="Arial" w:cs="Arial" w:eastAsia="Arial" w:hAnsi="Arial"/>
@@ -11060,7 +11060,7 @@
             <w:pPr>
               <w:spacing w:after="20" w:before="0"/>
             </w:pPr>
-            <w:hyperlink w:history="1" r:id="rIdpwnjhon14lq2ed9dgwypn">
+            <w:hyperlink w:history="1" r:id="rIdbndigiiluzitba_iupmvv">
               <w:r>
                 <w:rPr>
                   <w:rFonts w:ascii="Arial" w:cs="Arial" w:eastAsia="Arial" w:hAnsi="Arial"/>
@@ -11069,7 +11069,7 @@
                   <w:szCs w:val="16"/>
                   <w:u w:val="single" w:color="2E75B6"/>
                 </w:rPr>
-                <w:t xml:space="preserve">Endomembrane system</w:t>
+                <w:t xml:space="preserve">Lipid overview</w:t>
               </w:r>
             </w:hyperlink>
           </w:p>
@@ -11093,7 +11093,7 @@
               <w:spacing w:after="10" w:before="0"/>
               <w:ind w:left="120"/>
             </w:pPr>
-            <w:hyperlink w:history="1" r:id="rIdn3b7yy3-qghfhoxppzaex">
+            <w:hyperlink w:history="1" r:id="rIdwembnc7a3ivorawedxxun">
               <w:r>
                 <w:rPr>
                   <w:rFonts w:ascii="Arial" w:cs="Arial" w:eastAsia="Arial" w:hAnsi="Arial"/>
@@ -11131,14 +11131,14 @@
                 <w:sz w:val="16"/>
                 <w:szCs w:val="16"/>
               </w:rPr>
-              <w:t xml:space="preserve">📖 PDF:</w:t>
+              <w:t xml:space="preserve">📖 EXERCISE:</w:t>
             </w:r>
           </w:p>
           <w:p>
             <w:pPr>
               <w:spacing w:after="20" w:before="0"/>
             </w:pPr>
-            <w:hyperlink w:history="1" r:id="rIdz7jrvsqypuvp8deeyikdm">
+            <w:hyperlink w:history="1" r:id="rIdvtmku1lcxf9ah7wl93oqi">
               <w:r>
                 <w:rPr>
                   <w:rFonts w:ascii="Arial" w:cs="Arial" w:eastAsia="Arial" w:hAnsi="Arial"/>
@@ -11147,7 +11147,7 @@
                   <w:szCs w:val="16"/>
                   <w:u w:val="single" w:color="2E75B6"/>
                 </w:rPr>
-                <w:t xml:space="preserve">Meet the Family: Inv..:Segment 6 Single Letter Codes and DNA Codons for Amino Acids</w:t>
+                <w:t xml:space="preserve">Lipids</w:t>
               </w:r>
             </w:hyperlink>
           </w:p>
@@ -11163,7 +11163,7 @@
                 <w:sz w:val="14"/>
                 <w:szCs w:val="14"/>
               </w:rPr>
-              <w:t xml:space="preserve">Source: MIT Blossoms</w:t>
+              <w:t xml:space="preserve">Source: Khan Academy (English - US curriculum)</w:t>
             </w:r>
           </w:p>
           <w:p>
@@ -11171,7 +11171,7 @@
               <w:spacing w:after="10" w:before="0"/>
               <w:ind w:left="120"/>
             </w:pPr>
-            <w:hyperlink w:history="1" r:id="rIdf72atcwtyih_b7sculcvz">
+            <w:hyperlink w:history="1" r:id="rIdc7bx8psyobomem5vk8gkg">
               <w:r>
                 <w:rPr>
                   <w:rFonts w:ascii="Arial" w:cs="Arial" w:eastAsia="Arial" w:hAnsi="Arial"/>
@@ -11366,7 +11366,7 @@
             <w:pPr>
               <w:spacing w:after="20" w:before="0"/>
             </w:pPr>
-            <w:hyperlink w:history="1" r:id="rIdgmyy2o1bvehfsekn9memq">
+            <w:hyperlink w:history="1" r:id="rIdgrwnzvltd_ukfyunkn4jw">
               <w:r>
                 <w:rPr>
                   <w:rFonts w:ascii="Arial" w:cs="Arial" w:eastAsia="Arial" w:hAnsi="Arial"/>
@@ -11375,7 +11375,7 @@
                   <w:szCs w:val="16"/>
                   <w:u w:val="single" w:color="2E75B6"/>
                 </w:rPr>
-                <w:t xml:space="preserve">Endomembrane system</w:t>
+                <w:t xml:space="preserve">Molecular structure of triglycerides (fats)</w:t>
               </w:r>
             </w:hyperlink>
           </w:p>
@@ -11399,7 +11399,7 @@
               <w:spacing w:after="10" w:before="0"/>
               <w:ind w:left="120"/>
             </w:pPr>
-            <w:hyperlink w:history="1" r:id="rIdasmw8s0hovdx5tqoaftpj">
+            <w:hyperlink w:history="1" r:id="rIdmnb_6iazzllzoimwd4pej">
               <w:r>
                 <w:rPr>
                   <w:rFonts w:ascii="Arial" w:cs="Arial" w:eastAsia="Arial" w:hAnsi="Arial"/>
@@ -11437,14 +11437,14 @@
                 <w:sz w:val="16"/>
                 <w:szCs w:val="16"/>
               </w:rPr>
-              <w:t xml:space="preserve">📖 PDF:</w:t>
+              <w:t xml:space="preserve">📖 EXERCISE:</w:t>
             </w:r>
           </w:p>
           <w:p>
             <w:pPr>
               <w:spacing w:after="20" w:before="0"/>
             </w:pPr>
-            <w:hyperlink w:history="1" r:id="rIdtxsmnfiy7skig3ypclh2j">
+            <w:hyperlink w:history="1" r:id="rIdewrklmnnfglme9umwv6jl">
               <w:r>
                 <w:rPr>
                   <w:rFonts w:ascii="Arial" w:cs="Arial" w:eastAsia="Arial" w:hAnsi="Arial"/>
@@ -11453,7 +11453,7 @@
                   <w:szCs w:val="16"/>
                   <w:u w:val="single" w:color="2E75B6"/>
                 </w:rPr>
-                <w:t xml:space="preserve">Meet the Family: Inv..:Segment 6 Single Letter Codes and DNA Codons for Amino Acids</w:t>
+                <w:t xml:space="preserve">Lipids</w:t>
               </w:r>
             </w:hyperlink>
           </w:p>
@@ -11469,7 +11469,7 @@
                 <w:sz w:val="14"/>
                 <w:szCs w:val="14"/>
               </w:rPr>
-              <w:t xml:space="preserve">Source: MIT Blossoms</w:t>
+              <w:t xml:space="preserve">Source: Khan Academy (English - US curriculum)</w:t>
             </w:r>
           </w:p>
           <w:p>
@@ -11477,7 +11477,7 @@
               <w:spacing w:after="10" w:before="0"/>
               <w:ind w:left="120"/>
             </w:pPr>
-            <w:hyperlink w:history="1" r:id="rId5ggkq1-_hwxm8w135i-dw">
+            <w:hyperlink w:history="1" r:id="rIdvigjf-7c7pljimiubumdr">
               <w:r>
                 <w:rPr>
                   <w:rFonts w:ascii="Arial" w:cs="Arial" w:eastAsia="Arial" w:hAnsi="Arial"/>
@@ -12964,7 +12964,313 @@
             <w:pPr>
               <w:spacing w:after="20" w:before="0"/>
             </w:pPr>
-            <w:hyperlink w:history="1" r:id="rIdflyrbvyqhey22-bes8ofd">
+            <w:hyperlink w:history="1" r:id="rIdz0nz2f21rynfcpymko71t">
+              <w:r>
+                <w:rPr>
+                  <w:rFonts w:ascii="Arial" w:cs="Arial" w:eastAsia="Arial" w:hAnsi="Arial"/>
+                  <w:color w:val="2E75B6"/>
+                  <w:sz w:val="16"/>
+                  <w:szCs w:val="16"/>
+                  <w:u w:val="single" w:color="2E75B6"/>
+                </w:rPr>
+                <w:t xml:space="preserve">Hydrolysis</w:t>
+              </w:r>
+            </w:hyperlink>
+          </w:p>
+          <w:p>
+            <w:pPr>
+              <w:spacing w:after="10" w:before="0"/>
+              <w:ind w:left="120"/>
+            </w:pPr>
+            <w:r>
+              <w:rPr>
+                <w:rFonts w:ascii="Arial" w:cs="Arial" w:eastAsia="Arial" w:hAnsi="Arial"/>
+                <w:color w:val="595959"/>
+                <w:sz w:val="14"/>
+                <w:szCs w:val="14"/>
+              </w:rPr>
+              <w:t xml:space="preserve">Source: Khan Academy (English - US curriculum)</w:t>
+            </w:r>
+          </w:p>
+          <w:p>
+            <w:pPr>
+              <w:spacing w:after="10" w:before="0"/>
+              <w:ind w:left="120"/>
+            </w:pPr>
+            <w:hyperlink w:history="1" r:id="rId03wlseiinmsi0ny0l0edg">
+              <w:r>
+                <w:rPr>
+                  <w:rFonts w:ascii="Arial" w:cs="Arial" w:eastAsia="Arial" w:hAnsi="Arial"/>
+                  <w:color w:val="595959"/>
+                  <w:sz w:val="14"/>
+                  <w:szCs w:val="14"/>
+                  <w:u w:val="single" w:color="595959"/>
+                </w:rPr>
+                <w:t xml:space="preserve">🔍 Search ARES for similar videos</w:t>
+              </w:r>
+            </w:hyperlink>
+          </w:p>
+          <w:p>
+            <w:pPr>
+              <w:spacing w:after="40" w:before="0"/>
+            </w:pPr>
+            <w:r>
+              <w:rPr>
+                <w:sz w:val="14"/>
+                <w:szCs w:val="14"/>
+              </w:rPr>
+              <w:t xml:space="preserve"/>
+            </w:r>
+          </w:p>
+          <w:p>
+            <w:pPr>
+              <w:spacing w:after="20" w:before="0"/>
+            </w:pPr>
+            <w:r>
+              <w:rPr>
+                <w:rFonts w:ascii="Arial" w:cs="Arial" w:eastAsia="Arial" w:hAnsi="Arial"/>
+                <w:b/>
+                <w:bCs/>
+                <w:color w:val="1F3864"/>
+                <w:sz w:val="16"/>
+                <w:szCs w:val="16"/>
+              </w:rPr>
+              <w:t xml:space="preserve">📖 HTML:</w:t>
+            </w:r>
+          </w:p>
+          <w:p>
+            <w:pPr>
+              <w:spacing w:after="20" w:before="0"/>
+            </w:pPr>
+            <w:hyperlink w:history="1" r:id="rIdhdn4js-jjvsmkwqwojrun">
+              <w:r>
+                <w:rPr>
+                  <w:rFonts w:ascii="Arial" w:cs="Arial" w:eastAsia="Arial" w:hAnsi="Arial"/>
+                  <w:color w:val="2E75B6"/>
+                  <w:sz w:val="16"/>
+                  <w:szCs w:val="16"/>
+                  <w:u w:val="single" w:color="2E75B6"/>
+                </w:rPr>
+                <w:t xml:space="preserve">Carbohydrate Classification (Flexbook)</w:t>
+              </w:r>
+            </w:hyperlink>
+          </w:p>
+          <w:p>
+            <w:pPr>
+              <w:spacing w:after="10" w:before="0"/>
+              <w:ind w:left="120"/>
+            </w:pPr>
+            <w:r>
+              <w:rPr>
+                <w:rFonts w:ascii="Arial" w:cs="Arial" w:eastAsia="Arial" w:hAnsi="Arial"/>
+                <w:color w:val="595959"/>
+                <w:sz w:val="14"/>
+                <w:szCs w:val="14"/>
+              </w:rPr>
+              <w:t xml:space="preserve">Source: CK-12</w:t>
+            </w:r>
+          </w:p>
+          <w:p>
+            <w:pPr>
+              <w:spacing w:after="10" w:before="0"/>
+              <w:ind w:left="120"/>
+            </w:pPr>
+            <w:hyperlink w:history="1" r:id="rId11vxhmxfumcuoyj6usbcs">
+              <w:r>
+                <w:rPr>
+                  <w:rFonts w:ascii="Arial" w:cs="Arial" w:eastAsia="Arial" w:hAnsi="Arial"/>
+                  <w:color w:val="595959"/>
+                  <w:sz w:val="14"/>
+                  <w:szCs w:val="14"/>
+                  <w:u w:val="single" w:color="595959"/>
+                </w:rPr>
+                <w:t xml:space="preserve">🔍 Search ARES for similar readings</w:t>
+              </w:r>
+            </w:hyperlink>
+          </w:p>
+        </w:tc>
+        <w:tc>
+          <w:tcPr>
+            <w:tcW w:type="dxa" w:w="3040"/>
+            <w:shd w:fill="FFFFFF" w:color="auto" w:val="clear"/>
+            <w:tcMar>
+              <w:top w:type="dxa" w:w="60"/>
+              <w:left w:type="dxa" w:w="120"/>
+              <w:bottom w:type="dxa" w:w="60"/>
+              <w:right w:type="dxa" w:w="120"/>
+            </w:tcMar>
+            <w:vAlign w:val="top"/>
+          </w:tcPr>
+          <w:p>
+            <w:pPr>
+              <w:spacing w:after="40" w:before="0"/>
+              <w:jc w:val="left"/>
+            </w:pPr>
+            <w:r>
+              <w:rPr>
+                <w:rFonts w:ascii="Arial" w:cs="Arial" w:eastAsia="Arial" w:hAnsi="Arial"/>
+                <w:b w:val="false"/>
+                <w:bCs w:val="false"/>
+                <w:i w:val="false"/>
+                <w:iCs w:val="false"/>
+                <w:color w:val="000000"/>
+                <w:sz w:val="18"/>
+                <w:szCs w:val="18"/>
+              </w:rPr>
+              <w:t xml:space="preserve">Learners are shown the anchoring phenomenon photographs of the two Kisumu children (the child with kwashiorkor eating ugali daily vs. the healthy child eating githeri) displayed at the front of the room. Working individually for 2 minutes, then in pairs for 2 minutes, learners write a prediction in their science notebooks responding to the prompt: 'We now know ugali is mostly starch and githeri contains both starch and protein. Predict: what do you think is DIFFERENT about the molecules in starch versus the molecules in protein — and why might that difference matter for the child's body?' Pairs then share predictions with a neighbouring pair (think-pair-square) before three pairs are cold-called to share with the class. Predictions are recorded on a class 'Before' column of a T-chart on the board titled 'What we predicted vs. what we found.'</w:t>
+            </w:r>
+          </w:p>
+        </w:tc>
+        <w:tc>
+          <w:tcPr>
+            <w:tcW w:type="dxa" w:w="3040"/>
+            <w:shd w:fill="F2F2F2" w:color="auto" w:val="clear"/>
+            <w:tcMar>
+              <w:top w:type="dxa" w:w="60"/>
+              <w:left w:type="dxa" w:w="120"/>
+              <w:bottom w:type="dxa" w:w="60"/>
+              <w:right w:type="dxa" w:w="120"/>
+            </w:tcMar>
+            <w:vAlign w:val="top"/>
+          </w:tcPr>
+          <w:p>
+            <w:pPr>
+              <w:spacing w:after="40" w:before="0"/>
+              <w:jc w:val="left"/>
+            </w:pPr>
+            <w:r>
+              <w:rPr>
+                <w:rFonts w:ascii="Arial" w:cs="Arial" w:eastAsia="Arial" w:hAnsi="Arial"/>
+                <w:b w:val="false"/>
+                <w:bCs w:val="false"/>
+                <w:i w:val="false"/>
+                <w:iCs w:val="false"/>
+                <w:color w:val="000000"/>
+                <w:sz w:val="18"/>
+                <w:szCs w:val="18"/>
+              </w:rPr>
+              <w:t xml:space="preserve">Display the two photographs prominently. Say: 'Look carefully at these two children. You have spent three lessons gathering evidence about the chemicals in food. Today we go deeper — we look INSIDE those chemicals at their molecular structure. Before I show you anything new, I want your best scientific prediction.' Circulate during individual writing — do not correct or affirm. After 2 minutes, say: 'Now share with your partner. You have 2 minutes — both of you must speak.' After pair discussion, say: 'I am going to cold-call three pairs — be ready.' Cold-call Pair 1, Pair 2, Pair 3. For each response, ask a probing follow-up: 'What evidence from our previous lessons supports that prediction?' Allow 10–12 seconds of WAIT TIME after each follow-up before accepting a response. Record key prediction words (e.g. 'starch is simpler,' 'protein has more parts,' 'amino acids') verbatim on the T-chart 'Before' column without evaluation.</w:t>
+            </w:r>
+          </w:p>
+        </w:tc>
+        <w:tc>
+          <w:tcPr>
+            <w:tcW w:type="dxa" w:w="3040"/>
+            <w:shd w:fill="FFFFFF" w:color="auto" w:val="clear"/>
+            <w:tcMar>
+              <w:top w:type="dxa" w:w="60"/>
+              <w:left w:type="dxa" w:w="120"/>
+              <w:bottom w:type="dxa" w:w="60"/>
+              <w:right w:type="dxa" w:w="120"/>
+            </w:tcMar>
+            <w:vAlign w:val="top"/>
+          </w:tcPr>
+          <w:p>
+            <w:pPr>
+              <w:spacing w:after="40" w:before="0"/>
+              <w:jc w:val="left"/>
+            </w:pPr>
+            <w:r>
+              <w:rPr>
+                <w:rFonts w:ascii="Arial" w:cs="Arial" w:eastAsia="Arial" w:hAnsi="Arial"/>
+                <w:b w:val="false"/>
+                <w:bCs w:val="false"/>
+                <w:i w:val="false"/>
+                <w:iCs w:val="false"/>
+                <w:color w:val="000000"/>
+                <w:sz w:val="18"/>
+                <w:szCs w:val="18"/>
+              </w:rPr>
+              <w:t xml:space="preserve">Think-Pair-Square-Share: This strategy activates prior knowledge from Lessons 1–3, surfaces existing mental models about molecular structure, and creates cognitive dissonance that motivates the evidence-gathering phases. Recording predictions publicly commits learners to ideas they will test and revise, making the later sensemaking more meaningful.</w:t>
+            </w:r>
+          </w:p>
+        </w:tc>
+        <w:tc>
+          <w:tcPr>
+            <w:tcW w:type="dxa" w:w="3040"/>
+            <w:shd w:fill="F2F2F2" w:color="auto" w:val="clear"/>
+            <w:tcMar>
+              <w:top w:type="dxa" w:w="60"/>
+              <w:left w:type="dxa" w:w="120"/>
+              <w:bottom w:type="dxa" w:w="60"/>
+              <w:right w:type="dxa" w:w="120"/>
+            </w:tcMar>
+            <w:vAlign w:val="top"/>
+          </w:tcPr>
+          <w:p>
+            <w:pPr>
+              <w:spacing w:after="40" w:before="0"/>
+              <w:jc w:val="left"/>
+            </w:pPr>
+            <w:r>
+              <w:rPr>
+                <w:rFonts w:ascii="Arial" w:cs="Arial" w:eastAsia="Arial" w:hAnsi="Arial"/>
+                <w:b w:val="false"/>
+                <w:bCs w:val="false"/>
+                <w:i w:val="false"/>
+                <w:iCs w:val="false"/>
+                <w:color w:val="000000"/>
+                <w:sz w:val="18"/>
+                <w:szCs w:val="18"/>
+              </w:rPr>
+              <w:t xml:space="preserve">Teacher scans written predictions during circulation — look for evidence that learners are connecting chemical class names (carbohydrate, protein) to function rather than just food names. Observable indicator of readiness: learner writes at least one functional claim (e.g. 'starch gives energy but cannot build muscle'). Learners who write only food names (e.g. 'ugali has starch, githeri has beans') are noted for targeted questioning during Phase 2.</w:t>
+            </w:r>
+          </w:p>
+        </w:tc>
+      </w:tr>
+      <w:tr>
+        <w:tc>
+          <w:tcPr>
+            <w:tcW w:type="dxa" w:w="1520"/>
+            <w:shd w:fill="D9EEF1" w:color="auto" w:val="clear"/>
+            <w:tcMar>
+              <w:top w:type="dxa" w:w="60"/>
+              <w:left w:type="dxa" w:w="120"/>
+              <w:bottom w:type="dxa" w:w="60"/>
+              <w:right w:type="dxa" w:w="120"/>
+            </w:tcMar>
+            <w:vAlign w:val="top"/>
+          </w:tcPr>
+          <w:p>
+            <w:pPr>
+              <w:spacing w:after="40" w:before="0"/>
+              <w:jc w:val="left"/>
+            </w:pPr>
+            <w:r>
+              <w:rPr>
+                <w:rFonts w:ascii="Arial" w:cs="Arial" w:eastAsia="Arial" w:hAnsi="Arial"/>
+                <w:b/>
+                <w:bCs/>
+                <w:i w:val="false"/>
+                <w:iCs w:val="false"/>
+                <w:color w:val="000000"/>
+                <w:sz w:val="18"/>
+                <w:szCs w:val="18"/>
+              </w:rPr>
+              <w:t xml:space="preserve">Observe Phase</w:t>
+            </w:r>
+          </w:p>
+          <w:p>
+            <w:pPr>
+              <w:spacing w:after="20" w:before="0"/>
+            </w:pPr>
+            <w:r>
+              <w:rPr>
+                <w:rFonts w:ascii="Arial" w:cs="Arial" w:eastAsia="Arial" w:hAnsi="Arial"/>
+                <w:b/>
+                <w:bCs/>
+                <w:color w:val="1F3864"/>
+                <w:sz w:val="16"/>
+                <w:szCs w:val="16"/>
+              </w:rPr>
+              <w:t xml:space="preserve">📹 VIDEO:</w:t>
+            </w:r>
+          </w:p>
+          <w:p>
+            <w:pPr>
+              <w:spacing w:after="20" w:before="0"/>
+            </w:pPr>
+            <w:hyperlink w:history="1" r:id="rIdo8-hbq_jmm58typaadwaa">
               <w:r>
                 <w:rPr>
                   <w:rFonts w:ascii="Arial" w:cs="Arial" w:eastAsia="Arial" w:hAnsi="Arial"/>
@@ -12997,7 +13303,7 @@
               <w:spacing w:after="10" w:before="0"/>
               <w:ind w:left="120"/>
             </w:pPr>
-            <w:hyperlink w:history="1" r:id="rIdumkeqtmg824afkw9gxsi2">
+            <w:hyperlink w:history="1" r:id="rIdotfems2yenk5gp1xqmvjv">
               <w:r>
                 <w:rPr>
                   <w:rFonts w:ascii="Arial" w:cs="Arial" w:eastAsia="Arial" w:hAnsi="Arial"/>
@@ -13035,14 +13341,14 @@
                 <w:sz w:val="16"/>
                 <w:szCs w:val="16"/>
               </w:rPr>
-              <w:t xml:space="preserve">📖 HTML:</w:t>
+              <w:t xml:space="preserve">📖 EXERCISE:</w:t>
             </w:r>
           </w:p>
           <w:p>
             <w:pPr>
               <w:spacing w:after="20" w:before="0"/>
             </w:pPr>
-            <w:hyperlink w:history="1" r:id="rIdwurrpsj6katezifegabbd">
+            <w:hyperlink w:history="1" r:id="rIdadvywkbwoviyyjnc_qpum">
               <w:r>
                 <w:rPr>
                   <w:rFonts w:ascii="Arial" w:cs="Arial" w:eastAsia="Arial" w:hAnsi="Arial"/>
@@ -13051,7 +13357,7 @@
                   <w:szCs w:val="16"/>
                   <w:u w:val="single" w:color="2E75B6"/>
                 </w:rPr>
-                <w:t xml:space="preserve">DNA to RNA to Protein (PLIX)</w:t>
+                <w:t xml:space="preserve">Carbohydrate Classification Practice</w:t>
               </w:r>
             </w:hyperlink>
           </w:p>
@@ -13075,7 +13381,7 @@
               <w:spacing w:after="10" w:before="0"/>
               <w:ind w:left="120"/>
             </w:pPr>
-            <w:hyperlink w:history="1" r:id="rIdrpeqgf3dufpkulqqq7uab">
+            <w:hyperlink w:history="1" r:id="rIdv04a5jcmgpn2pmmf5av1s">
               <w:r>
                 <w:rPr>
                   <w:rFonts w:ascii="Arial" w:cs="Arial" w:eastAsia="Arial" w:hAnsi="Arial"/>
@@ -13117,7 +13423,7 @@
                 <w:sz w:val="18"/>
                 <w:szCs w:val="18"/>
               </w:rPr>
-              <w:t xml:space="preserve">Learners are shown the anchoring phenomenon photographs of the two Kisumu children (the child with kwashiorkor eating ugali daily vs. the healthy child eating githeri) displayed at the front of the room. Working individually for 2 minutes, then in pairs for 2 minutes, learners write a prediction in their science notebooks responding to the prompt: 'We now know ugali is mostly starch and githeri contains both starch and protein. Predict: what do you think is DIFFERENT about the molecules in starch versus the molecules in protein — and why might that difference matter for the child's body?' Pairs then share predictions with a neighbouring pair (think-pair-square) before three pairs are cold-called to share with the class. Predictions are recorded on a class 'Before' column of a T-chart on the board titled 'What we predicted vs. what we found.'</w:t>
+              <w:t xml:space="preserve">ACTIVITY A — Guided Reading &amp; Annotated Diagrams (25 minutes): Learners receive a one-page illustrated reading passage (ARES platform resource) titled 'From Sugar to Starch: The Architecture of Carbohydrates' and a second passage titled 'Amino Acids: The Alphabet of Proteins.' Each passage includes structural diagrams (glucose ring, glycosidic bond forming maltose, glycogen branching diagram; generic amino acid structure, peptide bond formation, short polypeptide chain). Learners read individually for 8 minutes, then use coloured pencils to annotate their diagrams: (a) label monomer units in one colour, (b) label the bond type in a second colour, (c) write a one-sentence function note next to each polymer. ACTIVITY B — Model Building (15 minutes): In groups of four, learners receive 20 bottle tops (representing amino acids — different colours for different R-groups), 10 straws cut to 3 cm lengths (representing peptide bonds), and a modelling instruction card. Groups construct: (i) a monosaccharide 'monomer' using a single bottle top with a label; (ii) a disaccharide by connecting two bottle tops with one straw; (iii) a polysaccharide chain of at least six bottle tops; (iv) a dipeptide and then a tripeptide using bottle tops of mixed colours. Groups photograph their models using the ARES tablet (if available) or sketch them into notebooks. ACTIVITY C — Kenyan Food Molecule Mapping (5 minutes): Each group receives a blank classification chart with columns: Monosaccharide / Disaccharide / Polysaccharide / Protein. They are given cards bearing the names: glucose (in sugarcane juice), sucrose (in chai), starch (in ugali), glycogen (stored in nyama choma meat), amino acids (in beans/githeri), keratin (in hair/nails), haemoglobin (in blood). Groups place each card in the correct column.</w:t>
             </w:r>
           </w:p>
         </w:tc>
@@ -13149,7 +13455,7 @@
                 <w:sz w:val="18"/>
                 <w:szCs w:val="18"/>
               </w:rPr>
-              <w:t xml:space="preserve">Display the two photographs prominently. Say: 'Look carefully at these two children. You have spent three lessons gathering evidence about the chemicals in food. Today we go deeper — we look INSIDE those chemicals at their molecular structure. Before I show you anything new, I want your best scientific prediction.' Circulate during individual writing — do not correct or affirm. After 2 minutes, say: 'Now share with your partner. You have 2 minutes — both of you must speak.' After pair discussion, say: 'I am going to cold-call three pairs — be ready.' Cold-call Pair 1, Pair 2, Pair 3. For each response, ask a probing follow-up: 'What evidence from our previous lessons supports that prediction?' Allow 10–12 seconds of WAIT TIME after each follow-up before accepting a response. Record key prediction words (e.g. 'starch is simpler,' 'protein has more parts,' 'amino acids') verbatim on the T-chart 'Before' column without evaluation.</w:t>
+              <w:t xml:space="preserve">Distribute reading passages and coloured pencils. Say: 'You have 8 minutes of silent reading. As you read, use your pencils — do not just highlight, ANNOTATE. I want to see your thinking on the page.' Set a visible timer. Circulate and look for annotation quality — if a learner is not annotating, crouch to their level and whisper: 'Show me with your pencil what a monomer is in that diagram.' After 8 minutes, say: 'Now annotate your diagrams using the three tasks on the board' (display tasks). Give 7 minutes. Transition to model building: 'In your groups, you are about to become molecular architects. Your bottle tops are amino acids. Your straws are peptide bonds. Build what I describe — step by step.' Read each build step aloud, demonstrate ONE step physically at the front using oversized props if available, then release groups to build. After 10 minutes of building, say: 'You have 2 minutes — sketch your final model in your notebook and write ONE sentence: what does this model tell us about why proteins are so varied?' Allow 12 seconds WAIT TIME after posing that question before groups write. For food mapping, distribute cards and say: 'Place each card in the correct column. Disagreements are good — argue with evidence from your reading.' After 4 minutes, cold-call two groups to justify one placement each.</w:t>
             </w:r>
           </w:p>
         </w:tc>
@@ -13181,7 +13487,7 @@
                 <w:sz w:val="18"/>
                 <w:szCs w:val="18"/>
               </w:rPr>
-              <w:t xml:space="preserve">Think-Pair-Square-Share: This strategy activates prior knowledge from Lessons 1–3, surfaces existing mental models about molecular structure, and creates cognitive dissonance that motivates the evidence-gathering phases. Recording predictions publicly commits learners to ideas they will test and revise, making the later sensemaking more meaningful.</w:t>
+              <w:t xml:space="preserve">Annotated Diagram + Physical Modelling (Dual Coding + Embodied Cognition): Annotating structural diagrams with colour-coded labels forces learners to distinguish monomers from polymers and bonds from molecules — a distinction that is frequently confused. Physical model-building with bottle tops and straws engages spatial and kinesthetic reasoning, making abstract molecular geometry concrete. Together, these strategies build a multi-representational understanding of molecular structure that learners can later deploy in explanation and model-building phases.</w:t>
             </w:r>
           </w:p>
         </w:tc>
@@ -13213,7 +13519,7 @@
                 <w:sz w:val="18"/>
                 <w:szCs w:val="18"/>
               </w:rPr>
-              <w:t xml:space="preserve">Teacher scans written predictions during circulation — look for evidence that learners are connecting chemical class names (carbohydrate, protein) to function rather than just food names. Observable indicator of readiness: learner writes at least one functional claim (e.g. 'starch gives energy but cannot build muscle'). Learners who write only food names (e.g. 'ugali has starch, githeri has beans') are noted for targeted questioning during Phase 2.</w:t>
+              <w:t xml:space="preserve">During annotation: teacher looks for correct colour-coding — specifically that glycosidic bonds and peptide bonds are labelled separately and not confused. Observable indicator: learner correctly labels a peptide bond between two amino acid bottle tops AND writes a function note distinguishing 'energy storage' (glycogen) from 'body building' (protein). During food mapping: observable indicator of understanding is correct placement of glycogen (polysaccharide, not protein) — this is a common error that reveals whether learners have read carefully. Flag any group that places glycogen under 'Protein' for targeted re-teaching during Phase 3.</w:t>
             </w:r>
           </w:p>
         </w:tc>
@@ -13222,32 +13528,32 @@
         <w:tc>
           <w:tcPr>
             <w:tcW w:type="dxa" w:w="1520"/>
-            <w:shd w:fill="D9EEF1" w:color="auto" w:val="clear"/>
-            <w:tcMar>
-              <w:top w:type="dxa" w:w="60"/>
-              <w:left w:type="dxa" w:w="120"/>
-              <w:bottom w:type="dxa" w:w="60"/>
-              <w:right w:type="dxa" w:w="120"/>
-            </w:tcMar>
-            <w:vAlign w:val="top"/>
-          </w:tcPr>
-          <w:p>
-            <w:pPr>
-              <w:spacing w:after="40" w:before="0"/>
-              <w:jc w:val="left"/>
-            </w:pPr>
-            <w:r>
-              <w:rPr>
-                <w:rFonts w:ascii="Arial" w:cs="Arial" w:eastAsia="Arial" w:hAnsi="Arial"/>
-                <w:b/>
-                <w:bCs/>
-                <w:i w:val="false"/>
-                <w:iCs w:val="false"/>
-                <w:color w:val="000000"/>
-                <w:sz w:val="18"/>
-                <w:szCs w:val="18"/>
-              </w:rPr>
-              <w:t xml:space="preserve">Observe Phase</w:t>
+            <w:shd w:fill="E2EFDA" w:color="auto" w:val="clear"/>
+            <w:tcMar>
+              <w:top w:type="dxa" w:w="60"/>
+              <w:left w:type="dxa" w:w="120"/>
+              <w:bottom w:type="dxa" w:w="60"/>
+              <w:right w:type="dxa" w:w="120"/>
+            </w:tcMar>
+            <w:vAlign w:val="top"/>
+          </w:tcPr>
+          <w:p>
+            <w:pPr>
+              <w:spacing w:after="40" w:before="0"/>
+              <w:jc w:val="left"/>
+            </w:pPr>
+            <w:r>
+              <w:rPr>
+                <w:rFonts w:ascii="Arial" w:cs="Arial" w:eastAsia="Arial" w:hAnsi="Arial"/>
+                <w:b/>
+                <w:bCs/>
+                <w:i w:val="false"/>
+                <w:iCs w:val="false"/>
+                <w:color w:val="000000"/>
+                <w:sz w:val="18"/>
+                <w:szCs w:val="18"/>
+              </w:rPr>
+              <w:t xml:space="preserve">Explain Phase</w:t>
             </w:r>
           </w:p>
           <w:p>
@@ -13270,7 +13576,7 @@
             <w:pPr>
               <w:spacing w:after="20" w:before="0"/>
             </w:pPr>
-            <w:hyperlink w:history="1" r:id="rId5nagmbsmiuplpf4w69jkg">
+            <w:hyperlink w:history="1" r:id="rId1veff-mp0k-vhxknzq5fh">
               <w:r>
                 <w:rPr>
                   <w:rFonts w:ascii="Arial" w:cs="Arial" w:eastAsia="Arial" w:hAnsi="Arial"/>
@@ -13279,7 +13585,7 @@
                   <w:szCs w:val="16"/>
                   <w:u w:val="single" w:color="2E75B6"/>
                 </w:rPr>
-                <w:t xml:space="preserve">Dehydration synthesis or a condensation reaction</w:t>
+                <w:t xml:space="preserve">Introduction to carbohydrates</w:t>
               </w:r>
             </w:hyperlink>
           </w:p>
@@ -13303,7 +13609,7 @@
               <w:spacing w:after="10" w:before="0"/>
               <w:ind w:left="120"/>
             </w:pPr>
-            <w:hyperlink w:history="1" r:id="rIdyixwsjvbyuoopbam3vi1d">
+            <w:hyperlink w:history="1" r:id="rIdauxg3ysrte-fcbdrjnvhk">
               <w:r>
                 <w:rPr>
                   <w:rFonts w:ascii="Arial" w:cs="Arial" w:eastAsia="Arial" w:hAnsi="Arial"/>
@@ -13348,7 +13654,7 @@
             <w:pPr>
               <w:spacing w:after="20" w:before="0"/>
             </w:pPr>
-            <w:hyperlink w:history="1" r:id="rIdyaqdxokdmg0as5izssujr">
+            <w:hyperlink w:history="1" r:id="rIdwu7ixrey-gcxwax2mosug">
               <w:r>
                 <w:rPr>
                   <w:rFonts w:ascii="Arial" w:cs="Arial" w:eastAsia="Arial" w:hAnsi="Arial"/>
@@ -13357,7 +13663,7 @@
                   <w:szCs w:val="16"/>
                   <w:u w:val="single" w:color="2E75B6"/>
                 </w:rPr>
-                <w:t xml:space="preserve">DNA to RNA to Protein (PLIX)</w:t>
+                <w:t xml:space="preserve">Carbohydrate Classification (Flexbook)</w:t>
               </w:r>
             </w:hyperlink>
           </w:p>
@@ -13381,7 +13687,7 @@
               <w:spacing w:after="10" w:before="0"/>
               <w:ind w:left="120"/>
             </w:pPr>
-            <w:hyperlink w:history="1" r:id="rId0zrytitvaayjh9pfvmgpw">
+            <w:hyperlink w:history="1" r:id="rId3oowqbptagvluito21xmp">
               <w:r>
                 <w:rPr>
                   <w:rFonts w:ascii="Arial" w:cs="Arial" w:eastAsia="Arial" w:hAnsi="Arial"/>
@@ -13423,7 +13729,7 @@
                 <w:sz w:val="18"/>
                 <w:szCs w:val="18"/>
               </w:rPr>
-              <w:t xml:space="preserve">ACTIVITY A — Guided Reading &amp; Annotated Diagrams (25 minutes): Learners receive a one-page illustrated reading passage (ARES platform resource) titled 'From Sugar to Starch: The Architecture of Carbohydrates' and a second passage titled 'Amino Acids: The Alphabet of Proteins.' Each passage includes structural diagrams (glucose ring, glycosidic bond forming maltose, glycogen branching diagram; generic amino acid structure, peptide bond formation, short polypeptide chain). Learners read individually for 8 minutes, then use coloured pencils to annotate their diagrams: (a) label monomer units in one colour, (b) label the bond type in a second colour, (c) write a one-sentence function note next to each polymer. ACTIVITY B — Model Building (15 minutes): In groups of four, learners receive 20 bottle tops (representing amino acids — different colours for different R-groups), 10 straws cut to 3 cm lengths (representing peptide bonds), and a modelling instruction card. Groups construct: (i) a monosaccharide 'monomer' using a single bottle top with a label; (ii) a disaccharide by connecting two bottle tops with one straw; (iii) a polysaccharide chain of at least six bottle tops; (iv) a dipeptide and then a tripeptide using bottle tops of mixed colours. Groups photograph their models using the ARES tablet (if available) or sketch them into notebooks. ACTIVITY C — Kenyan Food Molecule Mapping (5 minutes): Each group receives a blank classification chart with columns: Monosaccharide / Disaccharide / Polysaccharide / Protein. They are given cards bearing the names: glucose (in sugarcane juice), sucrose (in chai), starch (in ugali), glycogen (stored in nyama choma meat), amino acids (in beans/githeri), keratin (in hair/nails), haemoglobin (in blood). Groups place each card in the correct column.</w:t>
+              <w:t xml:space="preserve">GALLERY WALK — Molecular Model Exhibition (10 minutes): Each group's bottle-top model is placed on their desk with a sticky-note label. Half the class circulates (Walkers) while the other half stands by their model as 'Explainers.' After 4 minutes, roles swap. Walkers must write one question and one connection on a sticky note left at each model they visit. WHOLE-CLASS SENSEMAKING DISCUSSION (10 minutes): Teacher facilitates a structured discussion using the following sequence of questions, returning always to the anchoring phenomenon. Learners respond in full sentences, referencing their models and diagrams. The class builds a shared explanation on the board: 'Ugali provides starch (a polysaccharide of glucose). Glucose monomers release energy. BUT — glucose monomers contain only C, H, and O. Amino acids contain N (nitrogen) as well. The body cannot build proteins — including muscle, enzymes, and the protein albumin that prevents the swollen belly — without amino acids. Githeri provides amino acids from beans. Ugali alone does not. This is why the child eating only ugali develops kwashiorkor.' Learners write this explanation in their own words in their notebooks as a 'Sensemaking Summary.'</w:t>
             </w:r>
           </w:p>
         </w:tc>
@@ -13455,7 +13761,7 @@
                 <w:sz w:val="18"/>
                 <w:szCs w:val="18"/>
               </w:rPr>
-              <w:t xml:space="preserve">Distribute reading passages and coloured pencils. Say: 'You have 8 minutes of silent reading. As you read, use your pencils — do not just highlight, ANNOTATE. I want to see your thinking on the page.' Set a visible timer. Circulate and look for annotation quality — if a learner is not annotating, crouch to their level and whisper: 'Show me with your pencil what a monomer is in that diagram.' After 8 minutes, say: 'Now annotate your diagrams using the three tasks on the board' (display tasks). Give 7 minutes. Transition to model building: 'In your groups, you are about to become molecular architects. Your bottle tops are amino acids. Your straws are peptide bonds. Build what I describe — step by step.' Read each build step aloud, demonstrate ONE step physically at the front using oversized props if available, then release groups to build. After 10 minutes of building, say: 'You have 2 minutes — sketch your final model in your notebook and write ONE sentence: what does this model tell us about why proteins are so varied?' Allow 12 seconds WAIT TIME after posing that question before groups write. For food mapping, distribute cards and say: 'Place each card in the correct column. Disagreements are good — argue with evidence from your reading.' After 4 minutes, cold-call two groups to justify one placement each.</w:t>
+              <w:t xml:space="preserve">Initiate Gallery Walk: 'Explainers — your job is to explain your model to every Walker who visits. Use the words: monomer, polymer, bond, function. Walkers — leave a question AND a connection at every model.' Set 4-minute timer. After swap, set another 4-minute timer. Bring class back together: 'Let us build our explanation together. I am going to ask you three questions. Each answer gets us closer to solving the mystery of our two Kisumu children.' Q1: 'What elements are found in carbohydrates?' (Cold-call 1 learner — WAIT 10 seconds.) Q2: 'What extra element is found in amino acids that is NOT in glucose?' (Cold-call 1 learner — WAIT 12 seconds. Expected: nitrogen.) Q3 (to whole class, think-pair then share): 'If the Kisumu child eating only ugali has NO dietary source of amino acids — what happens to body tissues that need constant protein repair, like muscle and blood proteins?' (Pair discuss 90 seconds, then cold-call 2 pairs.) Scribe key words on board: C-H-O (carbohydrates) vs. C-H-O-N-S (proteins). Say: 'This is the molecular reason. Not quantity of food — CHEMICAL COMPOSITION of food. Write your own sensemaking summary now — 3–4 sentences, in your own words, connecting molecular structure to the child's condition.'</w:t>
             </w:r>
           </w:p>
         </w:tc>
@@ -13487,7 +13793,7 @@
                 <w:sz w:val="18"/>
                 <w:szCs w:val="18"/>
               </w:rPr>
-              <w:t xml:space="preserve">Annotated Diagram + Physical Modelling (Dual Coding + Embodied Cognition): Annotating structural diagrams with colour-coded labels forces learners to distinguish monomers from polymers and bonds from molecules — a distinction that is frequently confused. Physical model-building with bottle tops and straws engages spatial and kinesthetic reasoning, making abstract molecular geometry concrete. Together, these strategies build a multi-representational understanding of molecular structure that learners can later deploy in explanation and model-building phases.</w:t>
+              <w:t xml:space="preserve">Gallery Walk + Socratic Questioning Sequence: The Gallery Walk distributes the explanatory burden across all groups and forces learners to articulate molecular structure in their own words — a high-leverage retrieval and elaboration practice. The Socratic questioning sequence scaffolds learners from elemental composition → structural difference → physiological consequence → phenomenon explanation, mirroring the scientific reasoning chain. Writing the Sensemaking Summary consolidates understanding and produces a formative artefact.</w:t>
             </w:r>
           </w:p>
         </w:tc>
@@ -13519,7 +13825,7 @@
                 <w:sz w:val="18"/>
                 <w:szCs w:val="18"/>
               </w:rPr>
-              <w:t xml:space="preserve">During annotation: teacher looks for correct colour-coding — specifically that glycosidic bonds and peptide bonds are labelled separately and not confused. Observable indicator: learner correctly labels a peptide bond between two amino acid bottle tops AND writes a function note distinguishing 'energy storage' (glycogen) from 'body building' (protein). During food mapping: observable indicator of understanding is correct placement of glycogen (polysaccharide, not protein) — this is a common error that reveals whether learners have read carefully. Flag any group that places glycogen under 'Protein' for targeted re-teaching during Phase 3.</w:t>
+              <w:t xml:space="preserve">Teacher reads 4–5 Sensemaking Summaries during the final minutes of the phase (circulate and photograph with tablet or read over shoulder). Observable indicator of proficiency: learner's summary (a) names at least one monomer for each macromolecule class, (b) identifies nitrogen as the key distinguishing element in amino acids, and (c) explicitly connects protein absence to a named symptom of the Kisumu child (swollen belly = loss of albumin protein, or thin limbs = loss of muscle protein). Learners who write only 'ugali has no protein' without molecular reasoning are identified for additional scaffolding in Phase 5.</w:t>
             </w:r>
           </w:p>
         </w:tc>
@@ -13528,32 +13834,32 @@
         <w:tc>
           <w:tcPr>
             <w:tcW w:type="dxa" w:w="1520"/>
-            <w:shd w:fill="E2EFDA" w:color="auto" w:val="clear"/>
-            <w:tcMar>
-              <w:top w:type="dxa" w:w="60"/>
-              <w:left w:type="dxa" w:w="120"/>
-              <w:bottom w:type="dxa" w:w="60"/>
-              <w:right w:type="dxa" w:w="120"/>
-            </w:tcMar>
-            <w:vAlign w:val="top"/>
-          </w:tcPr>
-          <w:p>
-            <w:pPr>
-              <w:spacing w:after="40" w:before="0"/>
-              <w:jc w:val="left"/>
-            </w:pPr>
-            <w:r>
-              <w:rPr>
-                <w:rFonts w:ascii="Arial" w:cs="Arial" w:eastAsia="Arial" w:hAnsi="Arial"/>
-                <w:b/>
-                <w:bCs/>
-                <w:i w:val="false"/>
-                <w:iCs w:val="false"/>
-                <w:color w:val="000000"/>
-                <w:sz w:val="18"/>
-                <w:szCs w:val="18"/>
-              </w:rPr>
-              <w:t xml:space="preserve">Explain Phase</w:t>
+            <w:shd w:fill="FCE4D6" w:color="auto" w:val="clear"/>
+            <w:tcMar>
+              <w:top w:type="dxa" w:w="60"/>
+              <w:left w:type="dxa" w:w="120"/>
+              <w:bottom w:type="dxa" w:w="60"/>
+              <w:right w:type="dxa" w:w="120"/>
+            </w:tcMar>
+            <w:vAlign w:val="top"/>
+          </w:tcPr>
+          <w:p>
+            <w:pPr>
+              <w:spacing w:after="40" w:before="0"/>
+              <w:jc w:val="left"/>
+            </w:pPr>
+            <w:r>
+              <w:rPr>
+                <w:rFonts w:ascii="Arial" w:cs="Arial" w:eastAsia="Arial" w:hAnsi="Arial"/>
+                <w:b/>
+                <w:bCs/>
+                <w:i w:val="false"/>
+                <w:iCs w:val="false"/>
+                <w:color w:val="000000"/>
+                <w:sz w:val="18"/>
+                <w:szCs w:val="18"/>
+              </w:rPr>
+              <w:t xml:space="preserve">Driving Question Board (DQB) Creation</w:t>
             </w:r>
           </w:p>
           <w:p>
@@ -13576,7 +13882,7 @@
             <w:pPr>
               <w:spacing w:after="20" w:before="0"/>
             </w:pPr>
-            <w:hyperlink w:history="1" r:id="rIdowqrs_ss59v3pp2sd2nqd">
+            <w:hyperlink w:history="1" r:id="rIdo-oa9rlcawgru6h_od0pj">
               <w:r>
                 <w:rPr>
                   <w:rFonts w:ascii="Arial" w:cs="Arial" w:eastAsia="Arial" w:hAnsi="Arial"/>
@@ -13585,7 +13891,7 @@
                   <w:szCs w:val="16"/>
                   <w:u w:val="single" w:color="2E75B6"/>
                 </w:rPr>
-                <w:t xml:space="preserve">Dehydration synthesis or a condensation reaction</w:t>
+                <w:t xml:space="preserve">Peptide bond formation</w:t>
               </w:r>
             </w:hyperlink>
           </w:p>
@@ -13609,7 +13915,7 @@
               <w:spacing w:after="10" w:before="0"/>
               <w:ind w:left="120"/>
             </w:pPr>
-            <w:hyperlink w:history="1" r:id="rIdfhbskokquaxrhsgmyn909">
+            <w:hyperlink w:history="1" r:id="rIdo6wxws8jh-plgefg02jeu">
               <w:r>
                 <w:rPr>
                   <w:rFonts w:ascii="Arial" w:cs="Arial" w:eastAsia="Arial" w:hAnsi="Arial"/>
@@ -13654,7 +13960,7 @@
             <w:pPr>
               <w:spacing w:after="20" w:before="0"/>
             </w:pPr>
-            <w:hyperlink w:history="1" r:id="rIdvmhr1owifz6vxrjnbznjp">
+            <w:hyperlink w:history="1" r:id="rIdabvueawfp6yftldfxa7bt">
               <w:r>
                 <w:rPr>
                   <w:rFonts w:ascii="Arial" w:cs="Arial" w:eastAsia="Arial" w:hAnsi="Arial"/>
@@ -13663,7 +13969,7 @@
                   <w:szCs w:val="16"/>
                   <w:u w:val="single" w:color="2E75B6"/>
                 </w:rPr>
-                <w:t xml:space="preserve">DNA to RNA to Protein (PLIX)</w:t>
+                <w:t xml:space="preserve">Carbohydrate Classification (Flexbook)</w:t>
               </w:r>
             </w:hyperlink>
           </w:p>
@@ -13687,7 +13993,7 @@
               <w:spacing w:after="10" w:before="0"/>
               <w:ind w:left="120"/>
             </w:pPr>
-            <w:hyperlink w:history="1" r:id="rIdlkbjygrfi1w07csxpvd8c">
+            <w:hyperlink w:history="1" r:id="rIdxynzr_cfigipmhgzbhfno">
               <w:r>
                 <w:rPr>
                   <w:rFonts w:ascii="Arial" w:cs="Arial" w:eastAsia="Arial" w:hAnsi="Arial"/>
@@ -13729,7 +14035,7 @@
                 <w:sz w:val="18"/>
                 <w:szCs w:val="18"/>
               </w:rPr>
-              <w:t xml:space="preserve">GALLERY WALK — Molecular Model Exhibition (10 minutes): Each group's bottle-top model is placed on their desk with a sticky-note label. Half the class circulates (Walkers) while the other half stands by their model as 'Explainers.' After 4 minutes, roles swap. Walkers must write one question and one connection on a sticky note left at each model they visit. WHOLE-CLASS SENSEMAKING DISCUSSION (10 minutes): Teacher facilitates a structured discussion using the following sequence of questions, returning always to the anchoring phenomenon. Learners respond in full sentences, referencing their models and diagrams. The class builds a shared explanation on the board: 'Ugali provides starch (a polysaccharide of glucose). Glucose monomers release energy. BUT — glucose monomers contain only C, H, and O. Amino acids contain N (nitrogen) as well. The body cannot build proteins — including muscle, enzymes, and the protein albumin that prevents the swollen belly — without amino acids. Githeri provides amino acids from beans. Ugali alone does not. This is why the child eating only ugali develops kwashiorkor.' Learners write this explanation in their own words in their notebooks as a 'Sensemaking Summary.'</w:t>
+              <w:t xml:space="preserve">Learners return to the class Driving Question Board. Each learner receives two sticky notes of different colours — one colour for 'Questions this lesson ANSWERED' and one for 'New questions this lesson RAISED.' Individually (3 minutes), learners write: (a) one answered question connected to today's molecular structure learning (e.g. 'Why can't ugali alone build muscle? Because starch has no nitrogen-containing amino acids.') and (b) one new question raised (e.g. 'How does the body break polysaccharides back into glucose — and where does this happen?' or 'Are all proteins in githeri beans actually usable by the human body?'). Sticky notes are placed on the DQB. Teacher reads three 'new questions' aloud and the class votes (thumbs up) on which ones are most exciting — these become preview hooks for Lessons 5 and 6.</w:t>
             </w:r>
           </w:p>
         </w:tc>
@@ -13761,7 +14067,7 @@
                 <w:sz w:val="18"/>
                 <w:szCs w:val="18"/>
               </w:rPr>
-              <w:t xml:space="preserve">Initiate Gallery Walk: 'Explainers — your job is to explain your model to every Walker who visits. Use the words: monomer, polymer, bond, function. Walkers — leave a question AND a connection at every model.' Set 4-minute timer. After swap, set another 4-minute timer. Bring class back together: 'Let us build our explanation together. I am going to ask you three questions. Each answer gets us closer to solving the mystery of our two Kisumu children.' Q1: 'What elements are found in carbohydrates?' (Cold-call 1 learner — WAIT 10 seconds.) Q2: 'What extra element is found in amino acids that is NOT in glucose?' (Cold-call 1 learner — WAIT 12 seconds. Expected: nitrogen.) Q3 (to whole class, think-pair then share): 'If the Kisumu child eating only ugali has NO dietary source of amino acids — what happens to body tissues that need constant protein repair, like muscle and blood proteins?' (Pair discuss 90 seconds, then cold-call 2 pairs.) Scribe key words on board: C-H-O (carbohydrates) vs. C-H-O-N-S (proteins). Say: 'This is the molecular reason. Not quantity of food — CHEMICAL COMPOSITION of food. Write your own sensemaking summary now — 3–4 sentences, in your own words, connecting molecular structure to the child's condition.'</w:t>
+              <w:t xml:space="preserve">Say: 'Our Driving Question Board is a living record of our growing understanding. Today we go back to it. I want two sticky notes from each of you — one for what we can now ANSWER, one for what we still wonder.' Distribute sticky notes. Allow 3 minutes of silent individual writing. As learners post notes, circulate and read them — do not correct yet. Select three 'new question' notes that align with upcoming lessons (digestion, lipids, enzymes). Read them aloud: 'Someone asks: [read question]. Hands up — who else wonders this?' Count hands visibly. Say: 'These questions will drive our next two lessons. Your curiosity is doing exactly what scientists' curiosity does — it points to the next investigation.' Point to the DQB and say: 'Notice how our board has grown since Lesson 1. Four lessons ago, many of you could not explain the difference between the two children. What can you explain now?'</w:t>
             </w:r>
           </w:p>
         </w:tc>
@@ -13793,7 +14099,7 @@
                 <w:sz w:val="18"/>
                 <w:szCs w:val="18"/>
               </w:rPr>
-              <w:t xml:space="preserve">Gallery Walk + Socratic Questioning Sequence: The Gallery Walk distributes the explanatory burden across all groups and forces learners to articulate molecular structure in their own words — a high-leverage retrieval and elaboration practice. The Socratic questioning sequence scaffolds learners from elemental composition → structural difference → physiological consequence → phenomenon explanation, mirroring the scientific reasoning chain. Writing the Sensemaking Summary consolidates understanding and produces a formative artefact.</w:t>
+              <w:t xml:space="preserve">Driving Question Board Revision (Metacognitive Progress Tracking): Revisiting the DQB at the end of each lesson makes learning growth visible and tangible. Distinguishing 'answered' from 'new' questions trains learners to recognise the iterative nature of scientific inquiry — answering one question always generates new ones. Public voting on new questions builds collective ownership of the inquiry and previews upcoming lessons with genuine learner-generated curiosity.</w:t>
             </w:r>
           </w:p>
         </w:tc>
@@ -13825,7 +14131,7 @@
                 <w:sz w:val="18"/>
                 <w:szCs w:val="18"/>
               </w:rPr>
-              <w:t xml:space="preserve">Teacher reads 4–5 Sensemaking Summaries during the final minutes of the phase (circulate and photograph with tablet or read over shoulder). Observable indicator of proficiency: learner's summary (a) names at least one monomer for each macromolecule class, (b) identifies nitrogen as the key distinguishing element in amino acids, and (c) explicitly connects protein absence to a named symptom of the Kisumu child (swollen belly = loss of albumin protein, or thin limbs = loss of muscle protein). Learners who write only 'ugali has no protein' without molecular reasoning are identified for additional scaffolding in Phase 5.</w:t>
+              <w:t xml:space="preserve">Teacher photographs the DQB after sticky notes are placed. Observable indicators: (a) 'answered' notes reference molecular vocabulary from today (monomer, polymer, amino acid, peptide bond, glycosidic bond) — not just food names; (b) 'new question' notes are scientifically framed (begin with 'how,' 'why,' 'what happens when') rather than purely factual ('what is a protein'). Any learner whose 'answered' note is still at the food-name level (e.g. 'githeri has protein, ugali does not') is paired with a stronger peer for the model-building phase.</w:t>
             </w:r>
           </w:p>
         </w:tc>
@@ -13834,32 +14140,32 @@
         <w:tc>
           <w:tcPr>
             <w:tcW w:type="dxa" w:w="1520"/>
-            <w:shd w:fill="FCE4D6" w:color="auto" w:val="clear"/>
-            <w:tcMar>
-              <w:top w:type="dxa" w:w="60"/>
-              <w:left w:type="dxa" w:w="120"/>
-              <w:bottom w:type="dxa" w:w="60"/>
-              <w:right w:type="dxa" w:w="120"/>
-            </w:tcMar>
-            <w:vAlign w:val="top"/>
-          </w:tcPr>
-          <w:p>
-            <w:pPr>
-              <w:spacing w:after="40" w:before="0"/>
-              <w:jc w:val="left"/>
-            </w:pPr>
-            <w:r>
-              <w:rPr>
-                <w:rFonts w:ascii="Arial" w:cs="Arial" w:eastAsia="Arial" w:hAnsi="Arial"/>
-                <w:b/>
-                <w:bCs/>
-                <w:i w:val="false"/>
-                <w:iCs w:val="false"/>
-                <w:color w:val="000000"/>
-                <w:sz w:val="18"/>
-                <w:szCs w:val="18"/>
-              </w:rPr>
-              <w:t xml:space="preserve">Driving Question Board (DQB) Creation</w:t>
+            <w:shd w:fill="D5E8F0" w:color="auto" w:val="clear"/>
+            <w:tcMar>
+              <w:top w:type="dxa" w:w="60"/>
+              <w:left w:type="dxa" w:w="120"/>
+              <w:bottom w:type="dxa" w:w="60"/>
+              <w:right w:type="dxa" w:w="120"/>
+            </w:tcMar>
+            <w:vAlign w:val="top"/>
+          </w:tcPr>
+          <w:p>
+            <w:pPr>
+              <w:spacing w:after="40" w:before="0"/>
+              <w:jc w:val="left"/>
+            </w:pPr>
+            <w:r>
+              <w:rPr>
+                <w:rFonts w:ascii="Arial" w:cs="Arial" w:eastAsia="Arial" w:hAnsi="Arial"/>
+                <w:b/>
+                <w:bCs/>
+                <w:i w:val="false"/>
+                <w:iCs w:val="false"/>
+                <w:color w:val="000000"/>
+                <w:sz w:val="18"/>
+                <w:szCs w:val="18"/>
+              </w:rPr>
+              <w:t xml:space="preserve">Model Building Phase</w:t>
             </w:r>
           </w:p>
           <w:p>
@@ -13882,7 +14188,7 @@
             <w:pPr>
               <w:spacing w:after="20" w:before="0"/>
             </w:pPr>
-            <w:hyperlink w:history="1" r:id="rId9nvpetnpmjnn09unqjtad">
+            <w:hyperlink w:history="1" r:id="rId7haquyliioe4njwobnos-">
               <w:r>
                 <w:rPr>
                   <w:rFonts w:ascii="Arial" w:cs="Arial" w:eastAsia="Arial" w:hAnsi="Arial"/>
@@ -13891,7 +14197,7 @@
                   <w:szCs w:val="16"/>
                   <w:u w:val="single" w:color="2E75B6"/>
                 </w:rPr>
-                <w:t xml:space="preserve">Dehydration synthesis or a condensation reaction</w:t>
+                <w:t xml:space="preserve">Introduction to proteins and amino acids</w:t>
               </w:r>
             </w:hyperlink>
           </w:p>
@@ -13915,7 +14221,7 @@
               <w:spacing w:after="10" w:before="0"/>
               <w:ind w:left="120"/>
             </w:pPr>
-            <w:hyperlink w:history="1" r:id="rIdnwvsc-rkjanz_zaxyxy-4">
+            <w:hyperlink w:history="1" r:id="rIdxeuyokrhw1ws7oxsr1uj2">
               <w:r>
                 <w:rPr>
                   <w:rFonts w:ascii="Arial" w:cs="Arial" w:eastAsia="Arial" w:hAnsi="Arial"/>
@@ -13960,7 +14266,7 @@
             <w:pPr>
               <w:spacing w:after="20" w:before="0"/>
             </w:pPr>
-            <w:hyperlink w:history="1" r:id="rIdmyznwn0ysy1iy33wz6a7s">
+            <w:hyperlink w:history="1" r:id="rIdph7lxwhmdgz6obm8xicvb">
               <w:r>
                 <w:rPr>
                   <w:rFonts w:ascii="Arial" w:cs="Arial" w:eastAsia="Arial" w:hAnsi="Arial"/>
@@ -13969,7 +14275,7 @@
                   <w:szCs w:val="16"/>
                   <w:u w:val="single" w:color="2E75B6"/>
                 </w:rPr>
-                <w:t xml:space="preserve">DNA to RNA to Protein (PLIX)</w:t>
+                <w:t xml:space="preserve">Carbohydrate Classification (Flexbook)</w:t>
               </w:r>
             </w:hyperlink>
           </w:p>
@@ -13993,313 +14299,7 @@
               <w:spacing w:after="10" w:before="0"/>
               <w:ind w:left="120"/>
             </w:pPr>
-            <w:hyperlink w:history="1" r:id="rIdg8klmwnvpqe0nwiq4codd">
-              <w:r>
-                <w:rPr>
-                  <w:rFonts w:ascii="Arial" w:cs="Arial" w:eastAsia="Arial" w:hAnsi="Arial"/>
-                  <w:color w:val="595959"/>
-                  <w:sz w:val="14"/>
-                  <w:szCs w:val="14"/>
-                  <w:u w:val="single" w:color="595959"/>
-                </w:rPr>
-                <w:t xml:space="preserve">🔍 Search ARES for similar readings</w:t>
-              </w:r>
-            </w:hyperlink>
-          </w:p>
-        </w:tc>
-        <w:tc>
-          <w:tcPr>
-            <w:tcW w:type="dxa" w:w="3040"/>
-            <w:shd w:fill="FFFFFF" w:color="auto" w:val="clear"/>
-            <w:tcMar>
-              <w:top w:type="dxa" w:w="60"/>
-              <w:left w:type="dxa" w:w="120"/>
-              <w:bottom w:type="dxa" w:w="60"/>
-              <w:right w:type="dxa" w:w="120"/>
-            </w:tcMar>
-            <w:vAlign w:val="top"/>
-          </w:tcPr>
-          <w:p>
-            <w:pPr>
-              <w:spacing w:after="40" w:before="0"/>
-              <w:jc w:val="left"/>
-            </w:pPr>
-            <w:r>
-              <w:rPr>
-                <w:rFonts w:ascii="Arial" w:cs="Arial" w:eastAsia="Arial" w:hAnsi="Arial"/>
-                <w:b w:val="false"/>
-                <w:bCs w:val="false"/>
-                <w:i w:val="false"/>
-                <w:iCs w:val="false"/>
-                <w:color w:val="000000"/>
-                <w:sz w:val="18"/>
-                <w:szCs w:val="18"/>
-              </w:rPr>
-              <w:t xml:space="preserve">Learners return to the class Driving Question Board. Each learner receives two sticky notes of different colours — one colour for 'Questions this lesson ANSWERED' and one for 'New questions this lesson RAISED.' Individually (3 minutes), learners write: (a) one answered question connected to today's molecular structure learning (e.g. 'Why can't ugali alone build muscle? Because starch has no nitrogen-containing amino acids.') and (b) one new question raised (e.g. 'How does the body break polysaccharides back into glucose — and where does this happen?' or 'Are all proteins in githeri beans actually usable by the human body?'). Sticky notes are placed on the DQB. Teacher reads three 'new questions' aloud and the class votes (thumbs up) on which ones are most exciting — these become preview hooks for Lessons 5 and 6.</w:t>
-            </w:r>
-          </w:p>
-        </w:tc>
-        <w:tc>
-          <w:tcPr>
-            <w:tcW w:type="dxa" w:w="3040"/>
-            <w:shd w:fill="F2F2F2" w:color="auto" w:val="clear"/>
-            <w:tcMar>
-              <w:top w:type="dxa" w:w="60"/>
-              <w:left w:type="dxa" w:w="120"/>
-              <w:bottom w:type="dxa" w:w="60"/>
-              <w:right w:type="dxa" w:w="120"/>
-            </w:tcMar>
-            <w:vAlign w:val="top"/>
-          </w:tcPr>
-          <w:p>
-            <w:pPr>
-              <w:spacing w:after="40" w:before="0"/>
-              <w:jc w:val="left"/>
-            </w:pPr>
-            <w:r>
-              <w:rPr>
-                <w:rFonts w:ascii="Arial" w:cs="Arial" w:eastAsia="Arial" w:hAnsi="Arial"/>
-                <w:b w:val="false"/>
-                <w:bCs w:val="false"/>
-                <w:i w:val="false"/>
-                <w:iCs w:val="false"/>
-                <w:color w:val="000000"/>
-                <w:sz w:val="18"/>
-                <w:szCs w:val="18"/>
-              </w:rPr>
-              <w:t xml:space="preserve">Say: 'Our Driving Question Board is a living record of our growing understanding. Today we go back to it. I want two sticky notes from each of you — one for what we can now ANSWER, one for what we still wonder.' Distribute sticky notes. Allow 3 minutes of silent individual writing. As learners post notes, circulate and read them — do not correct yet. Select three 'new question' notes that align with upcoming lessons (digestion, lipids, enzymes). Read them aloud: 'Someone asks: [read question]. Hands up — who else wonders this?' Count hands visibly. Say: 'These questions will drive our next two lessons. Your curiosity is doing exactly what scientists' curiosity does — it points to the next investigation.' Point to the DQB and say: 'Notice how our board has grown since Lesson 1. Four lessons ago, many of you could not explain the difference between the two children. What can you explain now?'</w:t>
-            </w:r>
-          </w:p>
-        </w:tc>
-        <w:tc>
-          <w:tcPr>
-            <w:tcW w:type="dxa" w:w="3040"/>
-            <w:shd w:fill="FFFFFF" w:color="auto" w:val="clear"/>
-            <w:tcMar>
-              <w:top w:type="dxa" w:w="60"/>
-              <w:left w:type="dxa" w:w="120"/>
-              <w:bottom w:type="dxa" w:w="60"/>
-              <w:right w:type="dxa" w:w="120"/>
-            </w:tcMar>
-            <w:vAlign w:val="top"/>
-          </w:tcPr>
-          <w:p>
-            <w:pPr>
-              <w:spacing w:after="40" w:before="0"/>
-              <w:jc w:val="left"/>
-            </w:pPr>
-            <w:r>
-              <w:rPr>
-                <w:rFonts w:ascii="Arial" w:cs="Arial" w:eastAsia="Arial" w:hAnsi="Arial"/>
-                <w:b w:val="false"/>
-                <w:bCs w:val="false"/>
-                <w:i w:val="false"/>
-                <w:iCs w:val="false"/>
-                <w:color w:val="000000"/>
-                <w:sz w:val="18"/>
-                <w:szCs w:val="18"/>
-              </w:rPr>
-              <w:t xml:space="preserve">Driving Question Board Revision (Metacognitive Progress Tracking): Revisiting the DQB at the end of each lesson makes learning growth visible and tangible. Distinguishing 'answered' from 'new' questions trains learners to recognise the iterative nature of scientific inquiry — answering one question always generates new ones. Public voting on new questions builds collective ownership of the inquiry and previews upcoming lessons with genuine learner-generated curiosity.</w:t>
-            </w:r>
-          </w:p>
-        </w:tc>
-        <w:tc>
-          <w:tcPr>
-            <w:tcW w:type="dxa" w:w="3040"/>
-            <w:shd w:fill="F2F2F2" w:color="auto" w:val="clear"/>
-            <w:tcMar>
-              <w:top w:type="dxa" w:w="60"/>
-              <w:left w:type="dxa" w:w="120"/>
-              <w:bottom w:type="dxa" w:w="60"/>
-              <w:right w:type="dxa" w:w="120"/>
-            </w:tcMar>
-            <w:vAlign w:val="top"/>
-          </w:tcPr>
-          <w:p>
-            <w:pPr>
-              <w:spacing w:after="40" w:before="0"/>
-              <w:jc w:val="left"/>
-            </w:pPr>
-            <w:r>
-              <w:rPr>
-                <w:rFonts w:ascii="Arial" w:cs="Arial" w:eastAsia="Arial" w:hAnsi="Arial"/>
-                <w:b w:val="false"/>
-                <w:bCs w:val="false"/>
-                <w:i w:val="false"/>
-                <w:iCs w:val="false"/>
-                <w:color w:val="000000"/>
-                <w:sz w:val="18"/>
-                <w:szCs w:val="18"/>
-              </w:rPr>
-              <w:t xml:space="preserve">Teacher photographs the DQB after sticky notes are placed. Observable indicators: (a) 'answered' notes reference molecular vocabulary from today (monomer, polymer, amino acid, peptide bond, glycosidic bond) — not just food names; (b) 'new question' notes are scientifically framed (begin with 'how,' 'why,' 'what happens when') rather than purely factual ('what is a protein'). Any learner whose 'answered' note is still at the food-name level (e.g. 'githeri has protein, ugali does not') is paired with a stronger peer for the model-building phase.</w:t>
-            </w:r>
-          </w:p>
-        </w:tc>
-      </w:tr>
-      <w:tr>
-        <w:tc>
-          <w:tcPr>
-            <w:tcW w:type="dxa" w:w="1520"/>
-            <w:shd w:fill="D5E8F0" w:color="auto" w:val="clear"/>
-            <w:tcMar>
-              <w:top w:type="dxa" w:w="60"/>
-              <w:left w:type="dxa" w:w="120"/>
-              <w:bottom w:type="dxa" w:w="60"/>
-              <w:right w:type="dxa" w:w="120"/>
-            </w:tcMar>
-            <w:vAlign w:val="top"/>
-          </w:tcPr>
-          <w:p>
-            <w:pPr>
-              <w:spacing w:after="40" w:before="0"/>
-              <w:jc w:val="left"/>
-            </w:pPr>
-            <w:r>
-              <w:rPr>
-                <w:rFonts w:ascii="Arial" w:cs="Arial" w:eastAsia="Arial" w:hAnsi="Arial"/>
-                <w:b/>
-                <w:bCs/>
-                <w:i w:val="false"/>
-                <w:iCs w:val="false"/>
-                <w:color w:val="000000"/>
-                <w:sz w:val="18"/>
-                <w:szCs w:val="18"/>
-              </w:rPr>
-              <w:t xml:space="preserve">Model Building Phase</w:t>
-            </w:r>
-          </w:p>
-          <w:p>
-            <w:pPr>
-              <w:spacing w:after="20" w:before="0"/>
-            </w:pPr>
-            <w:r>
-              <w:rPr>
-                <w:rFonts w:ascii="Arial" w:cs="Arial" w:eastAsia="Arial" w:hAnsi="Arial"/>
-                <w:b/>
-                <w:bCs/>
-                <w:color w:val="1F3864"/>
-                <w:sz w:val="16"/>
-                <w:szCs w:val="16"/>
-              </w:rPr>
-              <w:t xml:space="preserve">📹 VIDEO:</w:t>
-            </w:r>
-          </w:p>
-          <w:p>
-            <w:pPr>
-              <w:spacing w:after="20" w:before="0"/>
-            </w:pPr>
-            <w:hyperlink w:history="1" r:id="rIdo0w1ewzroonggrhefzb4i">
-              <w:r>
-                <w:rPr>
-                  <w:rFonts w:ascii="Arial" w:cs="Arial" w:eastAsia="Arial" w:hAnsi="Arial"/>
-                  <w:color w:val="2E75B6"/>
-                  <w:sz w:val="16"/>
-                  <w:szCs w:val="16"/>
-                  <w:u w:val="single" w:color="2E75B6"/>
-                </w:rPr>
-                <w:t xml:space="preserve">Dehydration synthesis or a condensation reaction</w:t>
-              </w:r>
-            </w:hyperlink>
-          </w:p>
-          <w:p>
-            <w:pPr>
-              <w:spacing w:after="10" w:before="0"/>
-              <w:ind w:left="120"/>
-            </w:pPr>
-            <w:r>
-              <w:rPr>
-                <w:rFonts w:ascii="Arial" w:cs="Arial" w:eastAsia="Arial" w:hAnsi="Arial"/>
-                <w:color w:val="595959"/>
-                <w:sz w:val="14"/>
-                <w:szCs w:val="14"/>
-              </w:rPr>
-              <w:t xml:space="preserve">Source: Khan Academy (English - US curriculum)</w:t>
-            </w:r>
-          </w:p>
-          <w:p>
-            <w:pPr>
-              <w:spacing w:after="10" w:before="0"/>
-              <w:ind w:left="120"/>
-            </w:pPr>
-            <w:hyperlink w:history="1" r:id="rIdn_vfe6eq16ycccshg4q48">
-              <w:r>
-                <w:rPr>
-                  <w:rFonts w:ascii="Arial" w:cs="Arial" w:eastAsia="Arial" w:hAnsi="Arial"/>
-                  <w:color w:val="595959"/>
-                  <w:sz w:val="14"/>
-                  <w:szCs w:val="14"/>
-                  <w:u w:val="single" w:color="595959"/>
-                </w:rPr>
-                <w:t xml:space="preserve">🔍 Search ARES for similar videos</w:t>
-              </w:r>
-            </w:hyperlink>
-          </w:p>
-          <w:p>
-            <w:pPr>
-              <w:spacing w:after="40" w:before="0"/>
-            </w:pPr>
-            <w:r>
-              <w:rPr>
-                <w:sz w:val="14"/>
-                <w:szCs w:val="14"/>
-              </w:rPr>
-              <w:t xml:space="preserve"/>
-            </w:r>
-          </w:p>
-          <w:p>
-            <w:pPr>
-              <w:spacing w:after="20" w:before="0"/>
-            </w:pPr>
-            <w:r>
-              <w:rPr>
-                <w:rFonts w:ascii="Arial" w:cs="Arial" w:eastAsia="Arial" w:hAnsi="Arial"/>
-                <w:b/>
-                <w:bCs/>
-                <w:color w:val="1F3864"/>
-                <w:sz w:val="16"/>
-                <w:szCs w:val="16"/>
-              </w:rPr>
-              <w:t xml:space="preserve">📖 HTML:</w:t>
-            </w:r>
-          </w:p>
-          <w:p>
-            <w:pPr>
-              <w:spacing w:after="20" w:before="0"/>
-            </w:pPr>
-            <w:hyperlink w:history="1" r:id="rIdjlmk_csllqur7cmwqwkrg">
-              <w:r>
-                <w:rPr>
-                  <w:rFonts w:ascii="Arial" w:cs="Arial" w:eastAsia="Arial" w:hAnsi="Arial"/>
-                  <w:color w:val="2E75B6"/>
-                  <w:sz w:val="16"/>
-                  <w:szCs w:val="16"/>
-                  <w:u w:val="single" w:color="2E75B6"/>
-                </w:rPr>
-                <w:t xml:space="preserve">DNA to RNA to Protein (PLIX)</w:t>
-              </w:r>
-            </w:hyperlink>
-          </w:p>
-          <w:p>
-            <w:pPr>
-              <w:spacing w:after="10" w:before="0"/>
-              <w:ind w:left="120"/>
-            </w:pPr>
-            <w:r>
-              <w:rPr>
-                <w:rFonts w:ascii="Arial" w:cs="Arial" w:eastAsia="Arial" w:hAnsi="Arial"/>
-                <w:color w:val="595959"/>
-                <w:sz w:val="14"/>
-                <w:szCs w:val="14"/>
-              </w:rPr>
-              <w:t xml:space="preserve">Source: CK-12</w:t>
-            </w:r>
-          </w:p>
-          <w:p>
-            <w:pPr>
-              <w:spacing w:after="10" w:before="0"/>
-              <w:ind w:left="120"/>
-            </w:pPr>
-            <w:hyperlink w:history="1" r:id="rIdyfrjlgapnqm_raywquqfi">
+            <w:hyperlink w:history="1" r:id="rIdnd4kuspan7ayd3kbivpsg">
               <w:r>
                 <w:rPr>
                   <w:rFonts w:ascii="Arial" w:cs="Arial" w:eastAsia="Arial" w:hAnsi="Arial"/>
@@ -15881,7 +15881,7 @@
             <w:pPr>
               <w:spacing w:after="20" w:before="0"/>
             </w:pPr>
-            <w:hyperlink w:history="1" r:id="rIdvabd8jdizev-swtskbsra">
+            <w:hyperlink w:history="1" r:id="rIdqj4yq6mhctuq0a9l6ab-n">
               <w:r>
                 <w:rPr>
                   <w:rFonts w:ascii="Arial" w:cs="Arial" w:eastAsia="Arial" w:hAnsi="Arial"/>
@@ -15890,7 +15890,7 @@
                   <w:szCs w:val="16"/>
                   <w:u w:val="single" w:color="2E75B6"/>
                 </w:rPr>
-                <w:t xml:space="preserve">Dehydration synthesis or a condensation reaction</w:t>
+                <w:t xml:space="preserve">Introduction to proteins and amino acids</w:t>
               </w:r>
             </w:hyperlink>
           </w:p>
@@ -15914,7 +15914,7 @@
               <w:spacing w:after="10" w:before="0"/>
               <w:ind w:left="120"/>
             </w:pPr>
-            <w:hyperlink w:history="1" r:id="rIdruabmbzdxi9qio29fzo6u">
+            <w:hyperlink w:history="1" r:id="rIdudzozapl5dk_ojaz6a09y">
               <w:r>
                 <w:rPr>
                   <w:rFonts w:ascii="Arial" w:cs="Arial" w:eastAsia="Arial" w:hAnsi="Arial"/>
@@ -15952,14 +15952,14 @@
                 <w:sz w:val="16"/>
                 <w:szCs w:val="16"/>
               </w:rPr>
-              <w:t xml:space="preserve">📖 HTML:</w:t>
+              <w:t xml:space="preserve">📖 EXERCISE:</w:t>
             </w:r>
           </w:p>
           <w:p>
             <w:pPr>
               <w:spacing w:after="20" w:before="0"/>
             </w:pPr>
-            <w:hyperlink w:history="1" r:id="rIdxo9axic3lxsrl7a-khnmx">
+            <w:hyperlink w:history="1" r:id="rIdouwrrnlvptvvum3azzhwn">
               <w:r>
                 <w:rPr>
                   <w:rFonts w:ascii="Arial" w:cs="Arial" w:eastAsia="Arial" w:hAnsi="Arial"/>
@@ -15968,7 +15968,7 @@
                   <w:szCs w:val="16"/>
                   <w:u w:val="single" w:color="2E75B6"/>
                 </w:rPr>
-                <w:t xml:space="preserve">Bacterial Diseases - Advanced (Flexbook)</w:t>
+                <w:t xml:space="preserve">Proteins</w:t>
               </w:r>
             </w:hyperlink>
           </w:p>
@@ -15984,7 +15984,7 @@
                 <w:sz w:val="14"/>
                 <w:szCs w:val="14"/>
               </w:rPr>
-              <w:t xml:space="preserve">Source: CK-12</w:t>
+              <w:t xml:space="preserve">Source: Khan Academy (English - US curriculum)</w:t>
             </w:r>
           </w:p>
           <w:p>
@@ -15992,7 +15992,7 @@
               <w:spacing w:after="10" w:before="0"/>
               <w:ind w:left="120"/>
             </w:pPr>
-            <w:hyperlink w:history="1" r:id="rIdmgjgdgzp75yezqq5tbsja">
+            <w:hyperlink w:history="1" r:id="rIdamm6fvmzhjgsvelb-2ipk">
               <w:r>
                 <w:rPr>
                   <w:rFonts w:ascii="Arial" w:cs="Arial" w:eastAsia="Arial" w:hAnsi="Arial"/>
@@ -16187,7 +16187,7 @@
             <w:pPr>
               <w:spacing w:after="20" w:before="0"/>
             </w:pPr>
-            <w:hyperlink w:history="1" r:id="rIdaeg1ddp00yvi_cb11jcls">
+            <w:hyperlink w:history="1" r:id="rIdxka05wzsoye0lnbefi7ze">
               <w:r>
                 <w:rPr>
                   <w:rFonts w:ascii="Arial" w:cs="Arial" w:eastAsia="Arial" w:hAnsi="Arial"/>
@@ -16196,7 +16196,7 @@
                   <w:szCs w:val="16"/>
                   <w:u w:val="single" w:color="2E75B6"/>
                 </w:rPr>
-                <w:t xml:space="preserve">Dehydration synthesis or a condensation reaction</w:t>
+                <w:t xml:space="preserve">Translation (mRNA to protein)</w:t>
               </w:r>
             </w:hyperlink>
           </w:p>
@@ -16220,7 +16220,7 @@
               <w:spacing w:after="10" w:before="0"/>
               <w:ind w:left="120"/>
             </w:pPr>
-            <w:hyperlink w:history="1" r:id="rIduniqkrnawmpli6oirwk3e">
+            <w:hyperlink w:history="1" r:id="rIdeo9fla_1itlpbsp3wsbea">
               <w:r>
                 <w:rPr>
                   <w:rFonts w:ascii="Arial" w:cs="Arial" w:eastAsia="Arial" w:hAnsi="Arial"/>
@@ -16258,14 +16258,14 @@
                 <w:sz w:val="16"/>
                 <w:szCs w:val="16"/>
               </w:rPr>
-              <w:t xml:space="preserve">📖 HTML:</w:t>
+              <w:t xml:space="preserve">📖 EXERCISE:</w:t>
             </w:r>
           </w:p>
           <w:p>
             <w:pPr>
               <w:spacing w:after="20" w:before="0"/>
             </w:pPr>
-            <w:hyperlink w:history="1" r:id="rIdh2-urmleoiwh-h96szpqo">
+            <w:hyperlink w:history="1" r:id="rIdce9-skbg-btza7a0ugytw">
               <w:r>
                 <w:rPr>
                   <w:rFonts w:ascii="Arial" w:cs="Arial" w:eastAsia="Arial" w:hAnsi="Arial"/>
@@ -16274,7 +16274,7 @@
                   <w:szCs w:val="16"/>
                   <w:u w:val="single" w:color="2E75B6"/>
                 </w:rPr>
-                <w:t xml:space="preserve">Bacterial Diseases - Advanced (Flexbook)</w:t>
+                <w:t xml:space="preserve">Transcription and translation</w:t>
               </w:r>
             </w:hyperlink>
           </w:p>
@@ -16290,7 +16290,7 @@
                 <w:sz w:val="14"/>
                 <w:szCs w:val="14"/>
               </w:rPr>
-              <w:t xml:space="preserve">Source: CK-12</w:t>
+              <w:t xml:space="preserve">Source: Khan Academy (English - US curriculum)</w:t>
             </w:r>
           </w:p>
           <w:p>
@@ -16298,7 +16298,7 @@
               <w:spacing w:after="10" w:before="0"/>
               <w:ind w:left="120"/>
             </w:pPr>
-            <w:hyperlink w:history="1" r:id="rId5aufu8e-3sza-ameyoro2">
+            <w:hyperlink w:history="1" r:id="rId9pscsoj5spx81g4xcazht">
               <w:r>
                 <w:rPr>
                   <w:rFonts w:ascii="Arial" w:cs="Arial" w:eastAsia="Arial" w:hAnsi="Arial"/>
@@ -16493,7 +16493,7 @@
             <w:pPr>
               <w:spacing w:after="20" w:before="0"/>
             </w:pPr>
-            <w:hyperlink w:history="1" r:id="rIdwakvfujhhomfff2oodyo9">
+            <w:hyperlink w:history="1" r:id="rIdzvfo8qws4wqvemo5cugys">
               <w:r>
                 <w:rPr>
                   <w:rFonts w:ascii="Arial" w:cs="Arial" w:eastAsia="Arial" w:hAnsi="Arial"/>
@@ -16502,7 +16502,7 @@
                   <w:szCs w:val="16"/>
                   <w:u w:val="single" w:color="2E75B6"/>
                 </w:rPr>
-                <w:t xml:space="preserve">Dehydration synthesis or a condensation reaction</w:t>
+                <w:t xml:space="preserve">Introduction to proteins and amino acids</w:t>
               </w:r>
             </w:hyperlink>
           </w:p>
@@ -16526,7 +16526,7 @@
               <w:spacing w:after="10" w:before="0"/>
               <w:ind w:left="120"/>
             </w:pPr>
-            <w:hyperlink w:history="1" r:id="rIdwgc7abogfsrfiyfxrknfp">
+            <w:hyperlink w:history="1" r:id="rId4zy7ypx6cinmkf6q486db">
               <w:r>
                 <w:rPr>
                   <w:rFonts w:ascii="Arial" w:cs="Arial" w:eastAsia="Arial" w:hAnsi="Arial"/>
@@ -16564,14 +16564,14 @@
                 <w:sz w:val="16"/>
                 <w:szCs w:val="16"/>
               </w:rPr>
-              <w:t xml:space="preserve">📖 HTML:</w:t>
+              <w:t xml:space="preserve">📖 EXERCISE:</w:t>
             </w:r>
           </w:p>
           <w:p>
             <w:pPr>
               <w:spacing w:after="20" w:before="0"/>
             </w:pPr>
-            <w:hyperlink w:history="1" r:id="rId0kq35vbhgr4drm3dt5ftn">
+            <w:hyperlink w:history="1" r:id="rIdbot6kvfmeqdwnfbpzjkqe">
               <w:r>
                 <w:rPr>
                   <w:rFonts w:ascii="Arial" w:cs="Arial" w:eastAsia="Arial" w:hAnsi="Arial"/>
@@ -16580,7 +16580,7 @@
                   <w:szCs w:val="16"/>
                   <w:u w:val="single" w:color="2E75B6"/>
                 </w:rPr>
-                <w:t xml:space="preserve">Bacterial Diseases - Advanced (Flexbook)</w:t>
+                <w:t xml:space="preserve">Proteins</w:t>
               </w:r>
             </w:hyperlink>
           </w:p>
@@ -16596,7 +16596,7 @@
                 <w:sz w:val="14"/>
                 <w:szCs w:val="14"/>
               </w:rPr>
-              <w:t xml:space="preserve">Source: CK-12</w:t>
+              <w:t xml:space="preserve">Source: Khan Academy (English - US curriculum)</w:t>
             </w:r>
           </w:p>
           <w:p>
@@ -16604,7 +16604,7 @@
               <w:spacing w:after="10" w:before="0"/>
               <w:ind w:left="120"/>
             </w:pPr>
-            <w:hyperlink w:history="1" r:id="rIdgyz8a1-rszqmxercna0b-">
+            <w:hyperlink w:history="1" r:id="rId39jxlwn5dhlak8hfuujwe">
               <w:r>
                 <w:rPr>
                   <w:rFonts w:ascii="Arial" w:cs="Arial" w:eastAsia="Arial" w:hAnsi="Arial"/>
@@ -16799,7 +16799,7 @@
             <w:pPr>
               <w:spacing w:after="20" w:before="0"/>
             </w:pPr>
-            <w:hyperlink w:history="1" r:id="rIdvletsynkmy-ium-ny1-u7">
+            <w:hyperlink w:history="1" r:id="rIdclxiadoxlz3mbipbttyiz">
               <w:r>
                 <w:rPr>
                   <w:rFonts w:ascii="Arial" w:cs="Arial" w:eastAsia="Arial" w:hAnsi="Arial"/>
@@ -16808,7 +16808,7 @@
                   <w:szCs w:val="16"/>
                   <w:u w:val="single" w:color="2E75B6"/>
                 </w:rPr>
-                <w:t xml:space="preserve">Dehydration synthesis or a condensation reaction</w:t>
+                <w:t xml:space="preserve">Introduction to proteins and amino acids</w:t>
               </w:r>
             </w:hyperlink>
           </w:p>
@@ -16832,7 +16832,7 @@
               <w:spacing w:after="10" w:before="0"/>
               <w:ind w:left="120"/>
             </w:pPr>
-            <w:hyperlink w:history="1" r:id="rIdynqeutilsufyiwebcob9r">
+            <w:hyperlink w:history="1" r:id="rIdfaffogzhcelbnwy2xe3oy">
               <w:r>
                 <w:rPr>
                   <w:rFonts w:ascii="Arial" w:cs="Arial" w:eastAsia="Arial" w:hAnsi="Arial"/>
@@ -16870,14 +16870,14 @@
                 <w:sz w:val="16"/>
                 <w:szCs w:val="16"/>
               </w:rPr>
-              <w:t xml:space="preserve">📖 HTML:</w:t>
+              <w:t xml:space="preserve">📖 EXERCISE:</w:t>
             </w:r>
           </w:p>
           <w:p>
             <w:pPr>
               <w:spacing w:after="20" w:before="0"/>
             </w:pPr>
-            <w:hyperlink w:history="1" r:id="rIdsvyvjm28ezuvw8csjpwbb">
+            <w:hyperlink w:history="1" r:id="rIdd-xchjvhtz5woe3ly6emi">
               <w:r>
                 <w:rPr>
                   <w:rFonts w:ascii="Arial" w:cs="Arial" w:eastAsia="Arial" w:hAnsi="Arial"/>
@@ -16886,7 +16886,7 @@
                   <w:szCs w:val="16"/>
                   <w:u w:val="single" w:color="2E75B6"/>
                 </w:rPr>
-                <w:t xml:space="preserve">Bacterial Diseases - Advanced (Flexbook)</w:t>
+                <w:t xml:space="preserve">Proteins</w:t>
               </w:r>
             </w:hyperlink>
           </w:p>
@@ -16902,7 +16902,7 @@
                 <w:sz w:val="14"/>
                 <w:szCs w:val="14"/>
               </w:rPr>
-              <w:t xml:space="preserve">Source: CK-12</w:t>
+              <w:t xml:space="preserve">Source: Khan Academy (English - US curriculum)</w:t>
             </w:r>
           </w:p>
           <w:p>
@@ -16910,7 +16910,7 @@
               <w:spacing w:after="10" w:before="0"/>
               <w:ind w:left="120"/>
             </w:pPr>
-            <w:hyperlink w:history="1" r:id="rIdiqa_x6d6sx-ejhvuayrge">
+            <w:hyperlink w:history="1" r:id="rIdcsgi1qeun_caupazmuaoi">
               <w:r>
                 <w:rPr>
                   <w:rFonts w:ascii="Arial" w:cs="Arial" w:eastAsia="Arial" w:hAnsi="Arial"/>
@@ -17105,7 +17105,7 @@
             <w:pPr>
               <w:spacing w:after="20" w:before="0"/>
             </w:pPr>
-            <w:hyperlink w:history="1" r:id="rIdd_widg_3y8g3a99gnjtz5">
+            <w:hyperlink w:history="1" r:id="rIdoq73rwjnxx0wu1rbkipba">
               <w:r>
                 <w:rPr>
                   <w:rFonts w:ascii="Arial" w:cs="Arial" w:eastAsia="Arial" w:hAnsi="Arial"/>
@@ -17114,7 +17114,7 @@
                   <w:szCs w:val="16"/>
                   <w:u w:val="single" w:color="2E75B6"/>
                 </w:rPr>
-                <w:t xml:space="preserve">Dehydration synthesis or a condensation reaction</w:t>
+                <w:t xml:space="preserve">Introduction to proteins and amino acids</w:t>
               </w:r>
             </w:hyperlink>
           </w:p>
@@ -17138,7 +17138,7 @@
               <w:spacing w:after="10" w:before="0"/>
               <w:ind w:left="120"/>
             </w:pPr>
-            <w:hyperlink w:history="1" r:id="rIdzywvonz5fdjlcszogmzdk">
+            <w:hyperlink w:history="1" r:id="rIdcomr8awqeriqj1rpxmhbq">
               <w:r>
                 <w:rPr>
                   <w:rFonts w:ascii="Arial" w:cs="Arial" w:eastAsia="Arial" w:hAnsi="Arial"/>
@@ -17176,14 +17176,14 @@
                 <w:sz w:val="16"/>
                 <w:szCs w:val="16"/>
               </w:rPr>
-              <w:t xml:space="preserve">📖 HTML:</w:t>
+              <w:t xml:space="preserve">📖 EXERCISE:</w:t>
             </w:r>
           </w:p>
           <w:p>
             <w:pPr>
               <w:spacing w:after="20" w:before="0"/>
             </w:pPr>
-            <w:hyperlink w:history="1" r:id="rId4myt82doh01i4lfohuvl8">
+            <w:hyperlink w:history="1" r:id="rIdx31utfvsi3almcnwwx5v3">
               <w:r>
                 <w:rPr>
                   <w:rFonts w:ascii="Arial" w:cs="Arial" w:eastAsia="Arial" w:hAnsi="Arial"/>
@@ -17192,7 +17192,7 @@
                   <w:szCs w:val="16"/>
                   <w:u w:val="single" w:color="2E75B6"/>
                 </w:rPr>
-                <w:t xml:space="preserve">Bacterial Diseases - Advanced (Flexbook)</w:t>
+                <w:t xml:space="preserve">Proteins</w:t>
               </w:r>
             </w:hyperlink>
           </w:p>
@@ -17208,7 +17208,7 @@
                 <w:sz w:val="14"/>
                 <w:szCs w:val="14"/>
               </w:rPr>
-              <w:t xml:space="preserve">Source: CK-12</w:t>
+              <w:t xml:space="preserve">Source: Khan Academy (English - US curriculum)</w:t>
             </w:r>
           </w:p>
           <w:p>
@@ -17216,7 +17216,7 @@
               <w:spacing w:after="10" w:before="0"/>
               <w:ind w:left="120"/>
             </w:pPr>
-            <w:hyperlink w:history="1" r:id="rIdvdh7zm4owr9jriby_kg9t">
+            <w:hyperlink w:history="1" r:id="rIdc3sb7uwshl5gnmzbwewci">
               <w:r>
                 <w:rPr>
                   <w:rFonts w:ascii="Arial" w:cs="Arial" w:eastAsia="Arial" w:hAnsi="Arial"/>
@@ -18703,7 +18703,7 @@
             <w:pPr>
               <w:spacing w:after="20" w:before="0"/>
             </w:pPr>
-            <w:hyperlink w:history="1" r:id="rIdkfqelmrjxhces01hsduyn">
+            <w:hyperlink w:history="1" r:id="rIdaotdmhos_3psilb4grmmn">
               <w:r>
                 <w:rPr>
                   <w:rFonts w:ascii="Arial" w:cs="Arial" w:eastAsia="Arial" w:hAnsi="Arial"/>
@@ -18712,7 +18712,7 @@
                   <w:szCs w:val="16"/>
                   <w:u w:val="single" w:color="2E75B6"/>
                 </w:rPr>
-                <w:t xml:space="preserve">Dehydration synthesis or a condensation reaction</w:t>
+                <w:t xml:space="preserve">Introduction to vitamins and minerals</w:t>
               </w:r>
             </w:hyperlink>
           </w:p>
@@ -18736,7 +18736,7 @@
               <w:spacing w:after="10" w:before="0"/>
               <w:ind w:left="120"/>
             </w:pPr>
-            <w:hyperlink w:history="1" r:id="rIduhuoe5jppj0xolgt5kilg">
+            <w:hyperlink w:history="1" r:id="rIdyg_vewzm7lvvdd1xpvkrp">
               <w:r>
                 <w:rPr>
                   <w:rFonts w:ascii="Arial" w:cs="Arial" w:eastAsia="Arial" w:hAnsi="Arial"/>
@@ -18774,14 +18774,14 @@
                 <w:sz w:val="16"/>
                 <w:szCs w:val="16"/>
               </w:rPr>
-              <w:t xml:space="preserve">📖 PDF:</w:t>
+              <w:t xml:space="preserve">📖 HTML:</w:t>
             </w:r>
           </w:p>
           <w:p>
             <w:pPr>
               <w:spacing w:after="20" w:before="0"/>
             </w:pPr>
-            <w:hyperlink w:history="1" r:id="rIdebbro9by_lnxvsbtdksaf">
+            <w:hyperlink w:history="1" r:id="rIddu3abkggfvf50ri031fw4">
               <w:r>
                 <w:rPr>
                   <w:rFonts w:ascii="Arial" w:cs="Arial" w:eastAsia="Arial" w:hAnsi="Arial"/>
@@ -18790,7 +18790,7 @@
                   <w:szCs w:val="16"/>
                   <w:u w:val="single" w:color="2E75B6"/>
                 </w:rPr>
-                <w:t xml:space="preserve">Meet the Family: Inv..:Segment 6 Single Letter Codes and DNA Codons for Amino Acids</w:t>
+                <w:t xml:space="preserve">Vitamins and Minerals (Flexbook)</w:t>
               </w:r>
             </w:hyperlink>
           </w:p>
@@ -18806,7 +18806,7 @@
                 <w:sz w:val="14"/>
                 <w:szCs w:val="14"/>
               </w:rPr>
-              <w:t xml:space="preserve">Source: MIT Blossoms</w:t>
+              <w:t xml:space="preserve">Source: CK-12</w:t>
             </w:r>
           </w:p>
           <w:p>
@@ -18814,7 +18814,7 @@
               <w:spacing w:after="10" w:before="0"/>
               <w:ind w:left="120"/>
             </w:pPr>
-            <w:hyperlink w:history="1" r:id="rIduvnkjuxc__mojj9ditbeq">
+            <w:hyperlink w:history="1" r:id="rIdgqlhx7bboutmwcjtfups_">
               <w:r>
                 <w:rPr>
                   <w:rFonts w:ascii="Arial" w:cs="Arial" w:eastAsia="Arial" w:hAnsi="Arial"/>
@@ -19009,7 +19009,7 @@
             <w:pPr>
               <w:spacing w:after="20" w:before="0"/>
             </w:pPr>
-            <w:hyperlink w:history="1" r:id="rIdqdshbaub1d35jig0gdvib">
+            <w:hyperlink w:history="1" r:id="rIdtih9opcdubox514u2qnkd">
               <w:r>
                 <w:rPr>
                   <w:rFonts w:ascii="Arial" w:cs="Arial" w:eastAsia="Arial" w:hAnsi="Arial"/>
@@ -19018,7 +19018,7 @@
                   <w:szCs w:val="16"/>
                   <w:u w:val="single" w:color="2E75B6"/>
                 </w:rPr>
-                <w:t xml:space="preserve">Dehydration synthesis or a condensation reaction</w:t>
+                <w:t xml:space="preserve">Photosynthesis</w:t>
               </w:r>
             </w:hyperlink>
           </w:p>
@@ -19042,7 +19042,7 @@
               <w:spacing w:after="10" w:before="0"/>
               <w:ind w:left="120"/>
             </w:pPr>
-            <w:hyperlink w:history="1" r:id="rIddo_s1pplkdaa_hjodb8u9">
+            <w:hyperlink w:history="1" r:id="rIdrqythjlidvnbtqozgx0fw">
               <w:r>
                 <w:rPr>
                   <w:rFonts w:ascii="Arial" w:cs="Arial" w:eastAsia="Arial" w:hAnsi="Arial"/>
@@ -19080,14 +19080,14 @@
                 <w:sz w:val="16"/>
                 <w:szCs w:val="16"/>
               </w:rPr>
-              <w:t xml:space="preserve">📖 PDF:</w:t>
+              <w:t xml:space="preserve">📖 EXERCISE:</w:t>
             </w:r>
           </w:p>
           <w:p>
             <w:pPr>
               <w:spacing w:after="20" w:before="0"/>
             </w:pPr>
-            <w:hyperlink w:history="1" r:id="rIdnyx9m7ysuc7snd3radgel">
+            <w:hyperlink w:history="1" r:id="rIdi4c9gomgpt-0mvmbpfops">
               <w:r>
                 <w:rPr>
                   <w:rFonts w:ascii="Arial" w:cs="Arial" w:eastAsia="Arial" w:hAnsi="Arial"/>
@@ -19096,7 +19096,7 @@
                   <w:szCs w:val="16"/>
                   <w:u w:val="single" w:color="2E75B6"/>
                 </w:rPr>
-                <w:t xml:space="preserve">Meet the Family: Inv..:Segment 6 Single Letter Codes and DNA Codons for Amino Acids</w:t>
+                <w:t xml:space="preserve">Vitamins and Minerals Practice</w:t>
               </w:r>
             </w:hyperlink>
           </w:p>
@@ -19112,7 +19112,7 @@
                 <w:sz w:val="14"/>
                 <w:szCs w:val="14"/>
               </w:rPr>
-              <w:t xml:space="preserve">Source: MIT Blossoms</w:t>
+              <w:t xml:space="preserve">Source: CK-12</w:t>
             </w:r>
           </w:p>
           <w:p>
@@ -19120,7 +19120,7 @@
               <w:spacing w:after="10" w:before="0"/>
               <w:ind w:left="120"/>
             </w:pPr>
-            <w:hyperlink w:history="1" r:id="rIdf9_6a3l_xk0rucdo5d6rl">
+            <w:hyperlink w:history="1" r:id="rIduhta-ncwom_8utbd_kvof">
               <w:r>
                 <w:rPr>
                   <w:rFonts w:ascii="Arial" w:cs="Arial" w:eastAsia="Arial" w:hAnsi="Arial"/>
@@ -19315,7 +19315,7 @@
             <w:pPr>
               <w:spacing w:after="20" w:before="0"/>
             </w:pPr>
-            <w:hyperlink w:history="1" r:id="rId-o2xw1ee2x9bbexpxpq0o">
+            <w:hyperlink w:history="1" r:id="rIdi_hyfss5yltlsyb1duta_">
               <w:r>
                 <w:rPr>
                   <w:rFonts w:ascii="Arial" w:cs="Arial" w:eastAsia="Arial" w:hAnsi="Arial"/>
@@ -19324,7 +19324,7 @@
                   <w:szCs w:val="16"/>
                   <w:u w:val="single" w:color="2E75B6"/>
                 </w:rPr>
-                <w:t xml:space="preserve">Dehydration synthesis or a condensation reaction</w:t>
+                <w:t xml:space="preserve">Scale of cells</w:t>
               </w:r>
             </w:hyperlink>
           </w:p>
@@ -19348,7 +19348,7 @@
               <w:spacing w:after="10" w:before="0"/>
               <w:ind w:left="120"/>
             </w:pPr>
-            <w:hyperlink w:history="1" r:id="rIdiekj8wnbzfpdh9opr88t8">
+            <w:hyperlink w:history="1" r:id="rId6wqqe73leouyy-nebrrsb">
               <w:r>
                 <w:rPr>
                   <w:rFonts w:ascii="Arial" w:cs="Arial" w:eastAsia="Arial" w:hAnsi="Arial"/>
@@ -19386,14 +19386,14 @@
                 <w:sz w:val="16"/>
                 <w:szCs w:val="16"/>
               </w:rPr>
-              <w:t xml:space="preserve">📖 PDF:</w:t>
+              <w:t xml:space="preserve">📖 HTML:</w:t>
             </w:r>
           </w:p>
           <w:p>
             <w:pPr>
               <w:spacing w:after="20" w:before="0"/>
             </w:pPr>
-            <w:hyperlink w:history="1" r:id="rIddm5fo4hchzsnnhklxuluj">
+            <w:hyperlink w:history="1" r:id="rIdkdfllb0pa6oj91e2ab_kx">
               <w:r>
                 <w:rPr>
                   <w:rFonts w:ascii="Arial" w:cs="Arial" w:eastAsia="Arial" w:hAnsi="Arial"/>
@@ -19402,7 +19402,7 @@
                   <w:szCs w:val="16"/>
                   <w:u w:val="single" w:color="2E75B6"/>
                 </w:rPr>
-                <w:t xml:space="preserve">Meet the Family: Inv..:Segment 6 Single Letter Codes and DNA Codons for Amino Acids</w:t>
+                <w:t xml:space="preserve">Vitamins and Minerals - Advanced (Flexbook)</w:t>
               </w:r>
             </w:hyperlink>
           </w:p>
@@ -19418,7 +19418,7 @@
                 <w:sz w:val="14"/>
                 <w:szCs w:val="14"/>
               </w:rPr>
-              <w:t xml:space="preserve">Source: MIT Blossoms</w:t>
+              <w:t xml:space="preserve">Source: CK-12</w:t>
             </w:r>
           </w:p>
           <w:p>
@@ -19426,7 +19426,7 @@
               <w:spacing w:after="10" w:before="0"/>
               <w:ind w:left="120"/>
             </w:pPr>
-            <w:hyperlink w:history="1" r:id="rId2o36b14nb1_m1cijnwf8e">
+            <w:hyperlink w:history="1" r:id="rIdkxr8g_8f1y9uss_r2nkyb">
               <w:r>
                 <w:rPr>
                   <w:rFonts w:ascii="Arial" w:cs="Arial" w:eastAsia="Arial" w:hAnsi="Arial"/>
@@ -19621,7 +19621,7 @@
             <w:pPr>
               <w:spacing w:after="20" w:before="0"/>
             </w:pPr>
-            <w:hyperlink w:history="1" r:id="rIdq3kxr8fbrzlpnzonfqn4a">
+            <w:hyperlink w:history="1" r:id="rIdz10vgmpcvsge30wnr_e-u">
               <w:r>
                 <w:rPr>
                   <w:rFonts w:ascii="Arial" w:cs="Arial" w:eastAsia="Arial" w:hAnsi="Arial"/>
@@ -19630,7 +19630,7 @@
                   <w:szCs w:val="16"/>
                   <w:u w:val="single" w:color="2E75B6"/>
                 </w:rPr>
-                <w:t xml:space="preserve">Dehydration synthesis or a condensation reaction</w:t>
+                <w:t xml:space="preserve">Introduction to vitamins and minerals</w:t>
               </w:r>
             </w:hyperlink>
           </w:p>
@@ -19654,7 +19654,7 @@
               <w:spacing w:after="10" w:before="0"/>
               <w:ind w:left="120"/>
             </w:pPr>
-            <w:hyperlink w:history="1" r:id="rIds_vfrng3loyixxkn-8k1c">
+            <w:hyperlink w:history="1" r:id="rId0h-23la9e4oeacsotybd4">
               <w:r>
                 <w:rPr>
                   <w:rFonts w:ascii="Arial" w:cs="Arial" w:eastAsia="Arial" w:hAnsi="Arial"/>
@@ -19692,14 +19692,14 @@
                 <w:sz w:val="16"/>
                 <w:szCs w:val="16"/>
               </w:rPr>
-              <w:t xml:space="preserve">📖 PDF:</w:t>
+              <w:t xml:space="preserve">📖 HTML:</w:t>
             </w:r>
           </w:p>
           <w:p>
             <w:pPr>
               <w:spacing w:after="20" w:before="0"/>
             </w:pPr>
-            <w:hyperlink w:history="1" r:id="rIdl87ggb7x4lzcerv2achrh">
+            <w:hyperlink w:history="1" r:id="rIdeffcegnk2tlfpkfkb_vu8">
               <w:r>
                 <w:rPr>
                   <w:rFonts w:ascii="Arial" w:cs="Arial" w:eastAsia="Arial" w:hAnsi="Arial"/>
@@ -19708,7 +19708,7 @@
                   <w:szCs w:val="16"/>
                   <w:u w:val="single" w:color="2E75B6"/>
                 </w:rPr>
-                <w:t xml:space="preserve">Meet the Family: Inv..:Segment 6 Single Letter Codes and DNA Codons for Amino Acids</w:t>
+                <w:t xml:space="preserve">Vitamins and Minerals (Flexbook)</w:t>
               </w:r>
             </w:hyperlink>
           </w:p>
@@ -19724,7 +19724,7 @@
                 <w:sz w:val="14"/>
                 <w:szCs w:val="14"/>
               </w:rPr>
-              <w:t xml:space="preserve">Source: MIT Blossoms</w:t>
+              <w:t xml:space="preserve">Source: CK-12</w:t>
             </w:r>
           </w:p>
           <w:p>
@@ -19732,7 +19732,7 @@
               <w:spacing w:after="10" w:before="0"/>
               <w:ind w:left="120"/>
             </w:pPr>
-            <w:hyperlink w:history="1" r:id="rIdw222je2saidd4ymf7hr65">
+            <w:hyperlink w:history="1" r:id="rId6axdoi-q_fm4kamsynpam">
               <w:r>
                 <w:rPr>
                   <w:rFonts w:ascii="Arial" w:cs="Arial" w:eastAsia="Arial" w:hAnsi="Arial"/>
@@ -19927,7 +19927,7 @@
             <w:pPr>
               <w:spacing w:after="20" w:before="0"/>
             </w:pPr>
-            <w:hyperlink w:history="1" r:id="rId5p2n3rchvfqrcb_5xvhaq">
+            <w:hyperlink w:history="1" r:id="rId6yde4hdxc28bczldpiuol">
               <w:r>
                 <w:rPr>
                   <w:rFonts w:ascii="Arial" w:cs="Arial" w:eastAsia="Arial" w:hAnsi="Arial"/>
@@ -19936,7 +19936,7 @@
                   <w:szCs w:val="16"/>
                   <w:u w:val="single" w:color="2E75B6"/>
                 </w:rPr>
-                <w:t xml:space="preserve">Dehydration synthesis or a condensation reaction</w:t>
+                <w:t xml:space="preserve">Introduction to vitamins and minerals</w:t>
               </w:r>
             </w:hyperlink>
           </w:p>
@@ -19960,7 +19960,7 @@
               <w:spacing w:after="10" w:before="0"/>
               <w:ind w:left="120"/>
             </w:pPr>
-            <w:hyperlink w:history="1" r:id="rId8gmlhyjxygkppzyyy93wa">
+            <w:hyperlink w:history="1" r:id="rIdlyf_3fgkv6xvomtciwkp4">
               <w:r>
                 <w:rPr>
                   <w:rFonts w:ascii="Arial" w:cs="Arial" w:eastAsia="Arial" w:hAnsi="Arial"/>
@@ -19998,14 +19998,14 @@
                 <w:sz w:val="16"/>
                 <w:szCs w:val="16"/>
               </w:rPr>
-              <w:t xml:space="preserve">📖 PDF:</w:t>
+              <w:t xml:space="preserve">📖 HTML:</w:t>
             </w:r>
           </w:p>
           <w:p>
             <w:pPr>
               <w:spacing w:after="20" w:before="0"/>
             </w:pPr>
-            <w:hyperlink w:history="1" r:id="rIdezma7a6sl2ueds5e7ngaa">
+            <w:hyperlink w:history="1" r:id="rIdpk7h5rn_7scr5pkky4nz2">
               <w:r>
                 <w:rPr>
                   <w:rFonts w:ascii="Arial" w:cs="Arial" w:eastAsia="Arial" w:hAnsi="Arial"/>
@@ -20014,7 +20014,7 @@
                   <w:szCs w:val="16"/>
                   <w:u w:val="single" w:color="2E75B6"/>
                 </w:rPr>
-                <w:t xml:space="preserve">Meet the Family: Inv..:Segment 6 Single Letter Codes and DNA Codons for Amino Acids</w:t>
+                <w:t xml:space="preserve">Vitamins and Minerals (Flexbook)</w:t>
               </w:r>
             </w:hyperlink>
           </w:p>
@@ -20030,7 +20030,7 @@
                 <w:sz w:val="14"/>
                 <w:szCs w:val="14"/>
               </w:rPr>
-              <w:t xml:space="preserve">Source: MIT Blossoms</w:t>
+              <w:t xml:space="preserve">Source: CK-12</w:t>
             </w:r>
           </w:p>
           <w:p>
@@ -20038,7 +20038,7 @@
               <w:spacing w:after="10" w:before="0"/>
               <w:ind w:left="120"/>
             </w:pPr>
-            <w:hyperlink w:history="1" r:id="rIdx1x2_qw-nof16svpmpyka">
+            <w:hyperlink w:history="1" r:id="rIdv7sq6k3ohiolbzhkadwu7">
               <w:r>
                 <w:rPr>
                   <w:rFonts w:ascii="Arial" w:cs="Arial" w:eastAsia="Arial" w:hAnsi="Arial"/>

</xml_diff>

<commit_message>
Phase 4: quiz pilot (22 lessons, batch) + cost estimate; 5-7 question default
Co-Authored-By: Claude Opus 5.5 (1M context) <noreply@anthropic.com>
</commit_message>
<xml_diff>
--- a/data/outputs/v2/Biology/SS1.2_Chemicals_of_Life/Biology_Chemicals_of_Life_CBE_LessonSequence.docx
+++ b/data/outputs/v2/Biology/SS1.2_Chemicals_of_Life/Biology_Chemicals_of_Life_CBE_LessonSequence.docx
@@ -42,6 +42,177 @@
     </w:p>
     <w:p>
       <w:pPr>
+        <w:spacing w:after="80" w:before="120"/>
+      </w:pPr>
+      <w:r>
+        <w:rPr>
+          <w:rFonts w:ascii="Arial" w:cs="Arial" w:eastAsia="Arial" w:hAnsi="Arial"/>
+          <w:b/>
+          <w:bCs/>
+          <w:color w:val="1F3864"/>
+          <w:sz w:val="20"/>
+          <w:szCs w:val="20"/>
+        </w:rPr>
+        <w:t xml:space="preserve">ATTRIBUTION AND LICENSING</w:t>
+      </w:r>
+    </w:p>
+    <w:p>
+      <w:pPr>
+        <w:spacing w:after="60" w:before="0"/>
+      </w:pPr>
+      <w:r>
+        <w:rPr>
+          <w:rFonts w:ascii="Arial" w:cs="Arial" w:eastAsia="Arial" w:hAnsi="Arial"/>
+          <w:b/>
+          <w:bCs/>
+          <w:sz w:val="17"/>
+          <w:szCs w:val="17"/>
+        </w:rPr>
+        <w:t xml:space="preserve">Curriculum Alignment: </w:t>
+      </w:r>
+      <w:r>
+        <w:rPr>
+          <w:rFonts w:ascii="Arial" w:cs="Arial" w:eastAsia="Arial" w:hAnsi="Arial"/>
+          <w:sz w:val="17"/>
+          <w:szCs w:val="17"/>
+        </w:rPr>
+        <w:t xml:space="preserve">Structured in pedagogical alignment with the competence-based curriculum format and learning outcomes established by the Kenya Institute of Curriculum Development (KICD). This material is independently developed and is not officially endorsed or published by KICD.</w:t>
+      </w:r>
+    </w:p>
+    <w:p>
+      <w:pPr>
+        <w:spacing w:after="60" w:before="0"/>
+      </w:pPr>
+      <w:r>
+        <w:rPr>
+          <w:rFonts w:ascii="Arial" w:cs="Arial" w:eastAsia="Arial" w:hAnsi="Arial"/>
+          <w:b/>
+          <w:bCs/>
+          <w:sz w:val="17"/>
+          <w:szCs w:val="17"/>
+        </w:rPr>
+        <w:t xml:space="preserve">Content &amp; Pedagogy: </w:t>
+      </w:r>
+      <w:r>
+        <w:rPr>
+          <w:rFonts w:ascii="Arial" w:cs="Arial" w:eastAsia="Arial" w:hAnsi="Arial"/>
+          <w:sz w:val="17"/>
+          <w:szCs w:val="17"/>
+        </w:rPr>
+        <w:t xml:space="preserve">Developed and adapted by the educator team at SeaVuria (registered 501(c)(3) in the United States and registered NGO in Kenya, No. 872-850A-BF11), who designed the pedagogical framework, lesson templates and exemplar lessons on which this material is based.</w:t>
+      </w:r>
+    </w:p>
+    <w:p>
+      <w:pPr>
+        <w:spacing w:after="60" w:before="0"/>
+      </w:pPr>
+      <w:r>
+        <w:rPr>
+          <w:rFonts w:ascii="Arial" w:cs="Arial" w:eastAsia="Arial" w:hAnsi="Arial"/>
+          <w:b/>
+          <w:bCs/>
+          <w:sz w:val="17"/>
+          <w:szCs w:val="17"/>
+        </w:rPr>
+        <w:t xml:space="preserve">Production &amp; Layout: </w:t>
+      </w:r>
+      <w:r>
+        <w:rPr>
+          <w:rFonts w:ascii="Arial" w:cs="Arial" w:eastAsia="Arial" w:hAnsi="Arial"/>
+          <w:sz w:val="17"/>
+          <w:szCs w:val="17"/>
+        </w:rPr>
+        <w:t xml:space="preserve">Educational design and curriculum sequencing by SeaVuria. Technical layout, structural formatting, and digital optimization/implementation executed in partnership with ARES Education (registered 501(c)(3) in the United States and Canada (as Afretech Aid) and registered NGO in Kenya), with lesson drafting and compilation assisted by AI (Claude, Anthropic).</w:t>
+      </w:r>
+    </w:p>
+    <w:p>
+      <w:pPr>
+        <w:pBdr>
+          <w:bottom w:val="single" w:color="1F3864" w:sz="6" w:space="6"/>
+        </w:pBdr>
+        <w:spacing w:after="60" w:before="0"/>
+      </w:pPr>
+      <w:r>
+        <w:rPr>
+          <w:rFonts w:ascii="Arial" w:cs="Arial" w:eastAsia="Arial" w:hAnsi="Arial"/>
+          <w:b/>
+          <w:bCs/>
+          <w:sz w:val="17"/>
+          <w:szCs w:val="17"/>
+        </w:rPr>
+        <w:t xml:space="preserve">Licensing &amp; Copyright: </w:t>
+      </w:r>
+      <w:r>
+        <w:rPr>
+          <w:rFonts w:ascii="Arial" w:cs="Arial" w:eastAsia="Arial" w:hAnsi="Arial"/>
+          <w:sz w:val="17"/>
+          <w:szCs w:val="17"/>
+        </w:rPr>
+        <w:t xml:space="preserve">© 2026 SeaVuria and ARES. This work is licensed under a </w:t>
+      </w:r>
+      <w:hyperlink w:history="1" r:id="rIdfk1lwg7gee7ifhcrd2hca">
+        <w:r>
+          <w:rPr>
+            <w:rFonts w:ascii="Arial" w:cs="Arial" w:eastAsia="Arial" w:hAnsi="Arial"/>
+            <w:color w:val="1F6B75"/>
+            <w:sz w:val="17"/>
+            <w:szCs w:val="17"/>
+            <w:u w:val="single" w:color="1F6B75"/>
+          </w:rPr>
+          <w:t xml:space="preserve">Creative Commons Attribution-NonCommercial 4.0 International License</w:t>
+        </w:r>
+      </w:hyperlink>
+      <w:r>
+        <w:rPr>
+          <w:rFonts w:ascii="Arial" w:cs="Arial" w:eastAsia="Arial" w:hAnsi="Arial"/>
+          <w:sz w:val="17"/>
+          <w:szCs w:val="17"/>
+        </w:rPr>
+        <w:t xml:space="preserve"> (</w:t>
+      </w:r>
+      <w:hyperlink w:history="1" r:id="rId5ytpofw8bxtvayflmfoh5">
+        <w:r>
+          <w:rPr>
+            <w:rFonts w:ascii="Arial" w:cs="Arial" w:eastAsia="Arial" w:hAnsi="Arial"/>
+            <w:color w:val="1F6B75"/>
+            <w:sz w:val="17"/>
+            <w:szCs w:val="17"/>
+            <w:u w:val="single" w:color="1F6B75"/>
+          </w:rPr>
+          <w:t xml:space="preserve">CC BY-NC 4.0</w:t>
+        </w:r>
+      </w:hyperlink>
+      <w:r>
+        <w:rPr>
+          <w:rFonts w:ascii="Arial" w:cs="Arial" w:eastAsia="Arial" w:hAnsi="Arial"/>
+          <w:sz w:val="17"/>
+          <w:szCs w:val="17"/>
+        </w:rPr>
+        <w:t xml:space="preserve">). To view a copy of this license, visit </w:t>
+      </w:r>
+      <w:hyperlink w:history="1" r:id="rIdhpsswbau_vyqfqxwwnuuw">
+        <w:r>
+          <w:rPr>
+            <w:rFonts w:ascii="Arial" w:cs="Arial" w:eastAsia="Arial" w:hAnsi="Arial"/>
+            <w:color w:val="1F6B75"/>
+            <w:sz w:val="17"/>
+            <w:szCs w:val="17"/>
+            <w:u w:val="single" w:color="1F6B75"/>
+          </w:rPr>
+          <w:t xml:space="preserve">https://creativecommons.org/licenses/by-nc/4.0/</w:t>
+        </w:r>
+      </w:hyperlink>
+      <w:r>
+        <w:rPr>
+          <w:rFonts w:ascii="Arial" w:cs="Arial" w:eastAsia="Arial" w:hAnsi="Arial"/>
+          <w:sz w:val="17"/>
+          <w:szCs w:val="17"/>
+        </w:rPr>
+        <w:t xml:space="preserve">. You are free to copy, redistribute, and adapt this material in any medium or format, provided appropriate credit is given and the material is not used for commercial purposes. KICD learning outcomes and curriculum designations reproduced here for alignment purposes remain the property of KICD and are not covered by this license. Linked external resources (e.g. CK-12, Khan Academy, PhET) are subject to their own licenses.</w:t>
+      </w:r>
+    </w:p>
+    <w:p>
+      <w:pPr>
         <w:spacing w:after="120"/>
       </w:pPr>
       <w:r>
@@ -3244,7 +3415,7 @@
             <w:pPr>
               <w:spacing w:after="20" w:before="0"/>
             </w:pPr>
-            <w:hyperlink w:history="1" r:id="rIdsi9g1ju0v-hcca4zzp6jw">
+            <w:hyperlink w:history="1" r:id="rIdig3u-resxjizpt5qqfezi">
               <w:r>
                 <w:rPr>
                   <w:rFonts w:ascii="Arial" w:cs="Arial" w:eastAsia="Arial" w:hAnsi="Arial"/>
@@ -3277,7 +3448,7 @@
               <w:spacing w:after="10" w:before="0"/>
               <w:ind w:left="120"/>
             </w:pPr>
-            <w:hyperlink w:history="1" r:id="rIdpbnlrqg5xvvxmxrnnmvvm">
+            <w:hyperlink w:history="1" r:id="rIdeph2e4lr8f11fnatq2mhd">
               <w:r>
                 <w:rPr>
                   <w:rFonts w:ascii="Arial" w:cs="Arial" w:eastAsia="Arial" w:hAnsi="Arial"/>
@@ -3322,7 +3493,7 @@
             <w:pPr>
               <w:spacing w:after="20" w:before="0"/>
             </w:pPr>
-            <w:hyperlink w:history="1" r:id="rId_xpq175fig0ct7xgzrknv">
+            <w:hyperlink w:history="1" r:id="rIdfkselsybrb7xbgfi7ouip">
               <w:r>
                 <w:rPr>
                   <w:rFonts w:ascii="Arial" w:cs="Arial" w:eastAsia="Arial" w:hAnsi="Arial"/>
@@ -3355,7 +3526,7 @@
               <w:spacing w:after="10" w:before="0"/>
               <w:ind w:left="120"/>
             </w:pPr>
-            <w:hyperlink w:history="1" r:id="rIdbl_va8jd1-qglw2dsl7r-">
+            <w:hyperlink w:history="1" r:id="rIds1aasq5c6lqou94oji3uj">
               <w:r>
                 <w:rPr>
                   <w:rFonts w:ascii="Arial" w:cs="Arial" w:eastAsia="Arial" w:hAnsi="Arial"/>
@@ -3816,7 +3987,7 @@
             <w:pPr>
               <w:spacing w:after="20" w:before="0"/>
             </w:pPr>
-            <w:hyperlink w:history="1" r:id="rIdrazwslgsnt9op5_m1faqc">
+            <w:hyperlink w:history="1" r:id="rIdnfvu0vzixh8lcjwksg_pm">
               <w:r>
                 <w:rPr>
                   <w:rFonts w:ascii="Arial" w:cs="Arial" w:eastAsia="Arial" w:hAnsi="Arial"/>
@@ -3849,7 +4020,7 @@
               <w:spacing w:after="10" w:before="0"/>
               <w:ind w:left="120"/>
             </w:pPr>
-            <w:hyperlink w:history="1" r:id="rIdtk4timrrnzyg0yuldkudw">
+            <w:hyperlink w:history="1" r:id="rIdfcwyv4uwmut6pxp3tjwpl">
               <w:r>
                 <w:rPr>
                   <w:rFonts w:ascii="Arial" w:cs="Arial" w:eastAsia="Arial" w:hAnsi="Arial"/>
@@ -3894,7 +4065,7 @@
             <w:pPr>
               <w:spacing w:after="20" w:before="0"/>
             </w:pPr>
-            <w:hyperlink w:history="1" r:id="rIdssoptx3iwde15p-hynwbg">
+            <w:hyperlink w:history="1" r:id="rIdz_dezequfb1zup79249wy">
               <w:r>
                 <w:rPr>
                   <w:rFonts w:ascii="Arial" w:cs="Arial" w:eastAsia="Arial" w:hAnsi="Arial"/>
@@ -3927,7 +4098,7 @@
               <w:spacing w:after="10" w:before="0"/>
               <w:ind w:left="120"/>
             </w:pPr>
-            <w:hyperlink w:history="1" r:id="rId7mvexs84g7fla4mqd3i6v">
+            <w:hyperlink w:history="1" r:id="rIdqwlbpaynunvnvn4deyzxp">
               <w:r>
                 <w:rPr>
                   <w:rFonts w:ascii="Arial" w:cs="Arial" w:eastAsia="Arial" w:hAnsi="Arial"/>
@@ -4274,7 +4445,7 @@
             <w:pPr>
               <w:spacing w:after="20" w:before="0"/>
             </w:pPr>
-            <w:hyperlink w:history="1" r:id="rIdbareh_1lcnm4tya-uxoas">
+            <w:hyperlink w:history="1" r:id="rIdddr4svfpqmxo_luv3cq3-">
               <w:r>
                 <w:rPr>
                   <w:rFonts w:ascii="Arial" w:cs="Arial" w:eastAsia="Arial" w:hAnsi="Arial"/>
@@ -4307,7 +4478,7 @@
               <w:spacing w:after="10" w:before="0"/>
               <w:ind w:left="120"/>
             </w:pPr>
-            <w:hyperlink w:history="1" r:id="rIdixw0wsct3ceyq5uz_vhls">
+            <w:hyperlink w:history="1" r:id="rIdsz8pttmmof41tzqgcmrrg">
               <w:r>
                 <w:rPr>
                   <w:rFonts w:ascii="Arial" w:cs="Arial" w:eastAsia="Arial" w:hAnsi="Arial"/>
@@ -4352,7 +4523,7 @@
             <w:pPr>
               <w:spacing w:after="20" w:before="0"/>
             </w:pPr>
-            <w:hyperlink w:history="1" r:id="rIdwn7wda7jwfilxnu1ecgez">
+            <w:hyperlink w:history="1" r:id="rIdbl9v2bxps-n6mxnw9jeib">
               <w:r>
                 <w:rPr>
                   <w:rFonts w:ascii="Arial" w:cs="Arial" w:eastAsia="Arial" w:hAnsi="Arial"/>
@@ -4385,7 +4556,7 @@
               <w:spacing w:after="10" w:before="0"/>
               <w:ind w:left="120"/>
             </w:pPr>
-            <w:hyperlink w:history="1" r:id="rIdzg5gc4zgltcg9oaehmcll">
+            <w:hyperlink w:history="1" r:id="rIdjk5_x5bub84xbsixiknya">
               <w:r>
                 <w:rPr>
                   <w:rFonts w:ascii="Arial" w:cs="Arial" w:eastAsia="Arial" w:hAnsi="Arial"/>
@@ -4770,7 +4941,7 @@
             <w:pPr>
               <w:spacing w:after="20" w:before="0"/>
             </w:pPr>
-            <w:hyperlink w:history="1" r:id="rId-a7tuo2t4efinrip-dbve">
+            <w:hyperlink w:history="1" r:id="rIdqybdlyvor2siptwvc9gsy">
               <w:r>
                 <w:rPr>
                   <w:rFonts w:ascii="Arial" w:cs="Arial" w:eastAsia="Arial" w:hAnsi="Arial"/>
@@ -4803,7 +4974,7 @@
               <w:spacing w:after="10" w:before="0"/>
               <w:ind w:left="120"/>
             </w:pPr>
-            <w:hyperlink w:history="1" r:id="rIdzaksfoik1kmffugqvg_mp">
+            <w:hyperlink w:history="1" r:id="rIdwdyzq50rhthbvn-klfzvd">
               <w:r>
                 <w:rPr>
                   <w:rFonts w:ascii="Arial" w:cs="Arial" w:eastAsia="Arial" w:hAnsi="Arial"/>
@@ -4848,7 +5019,7 @@
             <w:pPr>
               <w:spacing w:after="20" w:before="0"/>
             </w:pPr>
-            <w:hyperlink w:history="1" r:id="rIdjb9_iy73skz1tsmvcxdbf">
+            <w:hyperlink w:history="1" r:id="rIdlo6mgoneww2mwbobfxa9u">
               <w:r>
                 <w:rPr>
                   <w:rFonts w:ascii="Arial" w:cs="Arial" w:eastAsia="Arial" w:hAnsi="Arial"/>
@@ -4881,7 +5052,7 @@
               <w:spacing w:after="10" w:before="0"/>
               <w:ind w:left="120"/>
             </w:pPr>
-            <w:hyperlink w:history="1" r:id="rIda1trymhacw3drqcqzyyxj">
+            <w:hyperlink w:history="1" r:id="rIdfphl6kxlwhfsz0z1emx5x">
               <w:r>
                 <w:rPr>
                   <w:rFonts w:ascii="Arial" w:cs="Arial" w:eastAsia="Arial" w:hAnsi="Arial"/>
@@ -5228,7 +5399,7 @@
             <w:pPr>
               <w:spacing w:after="20" w:before="0"/>
             </w:pPr>
-            <w:hyperlink w:history="1" r:id="rId2vdierrc_nljrtil4v4mn">
+            <w:hyperlink w:history="1" r:id="rIdm0tvpxno_hcltvfl097z0">
               <w:r>
                 <w:rPr>
                   <w:rFonts w:ascii="Arial" w:cs="Arial" w:eastAsia="Arial" w:hAnsi="Arial"/>
@@ -5261,7 +5432,7 @@
               <w:spacing w:after="10" w:before="0"/>
               <w:ind w:left="120"/>
             </w:pPr>
-            <w:hyperlink w:history="1" r:id="rIdbws5xuhhdhizrsylxhojn">
+            <w:hyperlink w:history="1" r:id="rIds-t1hdnnzilgihswju9a6">
               <w:r>
                 <w:rPr>
                   <w:rFonts w:ascii="Arial" w:cs="Arial" w:eastAsia="Arial" w:hAnsi="Arial"/>
@@ -5306,7 +5477,7 @@
             <w:pPr>
               <w:spacing w:after="20" w:before="0"/>
             </w:pPr>
-            <w:hyperlink w:history="1" r:id="rIdz0yudvi7csflwih4eeegu">
+            <w:hyperlink w:history="1" r:id="rIdls2tkzyrqwryskhkcrhji">
               <w:r>
                 <w:rPr>
                   <w:rFonts w:ascii="Arial" w:cs="Arial" w:eastAsia="Arial" w:hAnsi="Arial"/>
@@ -5339,7 +5510,7 @@
               <w:spacing w:after="10" w:before="0"/>
               <w:ind w:left="120"/>
             </w:pPr>
-            <w:hyperlink w:history="1" r:id="rIdttcgdtvaesn0uqkz1gvlm">
+            <w:hyperlink w:history="1" r:id="rId6vr-d3xnehfwjslzsxwzx">
               <w:r>
                 <w:rPr>
                   <w:rFonts w:ascii="Arial" w:cs="Arial" w:eastAsia="Arial" w:hAnsi="Arial"/>
@@ -6215,6 +6386,65 @@
         </w:tc>
       </w:tr>
     </w:tbl>
+    <w:p>
+      <w:pPr>
+        <w:pBdr>
+          <w:top w:val="single" w:color="BBBBBB" w:sz="4" w:space="4"/>
+        </w:pBdr>
+        <w:spacing w:after="0" w:before="160"/>
+      </w:pPr>
+      <w:r>
+        <w:rPr>
+          <w:rFonts w:ascii="Arial" w:cs="Arial" w:eastAsia="Arial" w:hAnsi="Arial"/>
+          <w:color w:val="666666"/>
+          <w:sz w:val="14"/>
+          <w:szCs w:val="14"/>
+        </w:rPr>
+        <w:t xml:space="preserve">© 2026 SeaVuria and ARES. Aligned with KICD objectives. Developed by SeaVuria; technical implementation by ARES (with AI assistance from Claude). Licensed under </w:t>
+      </w:r>
+      <w:hyperlink w:history="1" r:id="rIdq9cy1176pyrx3ldwxh1wb">
+        <w:r>
+          <w:rPr>
+            <w:rFonts w:ascii="Arial" w:cs="Arial" w:eastAsia="Arial" w:hAnsi="Arial"/>
+            <w:color w:val="1F6B75"/>
+            <w:sz w:val="14"/>
+            <w:szCs w:val="14"/>
+            <w:u w:val="single" w:color="1F6B75"/>
+          </w:rPr>
+          <w:t xml:space="preserve">CC BY-NC 4.0</w:t>
+        </w:r>
+      </w:hyperlink>
+      <w:r>
+        <w:rPr>
+          <w:rFonts w:ascii="Arial" w:cs="Arial" w:eastAsia="Arial" w:hAnsi="Arial"/>
+          <w:color w:val="666666"/>
+          <w:sz w:val="14"/>
+          <w:szCs w:val="14"/>
+        </w:rPr>
+        <w:t xml:space="preserve"> (</w:t>
+      </w:r>
+      <w:hyperlink w:history="1" r:id="rIdvovcqmtkeqzju10g9gb5a">
+        <w:r>
+          <w:rPr>
+            <w:rFonts w:ascii="Arial" w:cs="Arial" w:eastAsia="Arial" w:hAnsi="Arial"/>
+            <w:color w:val="1F6B75"/>
+            <w:sz w:val="14"/>
+            <w:szCs w:val="14"/>
+            <w:u w:val="single" w:color="1F6B75"/>
+          </w:rPr>
+          <w:t xml:space="preserve">https://creativecommons.org/licenses/by-nc/4.0/</w:t>
+        </w:r>
+      </w:hyperlink>
+      <w:r>
+        <w:rPr>
+          <w:rFonts w:ascii="Arial" w:cs="Arial" w:eastAsia="Arial" w:hAnsi="Arial"/>
+          <w:color w:val="666666"/>
+          <w:sz w:val="14"/>
+          <w:szCs w:val="14"/>
+        </w:rPr>
+        <w:t xml:space="preserve">).</w:t>
+      </w:r>
+    </w:p>
     <w:p>
       <w:r>
         <w:br w:type="page"/>
@@ -7206,7 +7436,7 @@
             <w:pPr>
               <w:spacing w:after="20" w:before="0"/>
             </w:pPr>
-            <w:hyperlink w:history="1" r:id="rId-bbvn9ukmis5xvlu2ai9c">
+            <w:hyperlink w:history="1" r:id="rIdo7lomuk-uy-ax89zsedls">
               <w:r>
                 <w:rPr>
                   <w:rFonts w:ascii="Arial" w:cs="Arial" w:eastAsia="Arial" w:hAnsi="Arial"/>
@@ -7239,7 +7469,7 @@
               <w:spacing w:after="10" w:before="0"/>
               <w:ind w:left="120"/>
             </w:pPr>
-            <w:hyperlink w:history="1" r:id="rIdigsimln1o94o2hlfvvgas">
+            <w:hyperlink w:history="1" r:id="rIdl-g4u9rjcnpwwuwr3leuh">
               <w:r>
                 <w:rPr>
                   <w:rFonts w:ascii="Arial" w:cs="Arial" w:eastAsia="Arial" w:hAnsi="Arial"/>
@@ -7284,7 +7514,7 @@
             <w:pPr>
               <w:spacing w:after="20" w:before="0"/>
             </w:pPr>
-            <w:hyperlink w:history="1" r:id="rIdtfb5kx6bukjn-0tus8o3_">
+            <w:hyperlink w:history="1" r:id="rIdnvvojubhqftf5gjefcd3l">
               <w:r>
                 <w:rPr>
                   <w:rFonts w:ascii="Arial" w:cs="Arial" w:eastAsia="Arial" w:hAnsi="Arial"/>
@@ -7317,7 +7547,7 @@
               <w:spacing w:after="10" w:before="0"/>
               <w:ind w:left="120"/>
             </w:pPr>
-            <w:hyperlink w:history="1" r:id="rId9mef7unr2eyhutmv7zpyf">
+            <w:hyperlink w:history="1" r:id="rIdlyjst68qtbqwqourmesgx">
               <w:r>
                 <w:rPr>
                   <w:rFonts w:ascii="Arial" w:cs="Arial" w:eastAsia="Arial" w:hAnsi="Arial"/>
@@ -7512,7 +7742,7 @@
             <w:pPr>
               <w:spacing w:after="20" w:before="0"/>
             </w:pPr>
-            <w:hyperlink w:history="1" r:id="rId5ujzufhvfct7nua6zzlgk">
+            <w:hyperlink w:history="1" r:id="rIdnwsz40utub--z1elhlmt7">
               <w:r>
                 <w:rPr>
                   <w:rFonts w:ascii="Arial" w:cs="Arial" w:eastAsia="Arial" w:hAnsi="Arial"/>
@@ -7545,7 +7775,7 @@
               <w:spacing w:after="10" w:before="0"/>
               <w:ind w:left="120"/>
             </w:pPr>
-            <w:hyperlink w:history="1" r:id="rIdt2irkfhdbn2xzjbxtxtzz">
+            <w:hyperlink w:history="1" r:id="rIdjdsty-yieva9vy781951y">
               <w:r>
                 <w:rPr>
                   <w:rFonts w:ascii="Arial" w:cs="Arial" w:eastAsia="Arial" w:hAnsi="Arial"/>
@@ -7590,7 +7820,7 @@
             <w:pPr>
               <w:spacing w:after="20" w:before="0"/>
             </w:pPr>
-            <w:hyperlink w:history="1" r:id="rIdnlkyyyp_ea1b3hos-f6-a">
+            <w:hyperlink w:history="1" r:id="rId0k2v0zzwsx5npsq2xqfpx">
               <w:r>
                 <w:rPr>
                   <w:rFonts w:ascii="Arial" w:cs="Arial" w:eastAsia="Arial" w:hAnsi="Arial"/>
@@ -7623,7 +7853,7 @@
               <w:spacing w:after="10" w:before="0"/>
               <w:ind w:left="120"/>
             </w:pPr>
-            <w:hyperlink w:history="1" r:id="rIdfpdr4iy13yu8jwddsiv4r">
+            <w:hyperlink w:history="1" r:id="rIdpjd9hk9uzb6iynkphsmzt">
               <w:r>
                 <w:rPr>
                   <w:rFonts w:ascii="Arial" w:cs="Arial" w:eastAsia="Arial" w:hAnsi="Arial"/>
@@ -7818,7 +8048,7 @@
             <w:pPr>
               <w:spacing w:after="20" w:before="0"/>
             </w:pPr>
-            <w:hyperlink w:history="1" r:id="rId0passioz6qdfk7hlgtxlh">
+            <w:hyperlink w:history="1" r:id="rIdgwd5_7fbfoa-4rm48w4ug">
               <w:r>
                 <w:rPr>
                   <w:rFonts w:ascii="Arial" w:cs="Arial" w:eastAsia="Arial" w:hAnsi="Arial"/>
@@ -7851,7 +8081,7 @@
               <w:spacing w:after="10" w:before="0"/>
               <w:ind w:left="120"/>
             </w:pPr>
-            <w:hyperlink w:history="1" r:id="rIdnhgpinpfzrd_vrexgpgr9">
+            <w:hyperlink w:history="1" r:id="rIdvlvumi5v4rb8e9mqwwryg">
               <w:r>
                 <w:rPr>
                   <w:rFonts w:ascii="Arial" w:cs="Arial" w:eastAsia="Arial" w:hAnsi="Arial"/>
@@ -7896,7 +8126,7 @@
             <w:pPr>
               <w:spacing w:after="20" w:before="0"/>
             </w:pPr>
-            <w:hyperlink w:history="1" r:id="rIdghnasfw1mykmhr9ma9sfg">
+            <w:hyperlink w:history="1" r:id="rIdcptdari6lwxjllrssv0ms">
               <w:r>
                 <w:rPr>
                   <w:rFonts w:ascii="Arial" w:cs="Arial" w:eastAsia="Arial" w:hAnsi="Arial"/>
@@ -7929,7 +8159,7 @@
               <w:spacing w:after="10" w:before="0"/>
               <w:ind w:left="120"/>
             </w:pPr>
-            <w:hyperlink w:history="1" r:id="rIde41gjihgh5s3isqwb-r0z">
+            <w:hyperlink w:history="1" r:id="rIduaxnosbfnvmvgzcvey_5d">
               <w:r>
                 <w:rPr>
                   <w:rFonts w:ascii="Arial" w:cs="Arial" w:eastAsia="Arial" w:hAnsi="Arial"/>
@@ -8124,7 +8354,7 @@
             <w:pPr>
               <w:spacing w:after="20" w:before="0"/>
             </w:pPr>
-            <w:hyperlink w:history="1" r:id="rIdvghto0pncuskfjz5bsds_">
+            <w:hyperlink w:history="1" r:id="rIdobihl7xepxgqyspapmgrc">
               <w:r>
                 <w:rPr>
                   <w:rFonts w:ascii="Arial" w:cs="Arial" w:eastAsia="Arial" w:hAnsi="Arial"/>
@@ -8157,7 +8387,7 @@
               <w:spacing w:after="10" w:before="0"/>
               <w:ind w:left="120"/>
             </w:pPr>
-            <w:hyperlink w:history="1" r:id="rIdvhwqgcqzrucaz_0o4ffel">
+            <w:hyperlink w:history="1" r:id="rIdhqqyn5gcrk88bhhagmwv9">
               <w:r>
                 <w:rPr>
                   <w:rFonts w:ascii="Arial" w:cs="Arial" w:eastAsia="Arial" w:hAnsi="Arial"/>
@@ -8202,7 +8432,7 @@
             <w:pPr>
               <w:spacing w:after="20" w:before="0"/>
             </w:pPr>
-            <w:hyperlink w:history="1" r:id="rIdd0xmj9apxg3_yhq3b0k23">
+            <w:hyperlink w:history="1" r:id="rIdaf4vlkiubbcrhjkc66afn">
               <w:r>
                 <w:rPr>
                   <w:rFonts w:ascii="Arial" w:cs="Arial" w:eastAsia="Arial" w:hAnsi="Arial"/>
@@ -8235,7 +8465,7 @@
               <w:spacing w:after="10" w:before="0"/>
               <w:ind w:left="120"/>
             </w:pPr>
-            <w:hyperlink w:history="1" r:id="rIducijsn7da-wyfyzjtp7pv">
+            <w:hyperlink w:history="1" r:id="rIdschaa0mhoucyt5nfutm9n">
               <w:r>
                 <w:rPr>
                   <w:rFonts w:ascii="Arial" w:cs="Arial" w:eastAsia="Arial" w:hAnsi="Arial"/>
@@ -8430,7 +8660,7 @@
             <w:pPr>
               <w:spacing w:after="20" w:before="0"/>
             </w:pPr>
-            <w:hyperlink w:history="1" r:id="rId2cehqkmyqaxt1tcbqchmj">
+            <w:hyperlink w:history="1" r:id="rIdbxtxcgekubwduol4yylfs">
               <w:r>
                 <w:rPr>
                   <w:rFonts w:ascii="Arial" w:cs="Arial" w:eastAsia="Arial" w:hAnsi="Arial"/>
@@ -8463,7 +8693,7 @@
               <w:spacing w:after="10" w:before="0"/>
               <w:ind w:left="120"/>
             </w:pPr>
-            <w:hyperlink w:history="1" r:id="rIdsar6ur8snywsssf5scgug">
+            <w:hyperlink w:history="1" r:id="rIdhgqe7edhfzcim7aczdua3">
               <w:r>
                 <w:rPr>
                   <w:rFonts w:ascii="Arial" w:cs="Arial" w:eastAsia="Arial" w:hAnsi="Arial"/>
@@ -8508,7 +8738,7 @@
             <w:pPr>
               <w:spacing w:after="20" w:before="0"/>
             </w:pPr>
-            <w:hyperlink w:history="1" r:id="rIdsw6rngd7co2t3peha4npb">
+            <w:hyperlink w:history="1" r:id="rIdty303abpzmwr1xnhuxd9d">
               <w:r>
                 <w:rPr>
                   <w:rFonts w:ascii="Arial" w:cs="Arial" w:eastAsia="Arial" w:hAnsi="Arial"/>
@@ -8541,7 +8771,7 @@
               <w:spacing w:after="10" w:before="0"/>
               <w:ind w:left="120"/>
             </w:pPr>
-            <w:hyperlink w:history="1" r:id="rIdrik6lhogkvr4tkxwfsaib">
+            <w:hyperlink w:history="1" r:id="rIdpfne0_pg7gsipdyz6_pmv">
               <w:r>
                 <w:rPr>
                   <w:rFonts w:ascii="Arial" w:cs="Arial" w:eastAsia="Arial" w:hAnsi="Arial"/>
@@ -9151,6 +9381,65 @@
         </w:tc>
       </w:tr>
     </w:tbl>
+    <w:p>
+      <w:pPr>
+        <w:pBdr>
+          <w:top w:val="single" w:color="BBBBBB" w:sz="4" w:space="4"/>
+        </w:pBdr>
+        <w:spacing w:after="0" w:before="160"/>
+      </w:pPr>
+      <w:r>
+        <w:rPr>
+          <w:rFonts w:ascii="Arial" w:cs="Arial" w:eastAsia="Arial" w:hAnsi="Arial"/>
+          <w:color w:val="666666"/>
+          <w:sz w:val="14"/>
+          <w:szCs w:val="14"/>
+        </w:rPr>
+        <w:t xml:space="preserve">© 2026 SeaVuria and ARES. Aligned with KICD objectives. Developed by SeaVuria; technical implementation by ARES (with AI assistance from Claude). Licensed under </w:t>
+      </w:r>
+      <w:hyperlink w:history="1" r:id="rIdrila5dxuk8ttykzwsi1ut">
+        <w:r>
+          <w:rPr>
+            <w:rFonts w:ascii="Arial" w:cs="Arial" w:eastAsia="Arial" w:hAnsi="Arial"/>
+            <w:color w:val="1F6B75"/>
+            <w:sz w:val="14"/>
+            <w:szCs w:val="14"/>
+            <w:u w:val="single" w:color="1F6B75"/>
+          </w:rPr>
+          <w:t xml:space="preserve">CC BY-NC 4.0</w:t>
+        </w:r>
+      </w:hyperlink>
+      <w:r>
+        <w:rPr>
+          <w:rFonts w:ascii="Arial" w:cs="Arial" w:eastAsia="Arial" w:hAnsi="Arial"/>
+          <w:color w:val="666666"/>
+          <w:sz w:val="14"/>
+          <w:szCs w:val="14"/>
+        </w:rPr>
+        <w:t xml:space="preserve"> (</w:t>
+      </w:r>
+      <w:hyperlink w:history="1" r:id="rId5uey7gcznb3shuzrgmj-c">
+        <w:r>
+          <w:rPr>
+            <w:rFonts w:ascii="Arial" w:cs="Arial" w:eastAsia="Arial" w:hAnsi="Arial"/>
+            <w:color w:val="1F6B75"/>
+            <w:sz w:val="14"/>
+            <w:szCs w:val="14"/>
+            <w:u w:val="single" w:color="1F6B75"/>
+          </w:rPr>
+          <w:t xml:space="preserve">https://creativecommons.org/licenses/by-nc/4.0/</w:t>
+        </w:r>
+      </w:hyperlink>
+      <w:r>
+        <w:rPr>
+          <w:rFonts w:ascii="Arial" w:cs="Arial" w:eastAsia="Arial" w:hAnsi="Arial"/>
+          <w:color w:val="666666"/>
+          <w:sz w:val="14"/>
+          <w:szCs w:val="14"/>
+        </w:rPr>
+        <w:t xml:space="preserve">).</w:t>
+      </w:r>
+    </w:p>
     <w:p>
       <w:r>
         <w:br w:type="page"/>
@@ -10142,7 +10431,7 @@
             <w:pPr>
               <w:spacing w:after="20" w:before="0"/>
             </w:pPr>
-            <w:hyperlink w:history="1" r:id="rId1l051nk6awdtlk2qwnb1y">
+            <w:hyperlink w:history="1" r:id="rId_jjjzk-lbl7alsfrto5jw">
               <w:r>
                 <w:rPr>
                   <w:rFonts w:ascii="Arial" w:cs="Arial" w:eastAsia="Arial" w:hAnsi="Arial"/>
@@ -10175,7 +10464,7 @@
               <w:spacing w:after="10" w:before="0"/>
               <w:ind w:left="120"/>
             </w:pPr>
-            <w:hyperlink w:history="1" r:id="rIdvoglcuyoe-r84wgxwcmk2">
+            <w:hyperlink w:history="1" r:id="rIdez8kfolt-ryslkbajdkze">
               <w:r>
                 <w:rPr>
                   <w:rFonts w:ascii="Arial" w:cs="Arial" w:eastAsia="Arial" w:hAnsi="Arial"/>
@@ -10220,7 +10509,7 @@
             <w:pPr>
               <w:spacing w:after="20" w:before="0"/>
             </w:pPr>
-            <w:hyperlink w:history="1" r:id="rIdlioqt5dwtv5vdb3gfbzqj">
+            <w:hyperlink w:history="1" r:id="rIdnksrmc3c0txqqpewmbarw">
               <w:r>
                 <w:rPr>
                   <w:rFonts w:ascii="Arial" w:cs="Arial" w:eastAsia="Arial" w:hAnsi="Arial"/>
@@ -10253,7 +10542,7 @@
               <w:spacing w:after="10" w:before="0"/>
               <w:ind w:left="120"/>
             </w:pPr>
-            <w:hyperlink w:history="1" r:id="rIdwnzt7tsnrst_ddrleqvs5">
+            <w:hyperlink w:history="1" r:id="rId1nxcbrcnenwhgh6dirgla">
               <w:r>
                 <w:rPr>
                   <w:rFonts w:ascii="Arial" w:cs="Arial" w:eastAsia="Arial" w:hAnsi="Arial"/>
@@ -10448,7 +10737,7 @@
             <w:pPr>
               <w:spacing w:after="20" w:before="0"/>
             </w:pPr>
-            <w:hyperlink w:history="1" r:id="rId-hcrqwhaygypfwhqhgp2v">
+            <w:hyperlink w:history="1" r:id="rIdfco7vekn39gv3p1zuozav">
               <w:r>
                 <w:rPr>
                   <w:rFonts w:ascii="Arial" w:cs="Arial" w:eastAsia="Arial" w:hAnsi="Arial"/>
@@ -10481,7 +10770,7 @@
               <w:spacing w:after="10" w:before="0"/>
               <w:ind w:left="120"/>
             </w:pPr>
-            <w:hyperlink w:history="1" r:id="rIdto1usftxdai806kfubzga">
+            <w:hyperlink w:history="1" r:id="rId-f64ghyz-9bqdlrqcrfm0">
               <w:r>
                 <w:rPr>
                   <w:rFonts w:ascii="Arial" w:cs="Arial" w:eastAsia="Arial" w:hAnsi="Arial"/>
@@ -10526,7 +10815,7 @@
             <w:pPr>
               <w:spacing w:after="20" w:before="0"/>
             </w:pPr>
-            <w:hyperlink w:history="1" r:id="rIdjpefgjbtgadgzqo1jmz_s">
+            <w:hyperlink w:history="1" r:id="rIdj54blrwu_ydjljez1trug">
               <w:r>
                 <w:rPr>
                   <w:rFonts w:ascii="Arial" w:cs="Arial" w:eastAsia="Arial" w:hAnsi="Arial"/>
@@ -10559,7 +10848,7 @@
               <w:spacing w:after="10" w:before="0"/>
               <w:ind w:left="120"/>
             </w:pPr>
-            <w:hyperlink w:history="1" r:id="rId50bny7ne2z73vuz-cllbh">
+            <w:hyperlink w:history="1" r:id="rIdb8c19ct33n8_inioaujbq">
               <w:r>
                 <w:rPr>
                   <w:rFonts w:ascii="Arial" w:cs="Arial" w:eastAsia="Arial" w:hAnsi="Arial"/>
@@ -10754,7 +11043,7 @@
             <w:pPr>
               <w:spacing w:after="20" w:before="0"/>
             </w:pPr>
-            <w:hyperlink w:history="1" r:id="rIdum5abfqhvnntqa9pgfzga">
+            <w:hyperlink w:history="1" r:id="rIdkipwojdi9ppzhmh2wk5u2">
               <w:r>
                 <w:rPr>
                   <w:rFonts w:ascii="Arial" w:cs="Arial" w:eastAsia="Arial" w:hAnsi="Arial"/>
@@ -10787,7 +11076,7 @@
               <w:spacing w:after="10" w:before="0"/>
               <w:ind w:left="120"/>
             </w:pPr>
-            <w:hyperlink w:history="1" r:id="rIdrz99qxtxuyvu-7pjxsyir">
+            <w:hyperlink w:history="1" r:id="rIdt8rvnt45d-bcbrnket_x0">
               <w:r>
                 <w:rPr>
                   <w:rFonts w:ascii="Arial" w:cs="Arial" w:eastAsia="Arial" w:hAnsi="Arial"/>
@@ -10832,7 +11121,7 @@
             <w:pPr>
               <w:spacing w:after="20" w:before="0"/>
             </w:pPr>
-            <w:hyperlink w:history="1" r:id="rIdujvrtdn6fkrieevkaatls">
+            <w:hyperlink w:history="1" r:id="rIdsgps9ug3cc7zhzhdfiumq">
               <w:r>
                 <w:rPr>
                   <w:rFonts w:ascii="Arial" w:cs="Arial" w:eastAsia="Arial" w:hAnsi="Arial"/>
@@ -10865,7 +11154,7 @@
               <w:spacing w:after="10" w:before="0"/>
               <w:ind w:left="120"/>
             </w:pPr>
-            <w:hyperlink w:history="1" r:id="rIdp1jcbh145av3xpksqv1hz">
+            <w:hyperlink w:history="1" r:id="rIddueovqt9bls7otvagusqu">
               <w:r>
                 <w:rPr>
                   <w:rFonts w:ascii="Arial" w:cs="Arial" w:eastAsia="Arial" w:hAnsi="Arial"/>
@@ -11060,7 +11349,7 @@
             <w:pPr>
               <w:spacing w:after="20" w:before="0"/>
             </w:pPr>
-            <w:hyperlink w:history="1" r:id="rIdtmfks93dxidihmh7uup5h">
+            <w:hyperlink w:history="1" r:id="rIdgwyxpo7ygtsyvb6txzxtk">
               <w:r>
                 <w:rPr>
                   <w:rFonts w:ascii="Arial" w:cs="Arial" w:eastAsia="Arial" w:hAnsi="Arial"/>
@@ -11093,7 +11382,7 @@
               <w:spacing w:after="10" w:before="0"/>
               <w:ind w:left="120"/>
             </w:pPr>
-            <w:hyperlink w:history="1" r:id="rIdd2aasqlq81640tsesarua">
+            <w:hyperlink w:history="1" r:id="rIddjlhbjev1uett0lddzghz">
               <w:r>
                 <w:rPr>
                   <w:rFonts w:ascii="Arial" w:cs="Arial" w:eastAsia="Arial" w:hAnsi="Arial"/>
@@ -11138,7 +11427,7 @@
             <w:pPr>
               <w:spacing w:after="20" w:before="0"/>
             </w:pPr>
-            <w:hyperlink w:history="1" r:id="rIdiundxtcbkz0z70c4jwby3">
+            <w:hyperlink w:history="1" r:id="rIdwz0i1fy9rhry4sb7a8oli">
               <w:r>
                 <w:rPr>
                   <w:rFonts w:ascii="Arial" w:cs="Arial" w:eastAsia="Arial" w:hAnsi="Arial"/>
@@ -11171,7 +11460,7 @@
               <w:spacing w:after="10" w:before="0"/>
               <w:ind w:left="120"/>
             </w:pPr>
-            <w:hyperlink w:history="1" r:id="rIdgdc-zv5v_sfyzqonf5gnf">
+            <w:hyperlink w:history="1" r:id="rIdqgmyx8ieubj0eywfm5r4v">
               <w:r>
                 <w:rPr>
                   <w:rFonts w:ascii="Arial" w:cs="Arial" w:eastAsia="Arial" w:hAnsi="Arial"/>
@@ -11366,7 +11655,7 @@
             <w:pPr>
               <w:spacing w:after="20" w:before="0"/>
             </w:pPr>
-            <w:hyperlink w:history="1" r:id="rIdi5seupfsqwhv9ntp03pau">
+            <w:hyperlink w:history="1" r:id="rIduk71oumiolxxnqo3dybag">
               <w:r>
                 <w:rPr>
                   <w:rFonts w:ascii="Arial" w:cs="Arial" w:eastAsia="Arial" w:hAnsi="Arial"/>
@@ -11399,7 +11688,7 @@
               <w:spacing w:after="10" w:before="0"/>
               <w:ind w:left="120"/>
             </w:pPr>
-            <w:hyperlink w:history="1" r:id="rIdt1ch67frlcxmhl9oeybbe">
+            <w:hyperlink w:history="1" r:id="rIdawd6p1wlqewmmg58zrgoz">
               <w:r>
                 <w:rPr>
                   <w:rFonts w:ascii="Arial" w:cs="Arial" w:eastAsia="Arial" w:hAnsi="Arial"/>
@@ -11444,7 +11733,7 @@
             <w:pPr>
               <w:spacing w:after="20" w:before="0"/>
             </w:pPr>
-            <w:hyperlink w:history="1" r:id="rIdh6yksdmhcnlhnk4uxsbn3">
+            <w:hyperlink w:history="1" r:id="rIdzzstwv9e144ddvnhyydoa">
               <w:r>
                 <w:rPr>
                   <w:rFonts w:ascii="Arial" w:cs="Arial" w:eastAsia="Arial" w:hAnsi="Arial"/>
@@ -11477,7 +11766,7 @@
               <w:spacing w:after="10" w:before="0"/>
               <w:ind w:left="120"/>
             </w:pPr>
-            <w:hyperlink w:history="1" r:id="rIdc4_-jml2er22urr48hju1">
+            <w:hyperlink w:history="1" r:id="rId03dvd7lmeheoqylqe5rxy">
               <w:r>
                 <w:rPr>
                   <w:rFonts w:ascii="Arial" w:cs="Arial" w:eastAsia="Arial" w:hAnsi="Arial"/>
@@ -11973,6 +12262,65 @@
         </w:tc>
       </w:tr>
     </w:tbl>
+    <w:p>
+      <w:pPr>
+        <w:pBdr>
+          <w:top w:val="single" w:color="BBBBBB" w:sz="4" w:space="4"/>
+        </w:pBdr>
+        <w:spacing w:after="0" w:before="160"/>
+      </w:pPr>
+      <w:r>
+        <w:rPr>
+          <w:rFonts w:ascii="Arial" w:cs="Arial" w:eastAsia="Arial" w:hAnsi="Arial"/>
+          <w:color w:val="666666"/>
+          <w:sz w:val="14"/>
+          <w:szCs w:val="14"/>
+        </w:rPr>
+        <w:t xml:space="preserve">© 2026 SeaVuria and ARES. Aligned with KICD objectives. Developed by SeaVuria; technical implementation by ARES (with AI assistance from Claude). Licensed under </w:t>
+      </w:r>
+      <w:hyperlink w:history="1" r:id="rId1wzsd3mbmlrqua9p0patv">
+        <w:r>
+          <w:rPr>
+            <w:rFonts w:ascii="Arial" w:cs="Arial" w:eastAsia="Arial" w:hAnsi="Arial"/>
+            <w:color w:val="1F6B75"/>
+            <w:sz w:val="14"/>
+            <w:szCs w:val="14"/>
+            <w:u w:val="single" w:color="1F6B75"/>
+          </w:rPr>
+          <w:t xml:space="preserve">CC BY-NC 4.0</w:t>
+        </w:r>
+      </w:hyperlink>
+      <w:r>
+        <w:rPr>
+          <w:rFonts w:ascii="Arial" w:cs="Arial" w:eastAsia="Arial" w:hAnsi="Arial"/>
+          <w:color w:val="666666"/>
+          <w:sz w:val="14"/>
+          <w:szCs w:val="14"/>
+        </w:rPr>
+        <w:t xml:space="preserve"> (</w:t>
+      </w:r>
+      <w:hyperlink w:history="1" r:id="rIdou8s3zbhm3eoj80nxpayd">
+        <w:r>
+          <w:rPr>
+            <w:rFonts w:ascii="Arial" w:cs="Arial" w:eastAsia="Arial" w:hAnsi="Arial"/>
+            <w:color w:val="1F6B75"/>
+            <w:sz w:val="14"/>
+            <w:szCs w:val="14"/>
+            <w:u w:val="single" w:color="1F6B75"/>
+          </w:rPr>
+          <w:t xml:space="preserve">https://creativecommons.org/licenses/by-nc/4.0/</w:t>
+        </w:r>
+      </w:hyperlink>
+      <w:r>
+        <w:rPr>
+          <w:rFonts w:ascii="Arial" w:cs="Arial" w:eastAsia="Arial" w:hAnsi="Arial"/>
+          <w:color w:val="666666"/>
+          <w:sz w:val="14"/>
+          <w:szCs w:val="14"/>
+        </w:rPr>
+        <w:t xml:space="preserve">).</w:t>
+      </w:r>
+    </w:p>
     <w:p>
       <w:r>
         <w:br w:type="page"/>
@@ -12964,7 +13312,7 @@
             <w:pPr>
               <w:spacing w:after="20" w:before="0"/>
             </w:pPr>
-            <w:hyperlink w:history="1" r:id="rIdimscelymosme1ps7zwh7g">
+            <w:hyperlink w:history="1" r:id="rId6wvpffubu5yix5jmrjhrb">
               <w:r>
                 <w:rPr>
                   <w:rFonts w:ascii="Arial" w:cs="Arial" w:eastAsia="Arial" w:hAnsi="Arial"/>
@@ -12997,7 +13345,7 @@
               <w:spacing w:after="10" w:before="0"/>
               <w:ind w:left="120"/>
             </w:pPr>
-            <w:hyperlink w:history="1" r:id="rIdjpotrd1i_tjhozkocreth">
+            <w:hyperlink w:history="1" r:id="rId_fvhp9srm_i9ks81zr258">
               <w:r>
                 <w:rPr>
                   <w:rFonts w:ascii="Arial" w:cs="Arial" w:eastAsia="Arial" w:hAnsi="Arial"/>
@@ -13042,7 +13390,7 @@
             <w:pPr>
               <w:spacing w:after="20" w:before="0"/>
             </w:pPr>
-            <w:hyperlink w:history="1" r:id="rIdbvvrbuvwkimz-titpiw53">
+            <w:hyperlink w:history="1" r:id="rId4lbx9jjwr2zsdl3op2u0x">
               <w:r>
                 <w:rPr>
                   <w:rFonts w:ascii="Arial" w:cs="Arial" w:eastAsia="Arial" w:hAnsi="Arial"/>
@@ -13075,7 +13423,7 @@
               <w:spacing w:after="10" w:before="0"/>
               <w:ind w:left="120"/>
             </w:pPr>
-            <w:hyperlink w:history="1" r:id="rIdyujazhqwx9gwet2f0uezt">
+            <w:hyperlink w:history="1" r:id="rIdw40zvd3vzppkpfeexoln_">
               <w:r>
                 <w:rPr>
                   <w:rFonts w:ascii="Arial" w:cs="Arial" w:eastAsia="Arial" w:hAnsi="Arial"/>
@@ -13270,7 +13618,7 @@
             <w:pPr>
               <w:spacing w:after="20" w:before="0"/>
             </w:pPr>
-            <w:hyperlink w:history="1" r:id="rIdhpx1t2tfdo25rn1yoijyj">
+            <w:hyperlink w:history="1" r:id="rIdxvmgbznkoxzxwlyna5_7h">
               <w:r>
                 <w:rPr>
                   <w:rFonts w:ascii="Arial" w:cs="Arial" w:eastAsia="Arial" w:hAnsi="Arial"/>
@@ -13303,7 +13651,7 @@
               <w:spacing w:after="10" w:before="0"/>
               <w:ind w:left="120"/>
             </w:pPr>
-            <w:hyperlink w:history="1" r:id="rIdt93h_3qn6f8m-cqx3iact">
+            <w:hyperlink w:history="1" r:id="rIdnydvtcnvzupl5c-5pso5e">
               <w:r>
                 <w:rPr>
                   <w:rFonts w:ascii="Arial" w:cs="Arial" w:eastAsia="Arial" w:hAnsi="Arial"/>
@@ -13348,7 +13696,7 @@
             <w:pPr>
               <w:spacing w:after="20" w:before="0"/>
             </w:pPr>
-            <w:hyperlink w:history="1" r:id="rIddrw6lkgfgc9sj4trxxfcc">
+            <w:hyperlink w:history="1" r:id="rIdla7l82gzj2xjwhjzztxsq">
               <w:r>
                 <w:rPr>
                   <w:rFonts w:ascii="Arial" w:cs="Arial" w:eastAsia="Arial" w:hAnsi="Arial"/>
@@ -13381,7 +13729,7 @@
               <w:spacing w:after="10" w:before="0"/>
               <w:ind w:left="120"/>
             </w:pPr>
-            <w:hyperlink w:history="1" r:id="rIdsmogctp3m_gsd3jsfbwtw">
+            <w:hyperlink w:history="1" r:id="rIdqw9ybs9crvqsny4xkcghe">
               <w:r>
                 <w:rPr>
                   <w:rFonts w:ascii="Arial" w:cs="Arial" w:eastAsia="Arial" w:hAnsi="Arial"/>
@@ -13576,7 +13924,7 @@
             <w:pPr>
               <w:spacing w:after="20" w:before="0"/>
             </w:pPr>
-            <w:hyperlink w:history="1" r:id="rId1lwuwepf1ocsvmijwg546">
+            <w:hyperlink w:history="1" r:id="rIdaabjv8nwnoq8jgdgwcuyv">
               <w:r>
                 <w:rPr>
                   <w:rFonts w:ascii="Arial" w:cs="Arial" w:eastAsia="Arial" w:hAnsi="Arial"/>
@@ -13609,7 +13957,7 @@
               <w:spacing w:after="10" w:before="0"/>
               <w:ind w:left="120"/>
             </w:pPr>
-            <w:hyperlink w:history="1" r:id="rIdoxzpyaovgwt3ej2uabn66">
+            <w:hyperlink w:history="1" r:id="rIdhcvq8dgqkcmhaplksngw9">
               <w:r>
                 <w:rPr>
                   <w:rFonts w:ascii="Arial" w:cs="Arial" w:eastAsia="Arial" w:hAnsi="Arial"/>
@@ -13654,7 +14002,7 @@
             <w:pPr>
               <w:spacing w:after="20" w:before="0"/>
             </w:pPr>
-            <w:hyperlink w:history="1" r:id="rId6nsppvza1wubcvgxtpgxb">
+            <w:hyperlink w:history="1" r:id="rId3qcwxnk7vxsil7rdxy6et">
               <w:r>
                 <w:rPr>
                   <w:rFonts w:ascii="Arial" w:cs="Arial" w:eastAsia="Arial" w:hAnsi="Arial"/>
@@ -13687,7 +14035,7 @@
               <w:spacing w:after="10" w:before="0"/>
               <w:ind w:left="120"/>
             </w:pPr>
-            <w:hyperlink w:history="1" r:id="rIdqk3vanoy7jjq5uqrsuavx">
+            <w:hyperlink w:history="1" r:id="rId97yihlmjkmocdymbbrr8d">
               <w:r>
                 <w:rPr>
                   <w:rFonts w:ascii="Arial" w:cs="Arial" w:eastAsia="Arial" w:hAnsi="Arial"/>
@@ -13882,7 +14230,7 @@
             <w:pPr>
               <w:spacing w:after="20" w:before="0"/>
             </w:pPr>
-            <w:hyperlink w:history="1" r:id="rIdqmnqv4q1ldqxvtzfnzxun">
+            <w:hyperlink w:history="1" r:id="rIdgxp7lc_pzlr-tgiys4t_y">
               <w:r>
                 <w:rPr>
                   <w:rFonts w:ascii="Arial" w:cs="Arial" w:eastAsia="Arial" w:hAnsi="Arial"/>
@@ -13915,7 +14263,7 @@
               <w:spacing w:after="10" w:before="0"/>
               <w:ind w:left="120"/>
             </w:pPr>
-            <w:hyperlink w:history="1" r:id="rId7odynszlmzpzfcy3mkm5b">
+            <w:hyperlink w:history="1" r:id="rIdh3c7udss2tns7e0gptehj">
               <w:r>
                 <w:rPr>
                   <w:rFonts w:ascii="Arial" w:cs="Arial" w:eastAsia="Arial" w:hAnsi="Arial"/>
@@ -13960,7 +14308,7 @@
             <w:pPr>
               <w:spacing w:after="20" w:before="0"/>
             </w:pPr>
-            <w:hyperlink w:history="1" r:id="rIdktjr39of4cwhlalc-hnnb">
+            <w:hyperlink w:history="1" r:id="rIdm0rrgnb-o-dzhkwpzhgby">
               <w:r>
                 <w:rPr>
                   <w:rFonts w:ascii="Arial" w:cs="Arial" w:eastAsia="Arial" w:hAnsi="Arial"/>
@@ -13993,7 +14341,7 @@
               <w:spacing w:after="10" w:before="0"/>
               <w:ind w:left="120"/>
             </w:pPr>
-            <w:hyperlink w:history="1" r:id="rId_f9qsq8ulwzvx1wpxrj1k">
+            <w:hyperlink w:history="1" r:id="rIdyrohjzaf5vbsckfw7mmld">
               <w:r>
                 <w:rPr>
                   <w:rFonts w:ascii="Arial" w:cs="Arial" w:eastAsia="Arial" w:hAnsi="Arial"/>
@@ -14188,7 +14536,7 @@
             <w:pPr>
               <w:spacing w:after="20" w:before="0"/>
             </w:pPr>
-            <w:hyperlink w:history="1" r:id="rIdinc-nm522nzlwts9or6bs">
+            <w:hyperlink w:history="1" r:id="rIdsyvajmovesdltojfwqa9v">
               <w:r>
                 <w:rPr>
                   <w:rFonts w:ascii="Arial" w:cs="Arial" w:eastAsia="Arial" w:hAnsi="Arial"/>
@@ -14221,7 +14569,7 @@
               <w:spacing w:after="10" w:before="0"/>
               <w:ind w:left="120"/>
             </w:pPr>
-            <w:hyperlink w:history="1" r:id="rIdyp-k-bto04jcepmz8b7km">
+            <w:hyperlink w:history="1" r:id="rIdmwj-kl1jtgd0j2cwpeo-k">
               <w:r>
                 <w:rPr>
                   <w:rFonts w:ascii="Arial" w:cs="Arial" w:eastAsia="Arial" w:hAnsi="Arial"/>
@@ -14266,7 +14614,7 @@
             <w:pPr>
               <w:spacing w:after="20" w:before="0"/>
             </w:pPr>
-            <w:hyperlink w:history="1" r:id="rIdnd0ddewievvefpzef0izl">
+            <w:hyperlink w:history="1" r:id="rIdtpdnfp7lvdaozmkgk8y6x">
               <w:r>
                 <w:rPr>
                   <w:rFonts w:ascii="Arial" w:cs="Arial" w:eastAsia="Arial" w:hAnsi="Arial"/>
@@ -14299,7 +14647,7 @@
               <w:spacing w:after="10" w:before="0"/>
               <w:ind w:left="120"/>
             </w:pPr>
-            <w:hyperlink w:history="1" r:id="rId6gigfe3zw2ecwqf6ay9-s">
+            <w:hyperlink w:history="1" r:id="rId2wgunubppcjjvamkbpvrq">
               <w:r>
                 <w:rPr>
                   <w:rFonts w:ascii="Arial" w:cs="Arial" w:eastAsia="Arial" w:hAnsi="Arial"/>
@@ -14890,6 +15238,65 @@
         </w:tc>
       </w:tr>
     </w:tbl>
+    <w:p>
+      <w:pPr>
+        <w:pBdr>
+          <w:top w:val="single" w:color="BBBBBB" w:sz="4" w:space="4"/>
+        </w:pBdr>
+        <w:spacing w:after="0" w:before="160"/>
+      </w:pPr>
+      <w:r>
+        <w:rPr>
+          <w:rFonts w:ascii="Arial" w:cs="Arial" w:eastAsia="Arial" w:hAnsi="Arial"/>
+          <w:color w:val="666666"/>
+          <w:sz w:val="14"/>
+          <w:szCs w:val="14"/>
+        </w:rPr>
+        <w:t xml:space="preserve">© 2026 SeaVuria and ARES. Aligned with KICD objectives. Developed by SeaVuria; technical implementation by ARES (with AI assistance from Claude). Licensed under </w:t>
+      </w:r>
+      <w:hyperlink w:history="1" r:id="rIdsylpn84xdslxbhbmytgcr">
+        <w:r>
+          <w:rPr>
+            <w:rFonts w:ascii="Arial" w:cs="Arial" w:eastAsia="Arial" w:hAnsi="Arial"/>
+            <w:color w:val="1F6B75"/>
+            <w:sz w:val="14"/>
+            <w:szCs w:val="14"/>
+            <w:u w:val="single" w:color="1F6B75"/>
+          </w:rPr>
+          <w:t xml:space="preserve">CC BY-NC 4.0</w:t>
+        </w:r>
+      </w:hyperlink>
+      <w:r>
+        <w:rPr>
+          <w:rFonts w:ascii="Arial" w:cs="Arial" w:eastAsia="Arial" w:hAnsi="Arial"/>
+          <w:color w:val="666666"/>
+          <w:sz w:val="14"/>
+          <w:szCs w:val="14"/>
+        </w:rPr>
+        <w:t xml:space="preserve"> (</w:t>
+      </w:r>
+      <w:hyperlink w:history="1" r:id="rIdkya5yfnqufv2zcquboaaf">
+        <w:r>
+          <w:rPr>
+            <w:rFonts w:ascii="Arial" w:cs="Arial" w:eastAsia="Arial" w:hAnsi="Arial"/>
+            <w:color w:val="1F6B75"/>
+            <w:sz w:val="14"/>
+            <w:szCs w:val="14"/>
+            <w:u w:val="single" w:color="1F6B75"/>
+          </w:rPr>
+          <w:t xml:space="preserve">https://creativecommons.org/licenses/by-nc/4.0/</w:t>
+        </w:r>
+      </w:hyperlink>
+      <w:r>
+        <w:rPr>
+          <w:rFonts w:ascii="Arial" w:cs="Arial" w:eastAsia="Arial" w:hAnsi="Arial"/>
+          <w:color w:val="666666"/>
+          <w:sz w:val="14"/>
+          <w:szCs w:val="14"/>
+        </w:rPr>
+        <w:t xml:space="preserve">).</w:t>
+      </w:r>
+    </w:p>
     <w:p>
       <w:r>
         <w:br w:type="page"/>
@@ -15881,7 +16288,7 @@
             <w:pPr>
               <w:spacing w:after="20" w:before="0"/>
             </w:pPr>
-            <w:hyperlink w:history="1" r:id="rIdkr5kgkw3itr0t482rmm8b">
+            <w:hyperlink w:history="1" r:id="rIdau_bdpi66aeezy5v31nsn">
               <w:r>
                 <w:rPr>
                   <w:rFonts w:ascii="Arial" w:cs="Arial" w:eastAsia="Arial" w:hAnsi="Arial"/>
@@ -15914,7 +16321,7 @@
               <w:spacing w:after="10" w:before="0"/>
               <w:ind w:left="120"/>
             </w:pPr>
-            <w:hyperlink w:history="1" r:id="rIdhjmfjmt7jqkfcn7gf5svz">
+            <w:hyperlink w:history="1" r:id="rIdw-yhhmkayqt9k1qgrifzv">
               <w:r>
                 <w:rPr>
                   <w:rFonts w:ascii="Arial" w:cs="Arial" w:eastAsia="Arial" w:hAnsi="Arial"/>
@@ -15959,7 +16366,7 @@
             <w:pPr>
               <w:spacing w:after="20" w:before="0"/>
             </w:pPr>
-            <w:hyperlink w:history="1" r:id="rIdsijvv65a3mo4igi6fcedx">
+            <w:hyperlink w:history="1" r:id="rIdulzh-wc8uphmfp4c1qyix">
               <w:r>
                 <w:rPr>
                   <w:rFonts w:ascii="Arial" w:cs="Arial" w:eastAsia="Arial" w:hAnsi="Arial"/>
@@ -15992,7 +16399,7 @@
               <w:spacing w:after="10" w:before="0"/>
               <w:ind w:left="120"/>
             </w:pPr>
-            <w:hyperlink w:history="1" r:id="rId7kva_ep5qrtkftenctwyp">
+            <w:hyperlink w:history="1" r:id="rIdnxqioikpicupf-6xh_lbb">
               <w:r>
                 <w:rPr>
                   <w:rFonts w:ascii="Arial" w:cs="Arial" w:eastAsia="Arial" w:hAnsi="Arial"/>
@@ -16187,7 +16594,7 @@
             <w:pPr>
               <w:spacing w:after="20" w:before="0"/>
             </w:pPr>
-            <w:hyperlink w:history="1" r:id="rIdxillbsiyjaxbqdrdgv697">
+            <w:hyperlink w:history="1" r:id="rIdwtkxzdpmjeeb62f209ynt">
               <w:r>
                 <w:rPr>
                   <w:rFonts w:ascii="Arial" w:cs="Arial" w:eastAsia="Arial" w:hAnsi="Arial"/>
@@ -16220,7 +16627,7 @@
               <w:spacing w:after="10" w:before="0"/>
               <w:ind w:left="120"/>
             </w:pPr>
-            <w:hyperlink w:history="1" r:id="rIdw74a7bhjnexfotyebhzwi">
+            <w:hyperlink w:history="1" r:id="rIdd3yv2n1uokdmqpcqeadnh">
               <w:r>
                 <w:rPr>
                   <w:rFonts w:ascii="Arial" w:cs="Arial" w:eastAsia="Arial" w:hAnsi="Arial"/>
@@ -16265,7 +16672,7 @@
             <w:pPr>
               <w:spacing w:after="20" w:before="0"/>
             </w:pPr>
-            <w:hyperlink w:history="1" r:id="rId8sswfnk3sqvuy7oqxkac3">
+            <w:hyperlink w:history="1" r:id="rIdahen-jnsakaot3v8hrklq">
               <w:r>
                 <w:rPr>
                   <w:rFonts w:ascii="Arial" w:cs="Arial" w:eastAsia="Arial" w:hAnsi="Arial"/>
@@ -16298,7 +16705,7 @@
               <w:spacing w:after="10" w:before="0"/>
               <w:ind w:left="120"/>
             </w:pPr>
-            <w:hyperlink w:history="1" r:id="rId49bl8etanalm8ff-gkqei">
+            <w:hyperlink w:history="1" r:id="rIdmmjwn1_akwrueo6evfsxk">
               <w:r>
                 <w:rPr>
                   <w:rFonts w:ascii="Arial" w:cs="Arial" w:eastAsia="Arial" w:hAnsi="Arial"/>
@@ -16493,7 +16900,7 @@
             <w:pPr>
               <w:spacing w:after="20" w:before="0"/>
             </w:pPr>
-            <w:hyperlink w:history="1" r:id="rId3uterqahxmql7-l9scgen">
+            <w:hyperlink w:history="1" r:id="rIdvgbyg5kz4ttzfqyuoxerd">
               <w:r>
                 <w:rPr>
                   <w:rFonts w:ascii="Arial" w:cs="Arial" w:eastAsia="Arial" w:hAnsi="Arial"/>
@@ -16526,7 +16933,7 @@
               <w:spacing w:after="10" w:before="0"/>
               <w:ind w:left="120"/>
             </w:pPr>
-            <w:hyperlink w:history="1" r:id="rIdi9ahhdxnu6jbmhxcnp-hg">
+            <w:hyperlink w:history="1" r:id="rIdoeuee9gjfv1gjgdrq5hok">
               <w:r>
                 <w:rPr>
                   <w:rFonts w:ascii="Arial" w:cs="Arial" w:eastAsia="Arial" w:hAnsi="Arial"/>
@@ -16571,7 +16978,7 @@
             <w:pPr>
               <w:spacing w:after="20" w:before="0"/>
             </w:pPr>
-            <w:hyperlink w:history="1" r:id="rIduejrkqlc_q2doitxzwcsx">
+            <w:hyperlink w:history="1" r:id="rId6tcy1hyj3kmt2hcn1uwtw">
               <w:r>
                 <w:rPr>
                   <w:rFonts w:ascii="Arial" w:cs="Arial" w:eastAsia="Arial" w:hAnsi="Arial"/>
@@ -16604,7 +17011,7 @@
               <w:spacing w:after="10" w:before="0"/>
               <w:ind w:left="120"/>
             </w:pPr>
-            <w:hyperlink w:history="1" r:id="rIdhaar3dm01hm16xkypyy4l">
+            <w:hyperlink w:history="1" r:id="rIdtiet89th1khjrvayawiym">
               <w:r>
                 <w:rPr>
                   <w:rFonts w:ascii="Arial" w:cs="Arial" w:eastAsia="Arial" w:hAnsi="Arial"/>
@@ -16799,7 +17206,7 @@
             <w:pPr>
               <w:spacing w:after="20" w:before="0"/>
             </w:pPr>
-            <w:hyperlink w:history="1" r:id="rIdqen8yrvnpb-nbowazgg5b">
+            <w:hyperlink w:history="1" r:id="rIdy-3_5ia8-dn_mbhf7feov">
               <w:r>
                 <w:rPr>
                   <w:rFonts w:ascii="Arial" w:cs="Arial" w:eastAsia="Arial" w:hAnsi="Arial"/>
@@ -16832,7 +17239,7 @@
               <w:spacing w:after="10" w:before="0"/>
               <w:ind w:left="120"/>
             </w:pPr>
-            <w:hyperlink w:history="1" r:id="rIdgovychgkgq8oe7cw-mauu">
+            <w:hyperlink w:history="1" r:id="rId-ojl4voxtretjtmvbxahn">
               <w:r>
                 <w:rPr>
                   <w:rFonts w:ascii="Arial" w:cs="Arial" w:eastAsia="Arial" w:hAnsi="Arial"/>
@@ -16877,7 +17284,7 @@
             <w:pPr>
               <w:spacing w:after="20" w:before="0"/>
             </w:pPr>
-            <w:hyperlink w:history="1" r:id="rIdqlzanaadur9nxue8dwlqs">
+            <w:hyperlink w:history="1" r:id="rId9cz5hgb9udnxj2kyyfvr_">
               <w:r>
                 <w:rPr>
                   <w:rFonts w:ascii="Arial" w:cs="Arial" w:eastAsia="Arial" w:hAnsi="Arial"/>
@@ -16910,7 +17317,7 @@
               <w:spacing w:after="10" w:before="0"/>
               <w:ind w:left="120"/>
             </w:pPr>
-            <w:hyperlink w:history="1" r:id="rIdksjnplvo1d65fnnmhdwnw">
+            <w:hyperlink w:history="1" r:id="rIdap_zjeedpafg_4ba7jqzc">
               <w:r>
                 <w:rPr>
                   <w:rFonts w:ascii="Arial" w:cs="Arial" w:eastAsia="Arial" w:hAnsi="Arial"/>
@@ -17105,7 +17512,7 @@
             <w:pPr>
               <w:spacing w:after="20" w:before="0"/>
             </w:pPr>
-            <w:hyperlink w:history="1" r:id="rIdtvhakbysymsjndxw3ab--">
+            <w:hyperlink w:history="1" r:id="rIda5eaudu8recgzstz8cpc5">
               <w:r>
                 <w:rPr>
                   <w:rFonts w:ascii="Arial" w:cs="Arial" w:eastAsia="Arial" w:hAnsi="Arial"/>
@@ -17138,7 +17545,7 @@
               <w:spacing w:after="10" w:before="0"/>
               <w:ind w:left="120"/>
             </w:pPr>
-            <w:hyperlink w:history="1" r:id="rId1g73ay-ic5ahxtyp2i_s3">
+            <w:hyperlink w:history="1" r:id="rIdy8x697ckv5ml_dh8ppb71">
               <w:r>
                 <w:rPr>
                   <w:rFonts w:ascii="Arial" w:cs="Arial" w:eastAsia="Arial" w:hAnsi="Arial"/>
@@ -17183,7 +17590,7 @@
             <w:pPr>
               <w:spacing w:after="20" w:before="0"/>
             </w:pPr>
-            <w:hyperlink w:history="1" r:id="rIdsdlc_hxd6opd-smkuuagc">
+            <w:hyperlink w:history="1" r:id="rIddqwimhbic6dhggdj9nvsj">
               <w:r>
                 <w:rPr>
                   <w:rFonts w:ascii="Arial" w:cs="Arial" w:eastAsia="Arial" w:hAnsi="Arial"/>
@@ -17216,7 +17623,7 @@
               <w:spacing w:after="10" w:before="0"/>
               <w:ind w:left="120"/>
             </w:pPr>
-            <w:hyperlink w:history="1" r:id="rIdqr0ipbefuo7_hoszd2anf">
+            <w:hyperlink w:history="1" r:id="rIdtdpn4cd9v_kvapuvrzd8b">
               <w:r>
                 <w:rPr>
                   <w:rFonts w:ascii="Arial" w:cs="Arial" w:eastAsia="Arial" w:hAnsi="Arial"/>
@@ -17712,6 +18119,65 @@
         </w:tc>
       </w:tr>
     </w:tbl>
+    <w:p>
+      <w:pPr>
+        <w:pBdr>
+          <w:top w:val="single" w:color="BBBBBB" w:sz="4" w:space="4"/>
+        </w:pBdr>
+        <w:spacing w:after="0" w:before="160"/>
+      </w:pPr>
+      <w:r>
+        <w:rPr>
+          <w:rFonts w:ascii="Arial" w:cs="Arial" w:eastAsia="Arial" w:hAnsi="Arial"/>
+          <w:color w:val="666666"/>
+          <w:sz w:val="14"/>
+          <w:szCs w:val="14"/>
+        </w:rPr>
+        <w:t xml:space="preserve">© 2026 SeaVuria and ARES. Aligned with KICD objectives. Developed by SeaVuria; technical implementation by ARES (with AI assistance from Claude). Licensed under </w:t>
+      </w:r>
+      <w:hyperlink w:history="1" r:id="rIdfgejvnfzp1l2g4-47whwc">
+        <w:r>
+          <w:rPr>
+            <w:rFonts w:ascii="Arial" w:cs="Arial" w:eastAsia="Arial" w:hAnsi="Arial"/>
+            <w:color w:val="1F6B75"/>
+            <w:sz w:val="14"/>
+            <w:szCs w:val="14"/>
+            <w:u w:val="single" w:color="1F6B75"/>
+          </w:rPr>
+          <w:t xml:space="preserve">CC BY-NC 4.0</w:t>
+        </w:r>
+      </w:hyperlink>
+      <w:r>
+        <w:rPr>
+          <w:rFonts w:ascii="Arial" w:cs="Arial" w:eastAsia="Arial" w:hAnsi="Arial"/>
+          <w:color w:val="666666"/>
+          <w:sz w:val="14"/>
+          <w:szCs w:val="14"/>
+        </w:rPr>
+        <w:t xml:space="preserve"> (</w:t>
+      </w:r>
+      <w:hyperlink w:history="1" r:id="rId9fucrwvx1khtl1dexpjxj">
+        <w:r>
+          <w:rPr>
+            <w:rFonts w:ascii="Arial" w:cs="Arial" w:eastAsia="Arial" w:hAnsi="Arial"/>
+            <w:color w:val="1F6B75"/>
+            <w:sz w:val="14"/>
+            <w:szCs w:val="14"/>
+            <w:u w:val="single" w:color="1F6B75"/>
+          </w:rPr>
+          <w:t xml:space="preserve">https://creativecommons.org/licenses/by-nc/4.0/</w:t>
+        </w:r>
+      </w:hyperlink>
+      <w:r>
+        <w:rPr>
+          <w:rFonts w:ascii="Arial" w:cs="Arial" w:eastAsia="Arial" w:hAnsi="Arial"/>
+          <w:color w:val="666666"/>
+          <w:sz w:val="14"/>
+          <w:szCs w:val="14"/>
+        </w:rPr>
+        <w:t xml:space="preserve">).</w:t>
+      </w:r>
+    </w:p>
     <w:p>
       <w:r>
         <w:br w:type="page"/>
@@ -18703,7 +19169,7 @@
             <w:pPr>
               <w:spacing w:after="20" w:before="0"/>
             </w:pPr>
-            <w:hyperlink w:history="1" r:id="rIduuwdzut20mnvtyd_1r05y">
+            <w:hyperlink w:history="1" r:id="rIdfbsvmqwbiijlpab9ukq-b">
               <w:r>
                 <w:rPr>
                   <w:rFonts w:ascii="Arial" w:cs="Arial" w:eastAsia="Arial" w:hAnsi="Arial"/>
@@ -18736,7 +19202,7 @@
               <w:spacing w:after="10" w:before="0"/>
               <w:ind w:left="120"/>
             </w:pPr>
-            <w:hyperlink w:history="1" r:id="rIdtgv-q6vc8ctwohfuybkxh">
+            <w:hyperlink w:history="1" r:id="rIdb-pz-weoiwcoflk9cumvs">
               <w:r>
                 <w:rPr>
                   <w:rFonts w:ascii="Arial" w:cs="Arial" w:eastAsia="Arial" w:hAnsi="Arial"/>
@@ -18781,7 +19247,7 @@
             <w:pPr>
               <w:spacing w:after="20" w:before="0"/>
             </w:pPr>
-            <w:hyperlink w:history="1" r:id="rIdiybn18jdj8p2o9e6ukwcl">
+            <w:hyperlink w:history="1" r:id="rIdqweim1goghwbw6pszce3n">
               <w:r>
                 <w:rPr>
                   <w:rFonts w:ascii="Arial" w:cs="Arial" w:eastAsia="Arial" w:hAnsi="Arial"/>
@@ -18814,7 +19280,7 @@
               <w:spacing w:after="10" w:before="0"/>
               <w:ind w:left="120"/>
             </w:pPr>
-            <w:hyperlink w:history="1" r:id="rIdd6-jiy2nmyc37tgockxf_">
+            <w:hyperlink w:history="1" r:id="rIdubolid88ml-pch6y5wwk7">
               <w:r>
                 <w:rPr>
                   <w:rFonts w:ascii="Arial" w:cs="Arial" w:eastAsia="Arial" w:hAnsi="Arial"/>
@@ -19009,7 +19475,7 @@
             <w:pPr>
               <w:spacing w:after="20" w:before="0"/>
             </w:pPr>
-            <w:hyperlink w:history="1" r:id="rIdwf1dccr09hvyu7h8rclyo">
+            <w:hyperlink w:history="1" r:id="rIdrxms6nwnvlcmvyx7js2oc">
               <w:r>
                 <w:rPr>
                   <w:rFonts w:ascii="Arial" w:cs="Arial" w:eastAsia="Arial" w:hAnsi="Arial"/>
@@ -19042,7 +19508,7 @@
               <w:spacing w:after="10" w:before="0"/>
               <w:ind w:left="120"/>
             </w:pPr>
-            <w:hyperlink w:history="1" r:id="rIdkmtfd4dvgmkoswmmzlt32">
+            <w:hyperlink w:history="1" r:id="rId9bglyha7hcb6l3znaanas">
               <w:r>
                 <w:rPr>
                   <w:rFonts w:ascii="Arial" w:cs="Arial" w:eastAsia="Arial" w:hAnsi="Arial"/>
@@ -19087,7 +19553,7 @@
             <w:pPr>
               <w:spacing w:after="20" w:before="0"/>
             </w:pPr>
-            <w:hyperlink w:history="1" r:id="rIdq2ginl-2s_lrihdhphrwh">
+            <w:hyperlink w:history="1" r:id="rId9xpetktf9yrkano7avkak">
               <w:r>
                 <w:rPr>
                   <w:rFonts w:ascii="Arial" w:cs="Arial" w:eastAsia="Arial" w:hAnsi="Arial"/>
@@ -19120,7 +19586,7 @@
               <w:spacing w:after="10" w:before="0"/>
               <w:ind w:left="120"/>
             </w:pPr>
-            <w:hyperlink w:history="1" r:id="rIdda3az8ttdlvjyx3wi5xw2">
+            <w:hyperlink w:history="1" r:id="rIdvhcaxe5g7mboc65lzdg47">
               <w:r>
                 <w:rPr>
                   <w:rFonts w:ascii="Arial" w:cs="Arial" w:eastAsia="Arial" w:hAnsi="Arial"/>
@@ -19315,7 +19781,7 @@
             <w:pPr>
               <w:spacing w:after="20" w:before="0"/>
             </w:pPr>
-            <w:hyperlink w:history="1" r:id="rIdzeg6dpeoukuh1vstkfamo">
+            <w:hyperlink w:history="1" r:id="rIdjpb8vrvj1xmnfpxxcrcfq">
               <w:r>
                 <w:rPr>
                   <w:rFonts w:ascii="Arial" w:cs="Arial" w:eastAsia="Arial" w:hAnsi="Arial"/>
@@ -19348,7 +19814,7 @@
               <w:spacing w:after="10" w:before="0"/>
               <w:ind w:left="120"/>
             </w:pPr>
-            <w:hyperlink w:history="1" r:id="rIdrzcjdif7o5dyflc9jcx78">
+            <w:hyperlink w:history="1" r:id="rIdlw4lcx8t31-e3vst0unuc">
               <w:r>
                 <w:rPr>
                   <w:rFonts w:ascii="Arial" w:cs="Arial" w:eastAsia="Arial" w:hAnsi="Arial"/>
@@ -19393,7 +19859,7 @@
             <w:pPr>
               <w:spacing w:after="20" w:before="0"/>
             </w:pPr>
-            <w:hyperlink w:history="1" r:id="rIdxuvhqko6jvjklkqazoug_">
+            <w:hyperlink w:history="1" r:id="rIdwrmxcpzask3ht_x3awezd">
               <w:r>
                 <w:rPr>
                   <w:rFonts w:ascii="Arial" w:cs="Arial" w:eastAsia="Arial" w:hAnsi="Arial"/>
@@ -19426,7 +19892,7 @@
               <w:spacing w:after="10" w:before="0"/>
               <w:ind w:left="120"/>
             </w:pPr>
-            <w:hyperlink w:history="1" r:id="rIdfodsji7cdofdsnxrxmzgz">
+            <w:hyperlink w:history="1" r:id="rId-m-bqcnvsvvjogdmkfiwt">
               <w:r>
                 <w:rPr>
                   <w:rFonts w:ascii="Arial" w:cs="Arial" w:eastAsia="Arial" w:hAnsi="Arial"/>
@@ -19621,7 +20087,7 @@
             <w:pPr>
               <w:spacing w:after="20" w:before="0"/>
             </w:pPr>
-            <w:hyperlink w:history="1" r:id="rIdbopvmwk_ymelg3fizmrsq">
+            <w:hyperlink w:history="1" r:id="rId9tv7ra9kw1e7wg4-8-ttq">
               <w:r>
                 <w:rPr>
                   <w:rFonts w:ascii="Arial" w:cs="Arial" w:eastAsia="Arial" w:hAnsi="Arial"/>
@@ -19654,7 +20120,7 @@
               <w:spacing w:after="10" w:before="0"/>
               <w:ind w:left="120"/>
             </w:pPr>
-            <w:hyperlink w:history="1" r:id="rIdypgzhefnsa19gl-d4nfwb">
+            <w:hyperlink w:history="1" r:id="rIdns9pt7hlkr8yxt8hp45co">
               <w:r>
                 <w:rPr>
                   <w:rFonts w:ascii="Arial" w:cs="Arial" w:eastAsia="Arial" w:hAnsi="Arial"/>
@@ -19699,7 +20165,7 @@
             <w:pPr>
               <w:spacing w:after="20" w:before="0"/>
             </w:pPr>
-            <w:hyperlink w:history="1" r:id="rIde1ap3gihcubjotgthzwud">
+            <w:hyperlink w:history="1" r:id="rIdgcrke3lmdbntotbp-w8ig">
               <w:r>
                 <w:rPr>
                   <w:rFonts w:ascii="Arial" w:cs="Arial" w:eastAsia="Arial" w:hAnsi="Arial"/>
@@ -19732,7 +20198,7 @@
               <w:spacing w:after="10" w:before="0"/>
               <w:ind w:left="120"/>
             </w:pPr>
-            <w:hyperlink w:history="1" r:id="rIdihwbukrkm4oj7kyz1zbyh">
+            <w:hyperlink w:history="1" r:id="rId6g13pc_7fwuwt_2fojwr2">
               <w:r>
                 <w:rPr>
                   <w:rFonts w:ascii="Arial" w:cs="Arial" w:eastAsia="Arial" w:hAnsi="Arial"/>
@@ -19927,7 +20393,7 @@
             <w:pPr>
               <w:spacing w:after="20" w:before="0"/>
             </w:pPr>
-            <w:hyperlink w:history="1" r:id="rId7l5duxi_yum7b_vt1mwqj">
+            <w:hyperlink w:history="1" r:id="rId0xcszi3doooiq7g16fqpf">
               <w:r>
                 <w:rPr>
                   <w:rFonts w:ascii="Arial" w:cs="Arial" w:eastAsia="Arial" w:hAnsi="Arial"/>
@@ -19960,7 +20426,7 @@
               <w:spacing w:after="10" w:before="0"/>
               <w:ind w:left="120"/>
             </w:pPr>
-            <w:hyperlink w:history="1" r:id="rId-fz5ava5qlfjbujfywbfp">
+            <w:hyperlink w:history="1" r:id="rId6ksfa1fab6eiembdcouqv">
               <w:r>
                 <w:rPr>
                   <w:rFonts w:ascii="Arial" w:cs="Arial" w:eastAsia="Arial" w:hAnsi="Arial"/>
@@ -20005,7 +20471,7 @@
             <w:pPr>
               <w:spacing w:after="20" w:before="0"/>
             </w:pPr>
-            <w:hyperlink w:history="1" r:id="rIdyq9ens30bikbzxkbys1nf">
+            <w:hyperlink w:history="1" r:id="rIds9haue0akdrtvraj7dmgd">
               <w:r>
                 <w:rPr>
                   <w:rFonts w:ascii="Arial" w:cs="Arial" w:eastAsia="Arial" w:hAnsi="Arial"/>
@@ -20038,7 +20504,7 @@
               <w:spacing w:after="10" w:before="0"/>
               <w:ind w:left="120"/>
             </w:pPr>
-            <w:hyperlink w:history="1" r:id="rIdbkqjveo79_d71ilqgjb0b">
+            <w:hyperlink w:history="1" r:id="rIdhrsfgcs_ff47b5uw_hdgm">
               <w:r>
                 <w:rPr>
                   <w:rFonts w:ascii="Arial" w:cs="Arial" w:eastAsia="Arial" w:hAnsi="Arial"/>
@@ -20534,6 +21000,65 @@
         </w:tc>
       </w:tr>
     </w:tbl>
+    <w:p>
+      <w:pPr>
+        <w:pBdr>
+          <w:top w:val="single" w:color="BBBBBB" w:sz="4" w:space="4"/>
+        </w:pBdr>
+        <w:spacing w:after="0" w:before="160"/>
+      </w:pPr>
+      <w:r>
+        <w:rPr>
+          <w:rFonts w:ascii="Arial" w:cs="Arial" w:eastAsia="Arial" w:hAnsi="Arial"/>
+          <w:color w:val="666666"/>
+          <w:sz w:val="14"/>
+          <w:szCs w:val="14"/>
+        </w:rPr>
+        <w:t xml:space="preserve">© 2026 SeaVuria and ARES. Aligned with KICD objectives. Developed by SeaVuria; technical implementation by ARES (with AI assistance from Claude). Licensed under </w:t>
+      </w:r>
+      <w:hyperlink w:history="1" r:id="rIdheceu0zhiv8ch39snvq6i">
+        <w:r>
+          <w:rPr>
+            <w:rFonts w:ascii="Arial" w:cs="Arial" w:eastAsia="Arial" w:hAnsi="Arial"/>
+            <w:color w:val="1F6B75"/>
+            <w:sz w:val="14"/>
+            <w:szCs w:val="14"/>
+            <w:u w:val="single" w:color="1F6B75"/>
+          </w:rPr>
+          <w:t xml:space="preserve">CC BY-NC 4.0</w:t>
+        </w:r>
+      </w:hyperlink>
+      <w:r>
+        <w:rPr>
+          <w:rFonts w:ascii="Arial" w:cs="Arial" w:eastAsia="Arial" w:hAnsi="Arial"/>
+          <w:color w:val="666666"/>
+          <w:sz w:val="14"/>
+          <w:szCs w:val="14"/>
+        </w:rPr>
+        <w:t xml:space="preserve"> (</w:t>
+      </w:r>
+      <w:hyperlink w:history="1" r:id="rIdvqcmmhydpzl71h6csowua">
+        <w:r>
+          <w:rPr>
+            <w:rFonts w:ascii="Arial" w:cs="Arial" w:eastAsia="Arial" w:hAnsi="Arial"/>
+            <w:color w:val="1F6B75"/>
+            <w:sz w:val="14"/>
+            <w:szCs w:val="14"/>
+            <w:u w:val="single" w:color="1F6B75"/>
+          </w:rPr>
+          <w:t xml:space="preserve">https://creativecommons.org/licenses/by-nc/4.0/</w:t>
+        </w:r>
+      </w:hyperlink>
+      <w:r>
+        <w:rPr>
+          <w:rFonts w:ascii="Arial" w:cs="Arial" w:eastAsia="Arial" w:hAnsi="Arial"/>
+          <w:color w:val="666666"/>
+          <w:sz w:val="14"/>
+          <w:szCs w:val="14"/>
+        </w:rPr>
+        <w:t xml:space="preserve">).</w:t>
+      </w:r>
+    </w:p>
     <w:p>
       <w:r>
         <w:br w:type="page"/>

</xml_diff>